<commit_message>
fix: attendance composites, leave/tour inbox indexes, and appointment portal expiry
Show punch+LWP as P/LWP (0.5) and approved SPLA/SPLB as P/SPLA|P/SPLB on the daily register; add leave/tour approval submitted_at indexes; keep appointment letter portal expiry tied to joining date and Employee Master–scoped admin access.
</commit_message>
<xml_diff>
--- a/public/templates/admin-recruitment/appointment-letter.docx
+++ b/public/templates/admin-recruitment/appointment-letter.docx
@@ -4,6 +4,132 @@
   <w:body>
     <w:p>
       <w:pPr>
+        <w:spacing w:after="0" w:line="240" w:lineRule="auto"/>
+        <w:jc w:val="both"/>
+        <w:rPr>
+          <w:rFonts w:ascii="Times New Roman" w:hAnsi="Times New Roman"/>
+          <w:sz w:val="24"/>
+          <w:szCs w:val="24"/>
+        </w:rPr>
+      </w:pPr>
+      <w:r>
+        <w:rPr>
+          <w:rFonts w:ascii="Times New Roman" w:hAnsi="Times New Roman"/>
+          <w:noProof/>
+          <w:sz w:val="24"/>
+          <w:szCs w:val="24"/>
+          <w:lang w:val="en-IN" w:eastAsia="en-IN"/>
+        </w:rPr>
+        <w:pict w14:anchorId="02AB6C40">
+          <v:shapetype id="_x0000_t202" coordsize="21600,21600" o:spt="202" path="m,l,21600r21600,l21600,xe">
+            <v:stroke joinstyle="miter"/>
+            <v:path gradientshapeok="t" o:connecttype="rect"/>
+          </v:shapetype>
+          <v:shape id="Text Box 2" o:spid="_x0000_s2050" type="#_x0000_t202" style="position:absolute;left:0;text-align:left;margin-left:382.5pt;margin-top:-10.05pt;width:166.4pt;height:117.4pt;z-index:251657728;visibility:visible;mso-wrap-style:none;mso-width-relative:margin;mso-height-relative:margin" filled="f" stroked="f">
+            <v:textbox style="mso-next-textbox:#Text Box 2;mso-fit-shape-to-text:t">
+              <w:txbxContent>
+                <w:p>
+                  <w:r>
+                    <w:rPr>
+                      <w:rFonts w:ascii="Times New Roman" w:hAnsi="Times New Roman"/>
+                      <w:color w:val="000000"/>
+                      <w:sz w:val="24"/>
+                      <w:szCs w:val="24"/>
+                    </w:rPr>
+                    <w:pict w14:anchorId="25036BCC">
+                      <v:shapetype id="_x0000_t75" coordsize="21600,21600" o:spt="75" o:preferrelative="t" path="m@4@5l@4@11@9@11@9@5xe" filled="f" stroked="f">
+                        <v:stroke joinstyle="miter"/>
+                        <v:formulas>
+                          <v:f eqn="if lineDrawn pixelLineWidth 0"/>
+                          <v:f eqn="sum @0 1 0"/>
+                          <v:f eqn="sum 0 0 @1"/>
+                          <v:f eqn="prod @2 1 2"/>
+                          <v:f eqn="prod @3 21600 pixelWidth"/>
+                          <v:f eqn="prod @3 21600 pixelHeight"/>
+                          <v:f eqn="sum @0 0 1"/>
+                          <v:f eqn="prod @6 1 2"/>
+                          <v:f eqn="prod @7 21600 pixelWidth"/>
+                          <v:f eqn="sum @8 21600 0"/>
+                          <v:f eqn="prod @7 21600 pixelHeight"/>
+                          <v:f eqn="sum @10 21600 0"/>
+                        </v:formulas>
+                        <v:path o:extrusionok="f" gradientshapeok="t" o:connecttype="rect"/>
+                        <o:lock v:ext="edit" aspectratio="t"/>
+                      </v:shapetype>
+                      <v:shape id="_x0000_i1026" type="#_x0000_t75" style="width:152.25pt;height:98.25pt">
+                        <v:imagedata r:id="rId7" o:title="121212"/>
+                      </v:shape>
+                    </w:pict>
+                  </w:r>
+                </w:p>
+              </w:txbxContent>
+            </v:textbox>
+          </v:shape>
+        </w:pict>
+      </w:r>
+    </w:p>
+    <w:p>
+      <w:pPr>
+        <w:spacing w:after="0" w:line="240" w:lineRule="auto"/>
+        <w:jc w:val="both"/>
+        <w:rPr>
+          <w:rFonts w:ascii="Times New Roman" w:hAnsi="Times New Roman"/>
+          <w:sz w:val="24"/>
+          <w:szCs w:val="24"/>
+        </w:rPr>
+      </w:pPr>
+    </w:p>
+    <w:p>
+      <w:pPr>
+        <w:spacing w:after="0" w:line="240" w:lineRule="auto"/>
+        <w:jc w:val="both"/>
+        <w:rPr>
+          <w:rFonts w:ascii="Times New Roman" w:hAnsi="Times New Roman"/>
+          <w:sz w:val="24"/>
+          <w:szCs w:val="24"/>
+        </w:rPr>
+      </w:pPr>
+    </w:p>
+    <w:p>
+      <w:pPr>
+        <w:pStyle w:val="ListParagraph"/>
+        <w:spacing w:after="0"/>
+        <w:ind w:left="0"/>
+        <w:jc w:val="both"/>
+        <w:rPr>
+          <w:rFonts w:ascii="Times New Roman" w:hAnsi="Times New Roman"/>
+          <w:color w:val="000000"/>
+          <w:sz w:val="24"/>
+          <w:szCs w:val="24"/>
+        </w:rPr>
+      </w:pPr>
+    </w:p>
+    <w:p>
+      <w:pPr>
+        <w:pStyle w:val="ListParagraph"/>
+        <w:spacing w:after="0"/>
+        <w:ind w:left="0"/>
+        <w:jc w:val="both"/>
+        <w:rPr>
+          <w:rFonts w:ascii="Times New Roman" w:hAnsi="Times New Roman"/>
+          <w:color w:val="000000"/>
+          <w:sz w:val="24"/>
+          <w:szCs w:val="24"/>
+        </w:rPr>
+      </w:pPr>
+    </w:p>
+    <w:p>
+      <w:pPr>
+        <w:spacing w:after="0" w:line="240" w:lineRule="auto"/>
+        <w:jc w:val="both"/>
+        <w:rPr>
+          <w:rFonts w:cs="Calibri"/>
+          <w:color w:val="000000"/>
+        </w:rPr>
+      </w:pPr>
+    </w:p>
+    <w:p>
+      <w:pPr>
         <w:pStyle w:val="NoSpacing"/>
         <w:jc w:val="both"/>
         <w:rPr>
@@ -136,28 +262,9 @@
         <w:rPr>
           <w:noProof/>
         </w:rPr>
-        <w:pict w14:anchorId="6D9A2AA9">
-          <v:shapetype id="_x0000_t75" coordsize="21600,21600" o:spt="75" o:preferrelative="t" path="m@4@5l@4@11@9@11@9@5xe" filled="f" stroked="f">
-            <v:stroke joinstyle="miter"/>
-            <v:formulas>
-              <v:f eqn="if lineDrawn pixelLineWidth 0"/>
-              <v:f eqn="sum @0 1 0"/>
-              <v:f eqn="sum 0 0 @1"/>
-              <v:f eqn="prod @2 1 2"/>
-              <v:f eqn="prod @3 21600 pixelWidth"/>
-              <v:f eqn="prod @3 21600 pixelHeight"/>
-              <v:f eqn="sum @0 0 1"/>
-              <v:f eqn="prod @6 1 2"/>
-              <v:f eqn="prod @7 21600 pixelWidth"/>
-              <v:f eqn="sum @8 21600 0"/>
-              <v:f eqn="prod @7 21600 pixelHeight"/>
-              <v:f eqn="sum @10 21600 0"/>
-            </v:formulas>
-            <v:path o:extrusionok="f" gradientshapeok="t" o:connecttype="rect"/>
-            <o:lock v:ext="edit" aspectratio="t"/>
-          </v:shapetype>
-          <v:shape id="Picture 2" o:spid="_x0000_s1026" type="#_x0000_t75" style="position:absolute;margin-left:374.1pt;margin-top:12.9pt;width:119.85pt;height:86.15pt;z-index:251657728;visibility:visible">
-            <v:imagedata r:id="rId5" o:title="" cropright="48124f"/>
+        <w:pict w14:anchorId="1554052C">
+          <v:shape id="Picture 2" o:spid="_x0000_s2053" type="#_x0000_t75" style="position:absolute;margin-left:374.1pt;margin-top:12.9pt;width:119.85pt;height:86.15pt;z-index:251659776;visibility:visible">
+            <v:imagedata r:id="rId8" o:title="" cropright="48124f"/>
             <w10:wrap type="square"/>
           </v:shape>
         </w:pict>
@@ -360,13 +467,7 @@
         <w:rPr>
           <w:rFonts w:ascii="Cambria" w:hAnsi="Cambria" w:cs="Arial"/>
         </w:rPr>
-        <w:t>{{CANDIDATE_FULL}}</w:t>
-      </w:r>
-      <w:r>
-        <w:rPr>
-          <w:rFonts w:ascii="Cambria" w:hAnsi="Cambria" w:cs="Arial"/>
-        </w:rPr>
-        <w:t>,</w:t>
+        <w:t>{{CANDIDATE_FULL}},</w:t>
       </w:r>
     </w:p>
     <w:p>
@@ -528,108 +629,118 @@
           <w:rFonts w:ascii="Cambria" w:hAnsi="Cambria" w:cs="Arial"/>
           <w:bCs/>
         </w:rPr>
-        <w:t xml:space="preserve">We are pleased to </w:t>
+        <w:t>We are pleased to appoint you</w:t>
+      </w:r>
+      <w:r>
+        <w:rPr>
+          <w:rFonts w:ascii="Cambria" w:hAnsi="Cambria" w:cs="Arial"/>
+          <w:b/>
+        </w:rPr>
+        <w:t xml:space="preserve"> </w:t>
       </w:r>
       <w:r>
         <w:rPr>
           <w:rFonts w:ascii="Cambria" w:hAnsi="Cambria" w:cs="Arial"/>
           <w:bCs/>
         </w:rPr>
-        <w:t>appoint you</w:t>
-      </w:r>
-      <w:r>
-        <w:rPr>
-          <w:rFonts w:ascii="Cambria" w:hAnsi="Cambria" w:cs="Arial"/>
-          <w:b/>
+        <w:t xml:space="preserve">as </w:t>
+      </w:r>
+      <w:r>
+        <w:rPr>
+          <w:rFonts w:ascii="Cambria" w:hAnsi="Cambria" w:cs="Arial"/>
+          <w:b/>
+          <w:bCs/>
+        </w:rPr>
+        <w:t>“{{DESIGNATION}}”</w:t>
+      </w:r>
+      <w:r>
+        <w:rPr>
+          <w:rFonts w:ascii="Cambria" w:hAnsi="Cambria" w:cs="Arial"/>
+          <w:bCs/>
+        </w:rPr>
+        <w:t xml:space="preserve"> with </w:t>
+      </w:r>
+      <w:r>
+        <w:rPr>
+          <w:rFonts w:ascii="Cambria" w:hAnsi="Cambria" w:cs="Arial"/>
+          <w:b/>
+          <w:bCs/>
+        </w:rPr>
+        <w:t>{{COMPANY_NAME}}</w:t>
+      </w:r>
+      <w:r>
+        <w:rPr>
+          <w:rFonts w:ascii="Cambria" w:hAnsi="Cambria" w:cs="Arial"/>
+          <w:b/>
+          <w:bCs/>
+        </w:rPr>
+        <w:t xml:space="preserve">, </w:t>
+      </w:r>
+      <w:r>
+        <w:rPr>
+          <w:rFonts w:ascii="Cambria" w:hAnsi="Cambria" w:cs="Arial"/>
+          <w:bCs/>
+        </w:rPr>
+        <w:t>with</w:t>
+      </w:r>
+      <w:r>
+        <w:rPr>
+          <w:rFonts w:ascii="Cambria" w:hAnsi="Cambria" w:cs="Arial"/>
+        </w:rPr>
+        <w:t xml:space="preserve"> effect </w:t>
+      </w:r>
+      <w:r>
+        <w:rPr>
+          <w:rFonts w:ascii="Cambria" w:hAnsi="Cambria" w:cs="Arial"/>
+          <w:b/>
+        </w:rPr>
+        <w:t>from</w:t>
+      </w:r>
+      <w:r>
+        <w:rPr>
+          <w:rFonts w:ascii="Cambria" w:hAnsi="Cambria" w:cs="Arial"/>
+          <w:b/>
+        </w:rPr>
+        <w:t xml:space="preserve"> {{JOINING_DATE_LONG}}</w:t>
+      </w:r>
+      <w:r>
+        <w:rPr>
+          <w:rFonts w:ascii="Cambria" w:hAnsi="Cambria" w:cs="Arial"/>
+          <w:b/>
+        </w:rPr>
+        <w:t xml:space="preserve">. </w:t>
+      </w:r>
+      <w:r>
+        <w:rPr>
+          <w:rFonts w:ascii="Cambria" w:hAnsi="Cambria" w:cs="Arial"/>
+        </w:rPr>
+        <w:t xml:space="preserve">You will be posted at </w:t>
+      </w:r>
+      <w:r>
+        <w:rPr>
+          <w:rFonts w:ascii="Cambria" w:hAnsi="Cambria" w:cs="Arial"/>
+        </w:rPr>
+        <w:t>{{LOCATION}}</w:t>
+      </w:r>
+      <w:r>
+        <w:rPr>
+          <w:rFonts w:ascii="Cambria" w:hAnsi="Cambria" w:cs="Arial"/>
+        </w:rPr>
+        <w:t>, and your reporting head will be the</w:t>
+      </w:r>
+      <w:r>
+        <w:rPr>
+          <w:rFonts w:ascii="Cambria" w:hAnsi="Cambria" w:cs="Arial"/>
         </w:rPr>
         <w:t xml:space="preserve"> </w:t>
       </w:r>
       <w:r>
         <w:rPr>
           <w:rFonts w:ascii="Cambria" w:hAnsi="Cambria" w:cs="Arial"/>
+          <w:b/>
           <w:bCs/>
         </w:rPr>
-        <w:t xml:space="preserve">as </w:t>
-      </w:r>
-      <w:r>
-        <w:rPr>
-          <w:rFonts w:ascii="Cambria" w:hAnsi="Cambria" w:cs="Arial"/>
-          <w:b/>
-          <w:bCs/>
-        </w:rPr>
-        <w:t>“{{DESIGNATION}}”</w:t>
-      </w:r>
-      <w:r>
-        <w:rPr>
-          <w:rFonts w:ascii="Cambria" w:hAnsi="Cambria" w:cs="Arial"/>
-          <w:bCs/>
-        </w:rPr>
-        <w:t xml:space="preserve"> </w:t>
-      </w:r>
-      <w:r>
-        <w:rPr>
-          <w:rFonts w:ascii="Cambria" w:hAnsi="Cambria" w:cs="Arial"/>
-          <w:bCs/>
-        </w:rPr>
-        <w:t xml:space="preserve">with </w:t>
-      </w:r>
-      <w:r>
-        <w:rPr>
-          <w:rFonts w:ascii="Cambria" w:hAnsi="Cambria" w:cs="Arial"/>
-          <w:b/>
-          <w:bCs/>
-        </w:rPr>
-        <w:t>{{COMPANY_NAME}}</w:t>
-      </w:r>
-      <w:r>
-        <w:rPr>
-          <w:rFonts w:ascii="Cambria" w:hAnsi="Cambria" w:cs="Arial"/>
-          <w:b/>
-          <w:bCs/>
-        </w:rPr>
-        <w:t>,</w:t>
-      </w:r>
-      <w:r>
-        <w:rPr>
-          <w:rFonts w:ascii="Cambria" w:hAnsi="Cambria" w:cs="Arial"/>
-          <w:b/>
-          <w:bCs/>
-        </w:rPr>
-        <w:t xml:space="preserve"> </w:t>
-      </w:r>
-      <w:r>
-        <w:rPr>
-          <w:rFonts w:ascii="Cambria" w:hAnsi="Cambria" w:cs="Arial"/>
-          <w:bCs/>
-        </w:rPr>
-        <w:t>with</w:t>
-      </w:r>
-      <w:r>
-        <w:rPr>
-          <w:rFonts w:ascii="Cambria" w:hAnsi="Cambria" w:cs="Arial"/>
-        </w:rPr>
-        <w:t xml:space="preserve"> effect </w:t>
-      </w:r>
-      <w:r>
-        <w:rPr>
-          <w:rFonts w:ascii="Cambria" w:hAnsi="Cambria" w:cs="Arial"/>
-          <w:b/>
-        </w:rPr>
-        <w:t>from</w:t>
-      </w:r>
-      <w:r>
-        <w:rPr>
-          <w:rFonts w:ascii="Cambria" w:hAnsi="Cambria" w:cs="Arial"/>
-          <w:b/>
-        </w:rPr>
-        <w:t xml:space="preserve"> </w:t>
-      </w:r>
-      <w:r>
-        <w:rPr>
-          <w:rFonts w:ascii="Cambria" w:hAnsi="Cambria" w:cs="Arial"/>
-          <w:b/>
-        </w:rPr>
-        <w:t>{{JOINING_DATE_LONG}}</w:t>
+        <w:t>{{REPORTING_TO}}</w:t>
       </w:r>
       <w:r>
         <w:rPr>
@@ -638,64 +749,6 @@
         </w:rPr>
         <w:t>.</w:t>
       </w:r>
-      <w:r>
-        <w:rPr>
-          <w:rFonts w:ascii="Cambria" w:hAnsi="Cambria" w:cs="Arial"/>
-          <w:b/>
-        </w:rPr>
-        <w:t xml:space="preserve"> </w:t>
-      </w:r>
-      <w:r>
-        <w:rPr>
-          <w:rFonts w:ascii="Cambria" w:hAnsi="Cambria" w:cs="Arial"/>
-        </w:rPr>
-        <w:t xml:space="preserve">You will be posted at </w:t>
-      </w:r>
-      <w:r>
-        <w:rPr>
-          <w:rFonts w:ascii="Cambria" w:hAnsi="Cambria" w:cs="Arial"/>
-        </w:rPr>
-        <w:t>{{LOCATION}}</w:t>
-      </w:r>
-      <w:r>
-        <w:rPr>
-          <w:rFonts w:ascii="Cambria" w:hAnsi="Cambria" w:cs="Arial"/>
-        </w:rPr>
-        <w:t xml:space="preserve">, and </w:t>
-      </w:r>
-      <w:r>
-        <w:rPr>
-          <w:rFonts w:ascii="Cambria" w:hAnsi="Cambria" w:cs="Arial"/>
-        </w:rPr>
-        <w:t xml:space="preserve">your reporting head will be </w:t>
-      </w:r>
-      <w:r>
-        <w:rPr>
-          <w:rFonts w:ascii="Cambria" w:hAnsi="Cambria" w:cs="Arial"/>
-        </w:rPr>
-        <w:t>the</w:t>
-      </w:r>
-      <w:r>
-        <w:rPr>
-          <w:rFonts w:ascii="Cambria" w:hAnsi="Cambria" w:cs="Arial"/>
-        </w:rPr>
-        <w:t xml:space="preserve"> </w:t>
-      </w:r>
-      <w:r>
-        <w:rPr>
-          <w:rFonts w:ascii="Cambria" w:hAnsi="Cambria" w:cs="Arial"/>
-          <w:b/>
-          <w:bCs/>
-        </w:rPr>
-        <w:t>{{REPORTING_TO}}</w:t>
-      </w:r>
-      <w:r>
-        <w:rPr>
-          <w:rFonts w:ascii="Cambria" w:hAnsi="Cambria" w:cs="Arial"/>
-          <w:b/>
-        </w:rPr>
-        <w:t>.</w:t>
-      </w:r>
     </w:p>
     <w:p>
       <w:pPr>
@@ -720,31 +773,7 @@
         <w:rPr>
           <w:rFonts w:ascii="Cambria" w:hAnsi="Cambria"/>
         </w:rPr>
-        <w:t xml:space="preserve">Detailed terms and conditions of your appointment are </w:t>
-      </w:r>
-      <w:r>
-        <w:rPr>
-          <w:rFonts w:ascii="Cambria" w:hAnsi="Cambria"/>
-        </w:rPr>
-        <w:t>as</w:t>
-      </w:r>
-      <w:r>
-        <w:rPr>
-          <w:rFonts w:ascii="Cambria" w:hAnsi="Cambria"/>
-        </w:rPr>
-        <w:t xml:space="preserve"> </w:t>
-      </w:r>
-      <w:r>
-        <w:rPr>
-          <w:rFonts w:ascii="Cambria" w:hAnsi="Cambria"/>
-        </w:rPr>
-        <w:t>follows</w:t>
-      </w:r>
-      <w:r>
-        <w:rPr>
-          <w:rFonts w:ascii="Cambria" w:hAnsi="Cambria"/>
-        </w:rPr>
-        <w:t xml:space="preserve">: </w:t>
+        <w:t xml:space="preserve">Detailed terms and conditions of your appointment are as follows: </w:t>
       </w:r>
     </w:p>
     <w:p>
@@ -761,7 +790,7 @@
         <w:pStyle w:val="NoSpacing"/>
         <w:numPr>
           <w:ilvl w:val="0"/>
-          <w:numId w:val="6"/>
+          <w:numId w:val="18"/>
         </w:numPr>
         <w:jc w:val="both"/>
         <w:rPr>
@@ -879,7 +908,7 @@
         <w:pStyle w:val="NoSpacing"/>
         <w:numPr>
           <w:ilvl w:val="0"/>
-          <w:numId w:val="6"/>
+          <w:numId w:val="18"/>
         </w:numPr>
         <w:jc w:val="both"/>
         <w:rPr>
@@ -925,25 +954,11 @@
           <w:rFonts w:ascii="Cambria" w:hAnsi="Cambria"/>
           <w:b/>
         </w:rPr>
-        <w:t>7</w:t>
+        <w:t>7 days'</w:t>
       </w:r>
       <w:r>
         <w:rPr>
           <w:rFonts w:ascii="Cambria" w:hAnsi="Cambria"/>
-          <w:b/>
-        </w:rPr>
-        <w:t xml:space="preserve"> </w:t>
-      </w:r>
-      <w:r>
-        <w:rPr>
-          <w:rFonts w:ascii="Cambria" w:hAnsi="Cambria"/>
-          <w:b/>
-        </w:rPr>
-        <w:t>days'</w:t>
-      </w:r>
-      <w:r>
-        <w:rPr>
-          <w:rFonts w:ascii="Cambria" w:hAnsi="Cambria"/>
         </w:rPr>
         <w:t xml:space="preserve"> written notice or payment of basic salary in lieu of the same. </w:t>
       </w:r>
@@ -968,23 +983,7 @@
           <w:b/>
           <w:color w:val="000000"/>
         </w:rPr>
-        <w:t>0 days</w:t>
-      </w:r>
-      <w:r>
-        <w:rPr>
-          <w:rFonts w:ascii="Cambria" w:hAnsi="Cambria" w:cs="Arial"/>
-          <w:b/>
-          <w:color w:val="000000"/>
-        </w:rPr>
-        <w:t>’</w:t>
-      </w:r>
-      <w:r>
-        <w:rPr>
-          <w:rFonts w:ascii="Cambria" w:hAnsi="Cambria" w:cs="Arial"/>
-          <w:b/>
-          <w:color w:val="000000"/>
-        </w:rPr>
-        <w:t xml:space="preserve"> notice</w:t>
+        <w:t>0 days’ notice</w:t>
       </w:r>
       <w:r>
         <w:rPr>
@@ -1016,7 +1015,7 @@
         <w:pStyle w:val="NoSpacing"/>
         <w:numPr>
           <w:ilvl w:val="0"/>
-          <w:numId w:val="6"/>
+          <w:numId w:val="18"/>
         </w:numPr>
         <w:jc w:val="both"/>
         <w:rPr>
@@ -1029,14 +1028,7 @@
           <w:rFonts w:ascii="Cambria" w:hAnsi="Cambria"/>
           <w:b/>
         </w:rPr>
-        <w:t>Working Hours</w:t>
-      </w:r>
-      <w:r>
-        <w:rPr>
-          <w:rFonts w:ascii="Cambria" w:hAnsi="Cambria"/>
-          <w:b/>
-        </w:rPr>
-        <w:t xml:space="preserve"> &amp; Leaves</w:t>
+        <w:t>Working Hours &amp; Leaves</w:t>
       </w:r>
     </w:p>
     <w:p>
@@ -1162,7 +1154,7 @@
         <w:pStyle w:val="NoSpacing"/>
         <w:numPr>
           <w:ilvl w:val="0"/>
-          <w:numId w:val="6"/>
+          <w:numId w:val="18"/>
         </w:numPr>
         <w:jc w:val="both"/>
         <w:rPr>
@@ -1215,24 +1207,18 @@
         <w:rPr>
           <w:rFonts w:ascii="Cambria" w:hAnsi="Cambria"/>
         </w:rPr>
-        <w:t xml:space="preserve">at the rate of 12% of your basic salary or at such other statutory rate that may be prescribed by law. </w:t>
+        <w:t xml:space="preserve">at the rate of 12% of your basic salary or at such other statutory rate that may be prescribed by law. An equal amount will be mandatorily deducted from your salary towards </w:t>
       </w:r>
       <w:r>
         <w:rPr>
           <w:rFonts w:ascii="Cambria" w:hAnsi="Cambria"/>
         </w:rPr>
-        <w:t xml:space="preserve">An equal amount will be mandatorily deducted from your salary towards </w:t>
+        <w:t>the Employees' Provident Fund</w:t>
       </w:r>
       <w:r>
         <w:rPr>
           <w:rFonts w:ascii="Cambria" w:hAnsi="Cambria"/>
         </w:rPr>
-        <w:t>the Employees' Provident Fund</w:t>
-      </w:r>
-      <w:r>
-        <w:rPr>
-          <w:rFonts w:ascii="Cambria" w:hAnsi="Cambria"/>
-        </w:rPr>
         <w:t xml:space="preserve"> contribution.</w:t>
       </w:r>
     </w:p>
@@ -1336,37 +1322,13 @@
         <w:rPr>
           <w:rFonts w:ascii="Cambria" w:hAnsi="Cambria" w:cs="Arial"/>
         </w:rPr>
-        <w:t>Rs. 5000</w:t>
-      </w:r>
-      <w:r>
-        <w:rPr>
-          <w:rFonts w:ascii="Cambria" w:hAnsi="Cambria" w:cs="Arial"/>
-        </w:rPr>
-        <w:t>/-</w:t>
-      </w:r>
-      <w:r>
-        <w:rPr>
-          <w:rFonts w:ascii="Cambria" w:hAnsi="Cambria" w:cs="Arial"/>
-        </w:rPr>
-        <w:t xml:space="preserve"> per </w:t>
-      </w:r>
-      <w:r>
-        <w:rPr>
-          <w:rFonts w:ascii="Cambria" w:hAnsi="Cambria" w:cs="Arial"/>
-        </w:rPr>
-        <w:t>annum</w:t>
-      </w:r>
-      <w:r>
-        <w:rPr>
-          <w:rFonts w:ascii="Cambria" w:hAnsi="Cambria" w:cs="Arial"/>
-        </w:rPr>
-        <w:t xml:space="preserve"> (</w:t>
-      </w:r>
-      <w:r>
-        <w:rPr>
-          <w:rFonts w:ascii="Cambria" w:hAnsi="Cambria" w:cs="Arial"/>
-        </w:rPr>
-        <w:t>After Confirmation)</w:t>
+        <w:t>Rs. 5000/- per annum</w:t>
+      </w:r>
+      <w:r>
+        <w:rPr>
+          <w:rFonts w:ascii="Cambria" w:hAnsi="Cambria" w:cs="Arial"/>
+        </w:rPr>
+        <w:t xml:space="preserve"> (After Confirmation)</w:t>
       </w:r>
       <w:r>
         <w:rPr>
@@ -1390,7 +1352,7 @@
         <w:pStyle w:val="NoSpacing"/>
         <w:numPr>
           <w:ilvl w:val="0"/>
-          <w:numId w:val="6"/>
+          <w:numId w:val="18"/>
         </w:numPr>
         <w:jc w:val="both"/>
         <w:rPr>
@@ -1466,25 +1428,7 @@
         <w:rPr>
           <w:rFonts w:ascii="Cambria" w:hAnsi="Cambria" w:cs="Arial"/>
         </w:rPr>
-        <w:t xml:space="preserve">You will have to abide by the Company’s Code of Conduct, rules, regulations, </w:t>
-      </w:r>
-      <w:r>
-        <w:rPr>
-          <w:rFonts w:ascii="Cambria" w:hAnsi="Cambria" w:cs="Arial"/>
-        </w:rPr>
-        <w:t>organisation</w:t>
-      </w:r>
-      <w:r>
-        <w:rPr>
-          <w:rFonts w:ascii="Cambria" w:hAnsi="Cambria" w:cs="Arial"/>
-        </w:rPr>
-        <w:t xml:space="preserve"> values and culture</w:t>
-      </w:r>
-      <w:r>
-        <w:rPr>
-          <w:rFonts w:ascii="Cambria" w:hAnsi="Cambria" w:cs="Arial"/>
-        </w:rPr>
-        <w:t xml:space="preserve"> as per the enclosed </w:t>
+        <w:t xml:space="preserve">You will have to abide by the Company’s Code of Conduct, rules, regulations, organisation values and culture as per the enclosed </w:t>
       </w:r>
       <w:r>
         <w:rPr>
@@ -1492,15 +1436,7 @@
           <w:b/>
           <w:bCs/>
         </w:rPr>
-        <w:t>Annexure</w:t>
-      </w:r>
-      <w:r>
-        <w:rPr>
-          <w:rFonts w:ascii="Cambria" w:hAnsi="Cambria" w:cs="Arial"/>
-          <w:b/>
-          <w:bCs/>
-        </w:rPr>
-        <w:t>-I.</w:t>
+        <w:t>Annexure-I.</w:t>
       </w:r>
     </w:p>
     <w:p>
@@ -2191,25 +2127,7 @@
           <w:sz w:val="19"/>
           <w:szCs w:val="19"/>
         </w:rPr>
-        <w:t xml:space="preserve">Your address, as indicated in your application for appointment, shall be deemed to be correct for sending any communication to you. Every communication addressed to you at the given address shall be deemed to have been served upon you. In case there is any change in your residential address, you will intimate the same in writing to the </w:t>
-      </w:r>
-      <w:r>
-        <w:rPr>
-          <w:rFonts w:ascii="Cambria" w:hAnsi="Cambria"/>
-          <w:color w:val="000000"/>
-          <w:sz w:val="19"/>
-          <w:szCs w:val="19"/>
-        </w:rPr>
-        <w:t>payroll</w:t>
-      </w:r>
-      <w:r>
-        <w:rPr>
-          <w:rFonts w:ascii="Cambria" w:hAnsi="Cambria"/>
-          <w:color w:val="000000"/>
-          <w:sz w:val="19"/>
-          <w:szCs w:val="19"/>
-        </w:rPr>
-        <w:t>/employee services team within three days from the date of such change and get such change of address recorded. You should also keep the Company informed about any other personal changes like marital status &amp; educational qualifications.</w:t>
+        <w:t>Your address, as indicated in your application for appointment, shall be deemed to be correct for sending any communication to you. Every communication addressed to you at the given address shall be deemed to have been served upon you. In case there is any change in your residential address, you will intimate the same in writing to the payroll/employee services team within three days from the date of such change and get such change of address recorded. You should also keep the Company informed about any other personal changes like marital status &amp; educational qualifications.</w:t>
       </w:r>
     </w:p>
     <w:p>
@@ -2374,23 +2292,7 @@
           <w:sz w:val="19"/>
           <w:szCs w:val="19"/>
         </w:rPr>
-        <w:t xml:space="preserve">You will deal with the Company’s </w:t>
-      </w:r>
-      <w:r>
-        <w:rPr>
-          <w:rFonts w:ascii="Cambria" w:hAnsi="Cambria" w:cs="Arial"/>
-          <w:sz w:val="19"/>
-          <w:szCs w:val="19"/>
-        </w:rPr>
-        <w:t>business-related</w:t>
-      </w:r>
-      <w:r>
-        <w:rPr>
-          <w:rFonts w:ascii="Cambria" w:hAnsi="Cambria" w:cs="Arial"/>
-          <w:sz w:val="19"/>
-          <w:szCs w:val="19"/>
-        </w:rPr>
-        <w:t xml:space="preserve"> matters, documents and money with utmost honesty and professional ethics.  If you are found guilty, at any point of time of moral turpitude or of dishonesty, your services can be terminated without any notice and without assigning any reason, whatsoever.</w:t>
+        <w:t>You will deal with the Company’s business-related matters, documents and money with utmost honesty and professional ethics.  If you are found guilty, at any point of time of moral turpitude or of dishonesty, your services can be terminated without any notice and without assigning any reason, whatsoever.</w:t>
       </w:r>
     </w:p>
     <w:p>
@@ -2443,23 +2345,7 @@
           <w:sz w:val="19"/>
           <w:szCs w:val="19"/>
         </w:rPr>
-        <w:t xml:space="preserve">Effective communication with the concerned staff, maintenance of relationship, ensuring timely services to the personnel deployed at various locations/clients, maintenance of records and documentations are vital in </w:t>
-      </w:r>
-      <w:r>
-        <w:rPr>
-          <w:rFonts w:ascii="Cambria" w:hAnsi="Cambria" w:cs="Arial"/>
-          <w:sz w:val="19"/>
-          <w:szCs w:val="19"/>
-        </w:rPr>
-        <w:t>day-to-day</w:t>
-      </w:r>
-      <w:r>
-        <w:rPr>
-          <w:rFonts w:ascii="Cambria" w:hAnsi="Cambria" w:cs="Arial"/>
-          <w:sz w:val="19"/>
-          <w:szCs w:val="19"/>
-        </w:rPr>
-        <w:t xml:space="preserve"> performance of your duties.</w:t>
+        <w:t>Effective communication with the concerned staff, maintenance of relationship, ensuring timely services to the personnel deployed at various locations/clients, maintenance of records and documentations are vital in day-to-day performance of your duties.</w:t>
       </w:r>
     </w:p>
     <w:p>
@@ -5342,7 +5228,7 @@
         <w:pStyle w:val="ListParagraph"/>
         <w:numPr>
           <w:ilvl w:val="0"/>
-          <w:numId w:val="7"/>
+          <w:numId w:val="19"/>
         </w:numPr>
         <w:spacing w:after="0"/>
         <w:jc w:val="both"/>
@@ -5366,7 +5252,7 @@
         <w:pStyle w:val="ListParagraph"/>
         <w:numPr>
           <w:ilvl w:val="0"/>
-          <w:numId w:val="7"/>
+          <w:numId w:val="19"/>
         </w:numPr>
         <w:spacing w:after="0"/>
         <w:jc w:val="both"/>
@@ -5390,7 +5276,7 @@
         <w:pStyle w:val="ListParagraph"/>
         <w:numPr>
           <w:ilvl w:val="0"/>
-          <w:numId w:val="7"/>
+          <w:numId w:val="19"/>
         </w:numPr>
         <w:spacing w:after="0"/>
         <w:jc w:val="both"/>
@@ -5423,9 +5309,25 @@
         </w:rPr>
       </w:pPr>
     </w:p>
+    <w:p>
+      <w:pPr>
+        <w:spacing w:after="0" w:line="240" w:lineRule="auto"/>
+        <w:jc w:val="both"/>
+        <w:rPr>
+          <w:rFonts w:cs="Calibri"/>
+          <w:color w:val="000000"/>
+        </w:rPr>
+      </w:pPr>
+    </w:p>
     <w:sectPr>
+      <w:headerReference w:type="even" r:id="rId9"/>
+      <w:headerReference w:type="default" r:id="rId10"/>
+      <w:footerReference w:type="even" r:id="rId11"/>
+      <w:footerReference w:type="default" r:id="rId12"/>
+      <w:headerReference w:type="first" r:id="rId13"/>
+      <w:footerReference w:type="first" r:id="rId14"/>
       <w:pgSz w:w="12240" w:h="15840"/>
-      <w:pgMar w:top="567" w:right="1183" w:bottom="630" w:left="1134" w:header="720" w:footer="720" w:gutter="0"/>
+      <w:pgMar w:top="426" w:right="758" w:bottom="284" w:left="993" w:header="510" w:footer="0" w:gutter="0"/>
       <w:cols w:space="720"/>
       <w:docGrid w:linePitch="360"/>
     </w:sectPr>
@@ -5433,187 +5335,657 @@
 </w:document>
 </file>
 
+<file path=word/endnotes.xml><?xml version="1.0" encoding="utf-8"?>
+<w:endnotes xmlns:wpc="http://schemas.microsoft.com/office/word/2010/wordprocessingCanvas" xmlns:cx="http://schemas.microsoft.com/office/drawing/2014/chartex" xmlns:cx1="http://schemas.microsoft.com/office/drawing/2015/9/8/chartex" xmlns:cx2="http://schemas.microsoft.com/office/drawing/2015/10/21/chartex" xmlns:cx3="http://schemas.microsoft.com/office/drawing/2016/5/9/chartex" xmlns:cx4="http://schemas.microsoft.com/office/drawing/2016/5/10/chartex" xmlns:cx5="http://schemas.microsoft.com/office/drawing/2016/5/11/chartex" xmlns:cx6="http://schemas.microsoft.com/office/drawing/2016/5/12/chartex" xmlns:cx7="http://schemas.microsoft.com/office/drawing/2016/5/13/chartex" xmlns:cx8="http://schemas.microsoft.com/office/drawing/2016/5/14/chartex" xmlns:mc="http://schemas.openxmlformats.org/markup-compatibility/2006" xmlns:aink="http://schemas.microsoft.com/office/drawing/2016/ink" xmlns:am3d="http://schemas.microsoft.com/office/drawing/2017/model3d" xmlns:o="urn:schemas-microsoft-com:office:office" xmlns:oel="http://schemas.microsoft.com/office/2019/extlst" xmlns:r="http://schemas.openxmlformats.org/officeDocument/2006/relationships" xmlns:m="http://schemas.openxmlformats.org/officeDocument/2006/math" xmlns:v="urn:schemas-microsoft-com:vml" xmlns:wp14="http://schemas.microsoft.com/office/word/2010/wordprocessingDrawing" xmlns:wp="http://schemas.openxmlformats.org/drawingml/2006/wordprocessingDrawing" xmlns:w10="urn:schemas-microsoft-com:office:word" xmlns:w="http://schemas.openxmlformats.org/wordprocessingml/2006/main" xmlns:w14="http://schemas.microsoft.com/office/word/2010/wordml" xmlns:w15="http://schemas.microsoft.com/office/word/2012/wordml" xmlns:w16cex="http://schemas.microsoft.com/office/word/2018/wordml/cex" xmlns:w16cid="http://schemas.microsoft.com/office/word/2016/wordml/cid" xmlns:w16="http://schemas.microsoft.com/office/word/2018/wordml" xmlns:w16du="http://schemas.microsoft.com/office/word/2023/wordml/word16du" xmlns:w16sdtdh="http://schemas.microsoft.com/office/word/2020/wordml/sdtdatahash" xmlns:w16sdtfl="http://schemas.microsoft.com/office/word/2024/wordml/sdtformatlock" xmlns:w16se="http://schemas.microsoft.com/office/word/2015/wordml/symex" xmlns:wpg="http://schemas.microsoft.com/office/word/2010/wordprocessingGroup" xmlns:wpi="http://schemas.microsoft.com/office/word/2010/wordprocessingInk" xmlns:wne="http://schemas.microsoft.com/office/word/2006/wordml" xmlns:wps="http://schemas.microsoft.com/office/word/2010/wordprocessingShape" mc:Ignorable="w14 w15 w16se w16cid w16 w16cex w16sdtdh w16sdtfl w16du wp14">
+  <w:endnote w:type="separator" w:id="-1">
+    <w:p>
+      <w:pPr>
+        <w:spacing w:after="0" w:line="240" w:lineRule="auto"/>
+      </w:pPr>
+      <w:r>
+        <w:separator/>
+      </w:r>
+    </w:p>
+  </w:endnote>
+  <w:endnote w:type="continuationSeparator" w:id="0">
+    <w:p>
+      <w:pPr>
+        <w:spacing w:after="0" w:line="240" w:lineRule="auto"/>
+      </w:pPr>
+      <w:r>
+        <w:continuationSeparator/>
+      </w:r>
+    </w:p>
+  </w:endnote>
+</w:endnotes>
+</file>
+
+<file path=word/footer1.xml><?xml version="1.0" encoding="utf-8"?>
+<w:ftr xmlns:wpc="http://schemas.microsoft.com/office/word/2010/wordprocessingCanvas" xmlns:cx="http://schemas.microsoft.com/office/drawing/2014/chartex" xmlns:cx1="http://schemas.microsoft.com/office/drawing/2015/9/8/chartex" xmlns:cx2="http://schemas.microsoft.com/office/drawing/2015/10/21/chartex" xmlns:cx3="http://schemas.microsoft.com/office/drawing/2016/5/9/chartex" xmlns:cx4="http://schemas.microsoft.com/office/drawing/2016/5/10/chartex" xmlns:cx5="http://schemas.microsoft.com/office/drawing/2016/5/11/chartex" xmlns:cx6="http://schemas.microsoft.com/office/drawing/2016/5/12/chartex" xmlns:cx7="http://schemas.microsoft.com/office/drawing/2016/5/13/chartex" xmlns:cx8="http://schemas.microsoft.com/office/drawing/2016/5/14/chartex" xmlns:mc="http://schemas.openxmlformats.org/markup-compatibility/2006" xmlns:aink="http://schemas.microsoft.com/office/drawing/2016/ink" xmlns:am3d="http://schemas.microsoft.com/office/drawing/2017/model3d" xmlns:o="urn:schemas-microsoft-com:office:office" xmlns:oel="http://schemas.microsoft.com/office/2019/extlst" xmlns:r="http://schemas.openxmlformats.org/officeDocument/2006/relationships" xmlns:m="http://schemas.openxmlformats.org/officeDocument/2006/math" xmlns:v="urn:schemas-microsoft-com:vml" xmlns:wp14="http://schemas.microsoft.com/office/word/2010/wordprocessingDrawing" xmlns:wp="http://schemas.openxmlformats.org/drawingml/2006/wordprocessingDrawing" xmlns:w10="urn:schemas-microsoft-com:office:word" xmlns:w="http://schemas.openxmlformats.org/wordprocessingml/2006/main" xmlns:w14="http://schemas.microsoft.com/office/word/2010/wordml" xmlns:w15="http://schemas.microsoft.com/office/word/2012/wordml" xmlns:w16cex="http://schemas.microsoft.com/office/word/2018/wordml/cex" xmlns:w16cid="http://schemas.microsoft.com/office/word/2016/wordml/cid" xmlns:w16="http://schemas.microsoft.com/office/word/2018/wordml" xmlns:w16du="http://schemas.microsoft.com/office/word/2023/wordml/word16du" xmlns:w16sdtdh="http://schemas.microsoft.com/office/word/2020/wordml/sdtdatahash" xmlns:w16sdtfl="http://schemas.microsoft.com/office/word/2024/wordml/sdtformatlock" xmlns:w16se="http://schemas.microsoft.com/office/word/2015/wordml/symex" xmlns:wpg="http://schemas.microsoft.com/office/word/2010/wordprocessingGroup" xmlns:wpi="http://schemas.microsoft.com/office/word/2010/wordprocessingInk" xmlns:wne="http://schemas.microsoft.com/office/word/2006/wordml" xmlns:wps="http://schemas.microsoft.com/office/word/2010/wordprocessingShape" mc:Ignorable="w14 w15 w16se w16cid w16 w16cex w16sdtdh w16sdtfl w16du wp14">
+  <w:p>
+    <w:pPr>
+      <w:pStyle w:val="Footer"/>
+    </w:pPr>
+  </w:p>
+</w:ftr>
+</file>
+
+<file path=word/footer2.xml><?xml version="1.0" encoding="utf-8"?>
+<w:ftr xmlns:wpc="http://schemas.microsoft.com/office/word/2010/wordprocessingCanvas" xmlns:cx="http://schemas.microsoft.com/office/drawing/2014/chartex" xmlns:cx1="http://schemas.microsoft.com/office/drawing/2015/9/8/chartex" xmlns:cx2="http://schemas.microsoft.com/office/drawing/2015/10/21/chartex" xmlns:cx3="http://schemas.microsoft.com/office/drawing/2016/5/9/chartex" xmlns:cx4="http://schemas.microsoft.com/office/drawing/2016/5/10/chartex" xmlns:cx5="http://schemas.microsoft.com/office/drawing/2016/5/11/chartex" xmlns:cx6="http://schemas.microsoft.com/office/drawing/2016/5/12/chartex" xmlns:cx7="http://schemas.microsoft.com/office/drawing/2016/5/13/chartex" xmlns:cx8="http://schemas.microsoft.com/office/drawing/2016/5/14/chartex" xmlns:mc="http://schemas.openxmlformats.org/markup-compatibility/2006" xmlns:aink="http://schemas.microsoft.com/office/drawing/2016/ink" xmlns:am3d="http://schemas.microsoft.com/office/drawing/2017/model3d" xmlns:o="urn:schemas-microsoft-com:office:office" xmlns:oel="http://schemas.microsoft.com/office/2019/extlst" xmlns:r="http://schemas.openxmlformats.org/officeDocument/2006/relationships" xmlns:m="http://schemas.openxmlformats.org/officeDocument/2006/math" xmlns:v="urn:schemas-microsoft-com:vml" xmlns:wp14="http://schemas.microsoft.com/office/word/2010/wordprocessingDrawing" xmlns:wp="http://schemas.openxmlformats.org/drawingml/2006/wordprocessingDrawing" xmlns:w10="urn:schemas-microsoft-com:office:word" xmlns:w="http://schemas.openxmlformats.org/wordprocessingml/2006/main" xmlns:w14="http://schemas.microsoft.com/office/word/2010/wordml" xmlns:w15="http://schemas.microsoft.com/office/word/2012/wordml" xmlns:w16cex="http://schemas.microsoft.com/office/word/2018/wordml/cex" xmlns:w16cid="http://schemas.microsoft.com/office/word/2016/wordml/cid" xmlns:w16="http://schemas.microsoft.com/office/word/2018/wordml" xmlns:w16du="http://schemas.microsoft.com/office/word/2023/wordml/word16du" xmlns:w16sdtdh="http://schemas.microsoft.com/office/word/2020/wordml/sdtdatahash" xmlns:w16sdtfl="http://schemas.microsoft.com/office/word/2024/wordml/sdtformatlock" xmlns:w16se="http://schemas.microsoft.com/office/word/2015/wordml/symex" xmlns:wpg="http://schemas.microsoft.com/office/word/2010/wordprocessingGroup" xmlns:wpi="http://schemas.microsoft.com/office/word/2010/wordprocessingInk" xmlns:wne="http://schemas.microsoft.com/office/word/2006/wordml" xmlns:wps="http://schemas.microsoft.com/office/word/2010/wordprocessingShape" mc:Ignorable="w14 w15 w16se w16cid w16 w16cex w16sdtdh w16sdtfl w16du wp14">
+  <w:p>
+    <w:pPr>
+      <w:rPr>
+        <w:color w:val="1F497D"/>
+      </w:rPr>
+    </w:pPr>
+    <w:r>
+      <w:rPr>
+        <w:noProof/>
+        <w:color w:val="1F497D"/>
+        <w:lang w:val="en-IN" w:eastAsia="en-IN"/>
+      </w:rPr>
+      <w:pict w14:anchorId="55304D26">
+        <v:rect id="_x0000_s1032" style="position:absolute;margin-left:-49.2pt;margin-top:38.9pt;width:611.55pt;height:10.4pt;z-index:251658240" fillcolor="#c00000" strokecolor="#c00000"/>
+      </w:pict>
+    </w:r>
+    <w:r>
+      <w:rPr>
+        <w:noProof/>
+        <w:color w:val="1F497D"/>
+        <w:lang w:val="en-IN" w:eastAsia="en-IN"/>
+      </w:rPr>
+      <w:pict w14:anchorId="390C9F18">
+        <v:shapetype id="_x0000_t32" coordsize="21600,21600" o:spt="32" o:oned="t" path="m,l21600,21600e" filled="f">
+          <v:path arrowok="t" fillok="f" o:connecttype="none"/>
+          <o:lock v:ext="edit" shapetype="t"/>
+        </v:shapetype>
+        <v:shape id="_x0000_s1031" type="#_x0000_t32" style="position:absolute;margin-left:-48.75pt;margin-top:1.65pt;width:607.5pt;height:0;z-index:251657216" o:connectortype="straight" strokecolor="#333"/>
+      </w:pict>
+    </w:r>
+    <w:r>
+      <w:pict w14:anchorId="344031F6">
+        <v:shapetype id="_x0000_t75" coordsize="21600,21600" o:spt="75" o:preferrelative="t" path="m@4@5l@4@11@9@11@9@5xe" filled="f" stroked="f">
+          <v:stroke joinstyle="miter"/>
+          <v:formulas>
+            <v:f eqn="if lineDrawn pixelLineWidth 0"/>
+            <v:f eqn="sum @0 1 0"/>
+            <v:f eqn="sum 0 0 @1"/>
+            <v:f eqn="prod @2 1 2"/>
+            <v:f eqn="prod @3 21600 pixelWidth"/>
+            <v:f eqn="prod @3 21600 pixelHeight"/>
+            <v:f eqn="sum @0 0 1"/>
+            <v:f eqn="prod @6 1 2"/>
+            <v:f eqn="prod @7 21600 pixelWidth"/>
+            <v:f eqn="sum @8 21600 0"/>
+            <v:f eqn="prod @7 21600 pixelHeight"/>
+            <v:f eqn="sum @10 21600 0"/>
+          </v:formulas>
+          <v:path o:extrusionok="f" gradientshapeok="t" o:connecttype="rect"/>
+          <o:lock v:ext="edit" aspectratio="t"/>
+        </v:shapetype>
+        <v:shape id="_x0000_i1027" type="#_x0000_t75" style="width:525pt;height:38.25pt">
+          <v:imagedata r:id="rId1" o:title="11111"/>
+        </v:shape>
+      </w:pict>
+    </w:r>
+  </w:p>
+</w:ftr>
+</file>
+
+<file path=word/footer3.xml><?xml version="1.0" encoding="utf-8"?>
+<w:ftr xmlns:wpc="http://schemas.microsoft.com/office/word/2010/wordprocessingCanvas" xmlns:cx="http://schemas.microsoft.com/office/drawing/2014/chartex" xmlns:cx1="http://schemas.microsoft.com/office/drawing/2015/9/8/chartex" xmlns:cx2="http://schemas.microsoft.com/office/drawing/2015/10/21/chartex" xmlns:cx3="http://schemas.microsoft.com/office/drawing/2016/5/9/chartex" xmlns:cx4="http://schemas.microsoft.com/office/drawing/2016/5/10/chartex" xmlns:cx5="http://schemas.microsoft.com/office/drawing/2016/5/11/chartex" xmlns:cx6="http://schemas.microsoft.com/office/drawing/2016/5/12/chartex" xmlns:cx7="http://schemas.microsoft.com/office/drawing/2016/5/13/chartex" xmlns:cx8="http://schemas.microsoft.com/office/drawing/2016/5/14/chartex" xmlns:mc="http://schemas.openxmlformats.org/markup-compatibility/2006" xmlns:aink="http://schemas.microsoft.com/office/drawing/2016/ink" xmlns:am3d="http://schemas.microsoft.com/office/drawing/2017/model3d" xmlns:o="urn:schemas-microsoft-com:office:office" xmlns:oel="http://schemas.microsoft.com/office/2019/extlst" xmlns:r="http://schemas.openxmlformats.org/officeDocument/2006/relationships" xmlns:m="http://schemas.openxmlformats.org/officeDocument/2006/math" xmlns:v="urn:schemas-microsoft-com:vml" xmlns:wp14="http://schemas.microsoft.com/office/word/2010/wordprocessingDrawing" xmlns:wp="http://schemas.openxmlformats.org/drawingml/2006/wordprocessingDrawing" xmlns:w10="urn:schemas-microsoft-com:office:word" xmlns:w="http://schemas.openxmlformats.org/wordprocessingml/2006/main" xmlns:w14="http://schemas.microsoft.com/office/word/2010/wordml" xmlns:w15="http://schemas.microsoft.com/office/word/2012/wordml" xmlns:w16cex="http://schemas.microsoft.com/office/word/2018/wordml/cex" xmlns:w16cid="http://schemas.microsoft.com/office/word/2016/wordml/cid" xmlns:w16="http://schemas.microsoft.com/office/word/2018/wordml" xmlns:w16du="http://schemas.microsoft.com/office/word/2023/wordml/word16du" xmlns:w16sdtdh="http://schemas.microsoft.com/office/word/2020/wordml/sdtdatahash" xmlns:w16sdtfl="http://schemas.microsoft.com/office/word/2024/wordml/sdtformatlock" xmlns:w16se="http://schemas.microsoft.com/office/word/2015/wordml/symex" xmlns:wpg="http://schemas.microsoft.com/office/word/2010/wordprocessingGroup" xmlns:wpi="http://schemas.microsoft.com/office/word/2010/wordprocessingInk" xmlns:wne="http://schemas.microsoft.com/office/word/2006/wordml" xmlns:wps="http://schemas.microsoft.com/office/word/2010/wordprocessingShape" mc:Ignorable="w14 w15 w16se w16cid w16 w16cex w16sdtdh w16sdtfl w16du wp14">
+  <w:p>
+    <w:pPr>
+      <w:pStyle w:val="Footer"/>
+    </w:pPr>
+  </w:p>
+</w:ftr>
+</file>
+
+<file path=word/footnotes.xml><?xml version="1.0" encoding="utf-8"?>
+<w:footnotes xmlns:wpc="http://schemas.microsoft.com/office/word/2010/wordprocessingCanvas" xmlns:cx="http://schemas.microsoft.com/office/drawing/2014/chartex" xmlns:cx1="http://schemas.microsoft.com/office/drawing/2015/9/8/chartex" xmlns:cx2="http://schemas.microsoft.com/office/drawing/2015/10/21/chartex" xmlns:cx3="http://schemas.microsoft.com/office/drawing/2016/5/9/chartex" xmlns:cx4="http://schemas.microsoft.com/office/drawing/2016/5/10/chartex" xmlns:cx5="http://schemas.microsoft.com/office/drawing/2016/5/11/chartex" xmlns:cx6="http://schemas.microsoft.com/office/drawing/2016/5/12/chartex" xmlns:cx7="http://schemas.microsoft.com/office/drawing/2016/5/13/chartex" xmlns:cx8="http://schemas.microsoft.com/office/drawing/2016/5/14/chartex" xmlns:mc="http://schemas.openxmlformats.org/markup-compatibility/2006" xmlns:aink="http://schemas.microsoft.com/office/drawing/2016/ink" xmlns:am3d="http://schemas.microsoft.com/office/drawing/2017/model3d" xmlns:o="urn:schemas-microsoft-com:office:office" xmlns:oel="http://schemas.microsoft.com/office/2019/extlst" xmlns:r="http://schemas.openxmlformats.org/officeDocument/2006/relationships" xmlns:m="http://schemas.openxmlformats.org/officeDocument/2006/math" xmlns:v="urn:schemas-microsoft-com:vml" xmlns:wp14="http://schemas.microsoft.com/office/word/2010/wordprocessingDrawing" xmlns:wp="http://schemas.openxmlformats.org/drawingml/2006/wordprocessingDrawing" xmlns:w10="urn:schemas-microsoft-com:office:word" xmlns:w="http://schemas.openxmlformats.org/wordprocessingml/2006/main" xmlns:w14="http://schemas.microsoft.com/office/word/2010/wordml" xmlns:w15="http://schemas.microsoft.com/office/word/2012/wordml" xmlns:w16cex="http://schemas.microsoft.com/office/word/2018/wordml/cex" xmlns:w16cid="http://schemas.microsoft.com/office/word/2016/wordml/cid" xmlns:w16="http://schemas.microsoft.com/office/word/2018/wordml" xmlns:w16du="http://schemas.microsoft.com/office/word/2023/wordml/word16du" xmlns:w16sdtdh="http://schemas.microsoft.com/office/word/2020/wordml/sdtdatahash" xmlns:w16sdtfl="http://schemas.microsoft.com/office/word/2024/wordml/sdtformatlock" xmlns:w16se="http://schemas.microsoft.com/office/word/2015/wordml/symex" xmlns:wpg="http://schemas.microsoft.com/office/word/2010/wordprocessingGroup" xmlns:wpi="http://schemas.microsoft.com/office/word/2010/wordprocessingInk" xmlns:wne="http://schemas.microsoft.com/office/word/2006/wordml" xmlns:wps="http://schemas.microsoft.com/office/word/2010/wordprocessingShape" mc:Ignorable="w14 w15 w16se w16cid w16 w16cex w16sdtdh w16sdtfl w16du wp14">
+  <w:footnote w:type="separator" w:id="-1">
+    <w:p>
+      <w:pPr>
+        <w:spacing w:after="0" w:line="240" w:lineRule="auto"/>
+      </w:pPr>
+      <w:r>
+        <w:separator/>
+      </w:r>
+    </w:p>
+  </w:footnote>
+  <w:footnote w:type="continuationSeparator" w:id="0">
+    <w:p>
+      <w:pPr>
+        <w:spacing w:after="0" w:line="240" w:lineRule="auto"/>
+      </w:pPr>
+      <w:r>
+        <w:continuationSeparator/>
+      </w:r>
+    </w:p>
+  </w:footnote>
+</w:footnotes>
+</file>
+
+<file path=word/header1.xml><?xml version="1.0" encoding="utf-8"?>
+<w:hdr xmlns:wpc="http://schemas.microsoft.com/office/word/2010/wordprocessingCanvas" xmlns:cx="http://schemas.microsoft.com/office/drawing/2014/chartex" xmlns:cx1="http://schemas.microsoft.com/office/drawing/2015/9/8/chartex" xmlns:cx2="http://schemas.microsoft.com/office/drawing/2015/10/21/chartex" xmlns:cx3="http://schemas.microsoft.com/office/drawing/2016/5/9/chartex" xmlns:cx4="http://schemas.microsoft.com/office/drawing/2016/5/10/chartex" xmlns:cx5="http://schemas.microsoft.com/office/drawing/2016/5/11/chartex" xmlns:cx6="http://schemas.microsoft.com/office/drawing/2016/5/12/chartex" xmlns:cx7="http://schemas.microsoft.com/office/drawing/2016/5/13/chartex" xmlns:cx8="http://schemas.microsoft.com/office/drawing/2016/5/14/chartex" xmlns:mc="http://schemas.openxmlformats.org/markup-compatibility/2006" xmlns:aink="http://schemas.microsoft.com/office/drawing/2016/ink" xmlns:am3d="http://schemas.microsoft.com/office/drawing/2017/model3d" xmlns:o="urn:schemas-microsoft-com:office:office" xmlns:oel="http://schemas.microsoft.com/office/2019/extlst" xmlns:r="http://schemas.openxmlformats.org/officeDocument/2006/relationships" xmlns:m="http://schemas.openxmlformats.org/officeDocument/2006/math" xmlns:v="urn:schemas-microsoft-com:vml" xmlns:wp14="http://schemas.microsoft.com/office/word/2010/wordprocessingDrawing" xmlns:wp="http://schemas.openxmlformats.org/drawingml/2006/wordprocessingDrawing" xmlns:w10="urn:schemas-microsoft-com:office:word" xmlns:w="http://schemas.openxmlformats.org/wordprocessingml/2006/main" xmlns:w14="http://schemas.microsoft.com/office/word/2010/wordml" xmlns:w15="http://schemas.microsoft.com/office/word/2012/wordml" xmlns:w16cex="http://schemas.microsoft.com/office/word/2018/wordml/cex" xmlns:w16cid="http://schemas.microsoft.com/office/word/2016/wordml/cid" xmlns:w16="http://schemas.microsoft.com/office/word/2018/wordml" xmlns:w16du="http://schemas.microsoft.com/office/word/2023/wordml/word16du" xmlns:w16sdtdh="http://schemas.microsoft.com/office/word/2020/wordml/sdtdatahash" xmlns:w16sdtfl="http://schemas.microsoft.com/office/word/2024/wordml/sdtformatlock" xmlns:w16se="http://schemas.microsoft.com/office/word/2015/wordml/symex" xmlns:wpg="http://schemas.microsoft.com/office/word/2010/wordprocessingGroup" xmlns:wpi="http://schemas.microsoft.com/office/word/2010/wordprocessingInk" xmlns:wne="http://schemas.microsoft.com/office/word/2006/wordml" xmlns:wps="http://schemas.microsoft.com/office/word/2010/wordprocessingShape" mc:Ignorable="w14 w15 w16se w16cid w16 w16cex w16sdtdh w16sdtfl w16du wp14">
+  <w:p>
+    <w:pPr>
+      <w:pStyle w:val="Header"/>
+    </w:pPr>
+  </w:p>
+</w:hdr>
+</file>
+
+<file path=word/header2.xml><?xml version="1.0" encoding="utf-8"?>
+<w:hdr xmlns:wpc="http://schemas.microsoft.com/office/word/2010/wordprocessingCanvas" xmlns:cx="http://schemas.microsoft.com/office/drawing/2014/chartex" xmlns:cx1="http://schemas.microsoft.com/office/drawing/2015/9/8/chartex" xmlns:cx2="http://schemas.microsoft.com/office/drawing/2015/10/21/chartex" xmlns:cx3="http://schemas.microsoft.com/office/drawing/2016/5/9/chartex" xmlns:cx4="http://schemas.microsoft.com/office/drawing/2016/5/10/chartex" xmlns:cx5="http://schemas.microsoft.com/office/drawing/2016/5/11/chartex" xmlns:cx6="http://schemas.microsoft.com/office/drawing/2016/5/12/chartex" xmlns:cx7="http://schemas.microsoft.com/office/drawing/2016/5/13/chartex" xmlns:cx8="http://schemas.microsoft.com/office/drawing/2016/5/14/chartex" xmlns:mc="http://schemas.openxmlformats.org/markup-compatibility/2006" xmlns:aink="http://schemas.microsoft.com/office/drawing/2016/ink" xmlns:am3d="http://schemas.microsoft.com/office/drawing/2017/model3d" xmlns:o="urn:schemas-microsoft-com:office:office" xmlns:oel="http://schemas.microsoft.com/office/2019/extlst" xmlns:r="http://schemas.openxmlformats.org/officeDocument/2006/relationships" xmlns:m="http://schemas.openxmlformats.org/officeDocument/2006/math" xmlns:v="urn:schemas-microsoft-com:vml" xmlns:wp14="http://schemas.microsoft.com/office/word/2010/wordprocessingDrawing" xmlns:wp="http://schemas.openxmlformats.org/drawingml/2006/wordprocessingDrawing" xmlns:w10="urn:schemas-microsoft-com:office:word" xmlns:w="http://schemas.openxmlformats.org/wordprocessingml/2006/main" xmlns:w14="http://schemas.microsoft.com/office/word/2010/wordml" xmlns:w15="http://schemas.microsoft.com/office/word/2012/wordml" xmlns:w16cex="http://schemas.microsoft.com/office/word/2018/wordml/cex" xmlns:w16cid="http://schemas.microsoft.com/office/word/2016/wordml/cid" xmlns:w16="http://schemas.microsoft.com/office/word/2018/wordml" xmlns:w16du="http://schemas.microsoft.com/office/word/2023/wordml/word16du" xmlns:w16sdtdh="http://schemas.microsoft.com/office/word/2020/wordml/sdtdatahash" xmlns:w16sdtfl="http://schemas.microsoft.com/office/word/2024/wordml/sdtformatlock" xmlns:w16se="http://schemas.microsoft.com/office/word/2015/wordml/symex" xmlns:wpg="http://schemas.microsoft.com/office/word/2010/wordprocessingGroup" xmlns:wpi="http://schemas.microsoft.com/office/word/2010/wordprocessingInk" xmlns:wne="http://schemas.microsoft.com/office/word/2006/wordml" xmlns:wps="http://schemas.microsoft.com/office/word/2010/wordprocessingShape" mc:Ignorable="w14 w15 w16se w16cid w16 w16cex w16sdtdh w16sdtfl w16du wp14">
+  <w:p>
+    <w:pPr>
+      <w:pStyle w:val="Header"/>
+    </w:pPr>
+  </w:p>
+</w:hdr>
+</file>
+
+<file path=word/header3.xml><?xml version="1.0" encoding="utf-8"?>
+<w:hdr xmlns:wpc="http://schemas.microsoft.com/office/word/2010/wordprocessingCanvas" xmlns:cx="http://schemas.microsoft.com/office/drawing/2014/chartex" xmlns:cx1="http://schemas.microsoft.com/office/drawing/2015/9/8/chartex" xmlns:cx2="http://schemas.microsoft.com/office/drawing/2015/10/21/chartex" xmlns:cx3="http://schemas.microsoft.com/office/drawing/2016/5/9/chartex" xmlns:cx4="http://schemas.microsoft.com/office/drawing/2016/5/10/chartex" xmlns:cx5="http://schemas.microsoft.com/office/drawing/2016/5/11/chartex" xmlns:cx6="http://schemas.microsoft.com/office/drawing/2016/5/12/chartex" xmlns:cx7="http://schemas.microsoft.com/office/drawing/2016/5/13/chartex" xmlns:cx8="http://schemas.microsoft.com/office/drawing/2016/5/14/chartex" xmlns:mc="http://schemas.openxmlformats.org/markup-compatibility/2006" xmlns:aink="http://schemas.microsoft.com/office/drawing/2016/ink" xmlns:am3d="http://schemas.microsoft.com/office/drawing/2017/model3d" xmlns:o="urn:schemas-microsoft-com:office:office" xmlns:oel="http://schemas.microsoft.com/office/2019/extlst" xmlns:r="http://schemas.openxmlformats.org/officeDocument/2006/relationships" xmlns:m="http://schemas.openxmlformats.org/officeDocument/2006/math" xmlns:v="urn:schemas-microsoft-com:vml" xmlns:wp14="http://schemas.microsoft.com/office/word/2010/wordprocessingDrawing" xmlns:wp="http://schemas.openxmlformats.org/drawingml/2006/wordprocessingDrawing" xmlns:w10="urn:schemas-microsoft-com:office:word" xmlns:w="http://schemas.openxmlformats.org/wordprocessingml/2006/main" xmlns:w14="http://schemas.microsoft.com/office/word/2010/wordml" xmlns:w15="http://schemas.microsoft.com/office/word/2012/wordml" xmlns:w16cex="http://schemas.microsoft.com/office/word/2018/wordml/cex" xmlns:w16cid="http://schemas.microsoft.com/office/word/2016/wordml/cid" xmlns:w16="http://schemas.microsoft.com/office/word/2018/wordml" xmlns:w16du="http://schemas.microsoft.com/office/word/2023/wordml/word16du" xmlns:w16sdtdh="http://schemas.microsoft.com/office/word/2020/wordml/sdtdatahash" xmlns:w16sdtfl="http://schemas.microsoft.com/office/word/2024/wordml/sdtformatlock" xmlns:w16se="http://schemas.microsoft.com/office/word/2015/wordml/symex" xmlns:wpg="http://schemas.microsoft.com/office/word/2010/wordprocessingGroup" xmlns:wpi="http://schemas.microsoft.com/office/word/2010/wordprocessingInk" xmlns:wne="http://schemas.microsoft.com/office/word/2006/wordml" xmlns:wps="http://schemas.microsoft.com/office/word/2010/wordprocessingShape" mc:Ignorable="w14 w15 w16se w16cid w16 w16cex w16sdtdh w16sdtfl w16du wp14">
+  <w:p>
+    <w:pPr>
+      <w:pStyle w:val="Header"/>
+    </w:pPr>
+  </w:p>
+</w:hdr>
+</file>
+
 <file path=word/numbering.xml><?xml version="1.0" encoding="utf-8"?>
 <w:numbering xmlns:wpc="http://schemas.microsoft.com/office/word/2010/wordprocessingCanvas" xmlns:cx="http://schemas.microsoft.com/office/drawing/2014/chartex" xmlns:cx1="http://schemas.microsoft.com/office/drawing/2015/9/8/chartex" xmlns:cx2="http://schemas.microsoft.com/office/drawing/2015/10/21/chartex" xmlns:cx3="http://schemas.microsoft.com/office/drawing/2016/5/9/chartex" xmlns:cx4="http://schemas.microsoft.com/office/drawing/2016/5/10/chartex" xmlns:cx5="http://schemas.microsoft.com/office/drawing/2016/5/11/chartex" xmlns:cx6="http://schemas.microsoft.com/office/drawing/2016/5/12/chartex" xmlns:cx7="http://schemas.microsoft.com/office/drawing/2016/5/13/chartex" xmlns:cx8="http://schemas.microsoft.com/office/drawing/2016/5/14/chartex" xmlns:mc="http://schemas.openxmlformats.org/markup-compatibility/2006" xmlns:aink="http://schemas.microsoft.com/office/drawing/2016/ink" xmlns:am3d="http://schemas.microsoft.com/office/drawing/2017/model3d" xmlns:o="urn:schemas-microsoft-com:office:office" xmlns:oel="http://schemas.microsoft.com/office/2019/extlst" xmlns:r="http://schemas.openxmlformats.org/officeDocument/2006/relationships" xmlns:m="http://schemas.openxmlformats.org/officeDocument/2006/math" xmlns:v="urn:schemas-microsoft-com:vml" xmlns:wp14="http://schemas.microsoft.com/office/word/2010/wordprocessingDrawing" xmlns:wp="http://schemas.openxmlformats.org/drawingml/2006/wordprocessingDrawing" xmlns:w10="urn:schemas-microsoft-com:office:word" xmlns:w="http://schemas.openxmlformats.org/wordprocessingml/2006/main" xmlns:w14="http://schemas.microsoft.com/office/word/2010/wordml" xmlns:w15="http://schemas.microsoft.com/office/word/2012/wordml" xmlns:w16cex="http://schemas.microsoft.com/office/word/2018/wordml/cex" xmlns:w16cid="http://schemas.microsoft.com/office/word/2016/wordml/cid" xmlns:w16="http://schemas.microsoft.com/office/word/2018/wordml" xmlns:w16du="http://schemas.microsoft.com/office/word/2023/wordml/word16du" xmlns:w16sdtdh="http://schemas.microsoft.com/office/word/2020/wordml/sdtdatahash" xmlns:w16sdtfl="http://schemas.microsoft.com/office/word/2024/wordml/sdtformatlock" xmlns:w16se="http://schemas.microsoft.com/office/word/2015/wordml/symex" xmlns:wpg="http://schemas.microsoft.com/office/word/2010/wordprocessingGroup" xmlns:wpi="http://schemas.microsoft.com/office/word/2010/wordprocessingInk" xmlns:wne="http://schemas.microsoft.com/office/word/2006/wordml" xmlns:wps="http://schemas.microsoft.com/office/word/2010/wordprocessingShape" mc:Ignorable="w14 w15 w16se w16cid w16 w16cex w16sdtdh w16sdtfl w16du wp14">
   <w:abstractNum w:abstractNumId="0" w15:restartNumberingAfterBreak="0">
-    <w:nsid w:val="1EAF63F9"/>
+    <w:nsid w:val="00000006"/>
     <w:multiLevelType w:val="hybridMultilevel"/>
-    <w:tmpl w:val="38043A00"/>
-    <w:lvl w:ilvl="0" w:tplc="6CC8D55E">
+    <w:tmpl w:val="507ED7AA"/>
+    <w:lvl w:ilvl="0" w:tplc="FFFFFFFF">
+      <w:start w:val="1"/>
+      <w:numFmt w:val="lowerLetter"/>
+      <w:lvlText w:val="%1)"/>
+      <w:lvlJc w:val="left"/>
+    </w:lvl>
+    <w:lvl w:ilvl="1" w:tplc="FFFFFFFF">
+      <w:start w:val="1"/>
+      <w:numFmt w:val="bullet"/>
+      <w:lvlText w:val=""/>
+      <w:lvlJc w:val="left"/>
+    </w:lvl>
+    <w:lvl w:ilvl="2" w:tplc="FFFFFFFF">
+      <w:start w:val="1"/>
+      <w:numFmt w:val="bullet"/>
+      <w:lvlText w:val=""/>
+      <w:lvlJc w:val="left"/>
+    </w:lvl>
+    <w:lvl w:ilvl="3" w:tplc="FFFFFFFF">
+      <w:start w:val="1"/>
+      <w:numFmt w:val="bullet"/>
+      <w:lvlText w:val=""/>
+      <w:lvlJc w:val="left"/>
+    </w:lvl>
+    <w:lvl w:ilvl="4" w:tplc="FFFFFFFF">
+      <w:start w:val="1"/>
+      <w:numFmt w:val="bullet"/>
+      <w:lvlText w:val=""/>
+      <w:lvlJc w:val="left"/>
+    </w:lvl>
+    <w:lvl w:ilvl="5" w:tplc="FFFFFFFF">
+      <w:start w:val="1"/>
+      <w:numFmt w:val="bullet"/>
+      <w:lvlText w:val=""/>
+      <w:lvlJc w:val="left"/>
+    </w:lvl>
+    <w:lvl w:ilvl="6" w:tplc="FFFFFFFF">
+      <w:start w:val="1"/>
+      <w:numFmt w:val="bullet"/>
+      <w:lvlText w:val=""/>
+      <w:lvlJc w:val="left"/>
+    </w:lvl>
+    <w:lvl w:ilvl="7" w:tplc="FFFFFFFF">
+      <w:start w:val="1"/>
+      <w:numFmt w:val="bullet"/>
+      <w:lvlText w:val=""/>
+      <w:lvlJc w:val="left"/>
+    </w:lvl>
+    <w:lvl w:ilvl="8" w:tplc="FFFFFFFF">
+      <w:start w:val="1"/>
+      <w:numFmt w:val="bullet"/>
+      <w:lvlText w:val=""/>
+      <w:lvlJc w:val="left"/>
+    </w:lvl>
+  </w:abstractNum>
+  <w:abstractNum w:abstractNumId="1" w15:restartNumberingAfterBreak="0">
+    <w:nsid w:val="12F15A73"/>
+    <w:multiLevelType w:val="hybridMultilevel"/>
+    <w:tmpl w:val="66A09056"/>
+    <w:lvl w:ilvl="0" w:tplc="4009000F">
       <w:start w:val="1"/>
       <w:numFmt w:val="decimal"/>
       <w:lvlText w:val="%1."/>
       <w:lvlJc w:val="left"/>
       <w:pPr>
-        <w:ind w:left="1080" w:hanging="360"/>
+        <w:ind w:left="720" w:hanging="360"/>
       </w:pPr>
       <w:rPr>
-        <w:rFonts w:ascii="Calibri" w:eastAsia="Times New Roman" w:hAnsi="Calibri" w:cs="Times New Roman"/>
+        <w:rFonts w:hint="default"/>
       </w:rPr>
     </w:lvl>
-    <w:lvl w:ilvl="1" w:tplc="04090019" w:tentative="1">
+    <w:lvl w:ilvl="1" w:tplc="40090019" w:tentative="1">
       <w:start w:val="1"/>
       <w:numFmt w:val="lowerLetter"/>
       <w:lvlText w:val="%2."/>
       <w:lvlJc w:val="left"/>
       <w:pPr>
-        <w:ind w:left="1800" w:hanging="360"/>
-      </w:pPr>
-    </w:lvl>
-    <w:lvl w:ilvl="2" w:tplc="0409001B" w:tentative="1">
+        <w:ind w:left="1440" w:hanging="360"/>
+      </w:pPr>
+    </w:lvl>
+    <w:lvl w:ilvl="2" w:tplc="4009001B" w:tentative="1">
       <w:start w:val="1"/>
       <w:numFmt w:val="lowerRoman"/>
       <w:lvlText w:val="%3."/>
       <w:lvlJc w:val="right"/>
       <w:pPr>
-        <w:ind w:left="2520" w:hanging="180"/>
-      </w:pPr>
-    </w:lvl>
-    <w:lvl w:ilvl="3" w:tplc="0409000F" w:tentative="1">
+        <w:ind w:left="2160" w:hanging="180"/>
+      </w:pPr>
+    </w:lvl>
+    <w:lvl w:ilvl="3" w:tplc="4009000F" w:tentative="1">
       <w:start w:val="1"/>
       <w:numFmt w:val="decimal"/>
       <w:lvlText w:val="%4."/>
       <w:lvlJc w:val="left"/>
       <w:pPr>
-        <w:ind w:left="3240" w:hanging="360"/>
-      </w:pPr>
-    </w:lvl>
-    <w:lvl w:ilvl="4" w:tplc="04090019" w:tentative="1">
+        <w:ind w:left="2880" w:hanging="360"/>
+      </w:pPr>
+    </w:lvl>
+    <w:lvl w:ilvl="4" w:tplc="40090019" w:tentative="1">
       <w:start w:val="1"/>
       <w:numFmt w:val="lowerLetter"/>
       <w:lvlText w:val="%5."/>
       <w:lvlJc w:val="left"/>
       <w:pPr>
-        <w:ind w:left="3960" w:hanging="360"/>
-      </w:pPr>
-    </w:lvl>
-    <w:lvl w:ilvl="5" w:tplc="0409001B" w:tentative="1">
+        <w:ind w:left="3600" w:hanging="360"/>
+      </w:pPr>
+    </w:lvl>
+    <w:lvl w:ilvl="5" w:tplc="4009001B" w:tentative="1">
       <w:start w:val="1"/>
       <w:numFmt w:val="lowerRoman"/>
       <w:lvlText w:val="%6."/>
       <w:lvlJc w:val="right"/>
       <w:pPr>
-        <w:ind w:left="4680" w:hanging="180"/>
-      </w:pPr>
-    </w:lvl>
-    <w:lvl w:ilvl="6" w:tplc="0409000F" w:tentative="1">
+        <w:ind w:left="4320" w:hanging="180"/>
+      </w:pPr>
+    </w:lvl>
+    <w:lvl w:ilvl="6" w:tplc="4009000F" w:tentative="1">
       <w:start w:val="1"/>
       <w:numFmt w:val="decimal"/>
       <w:lvlText w:val="%7."/>
       <w:lvlJc w:val="left"/>
       <w:pPr>
-        <w:ind w:left="5400" w:hanging="360"/>
-      </w:pPr>
-    </w:lvl>
-    <w:lvl w:ilvl="7" w:tplc="04090019" w:tentative="1">
+        <w:ind w:left="5040" w:hanging="360"/>
+      </w:pPr>
+    </w:lvl>
+    <w:lvl w:ilvl="7" w:tplc="40090019" w:tentative="1">
       <w:start w:val="1"/>
       <w:numFmt w:val="lowerLetter"/>
       <w:lvlText w:val="%8."/>
       <w:lvlJc w:val="left"/>
       <w:pPr>
-        <w:ind w:left="6120" w:hanging="360"/>
-      </w:pPr>
-    </w:lvl>
-    <w:lvl w:ilvl="8" w:tplc="0409001B" w:tentative="1">
+        <w:ind w:left="5760" w:hanging="360"/>
+      </w:pPr>
+    </w:lvl>
+    <w:lvl w:ilvl="8" w:tplc="4009001B" w:tentative="1">
       <w:start w:val="1"/>
       <w:numFmt w:val="lowerRoman"/>
       <w:lvlText w:val="%9."/>
       <w:lvlJc w:val="right"/>
       <w:pPr>
-        <w:ind w:left="6840" w:hanging="180"/>
-      </w:pPr>
-    </w:lvl>
-  </w:abstractNum>
-  <w:abstractNum w:abstractNumId="1" w15:restartNumberingAfterBreak="0">
-    <w:nsid w:val="2FE34C04"/>
-    <w:multiLevelType w:val="hybridMultilevel"/>
-    <w:tmpl w:val="97948112"/>
-    <w:lvl w:ilvl="0" w:tplc="0409000F">
-      <w:start w:val="1"/>
-      <w:numFmt w:val="decimal"/>
-      <w:lvlText w:val="%1."/>
-      <w:lvlJc w:val="left"/>
-      <w:pPr>
-        <w:ind w:left="720" w:hanging="360"/>
-      </w:pPr>
-      <w:rPr>
-        <w:rFonts w:hint="default"/>
-      </w:rPr>
-    </w:lvl>
-    <w:lvl w:ilvl="1" w:tplc="04090019">
-      <w:start w:val="1"/>
-      <w:numFmt w:val="lowerLetter"/>
-      <w:lvlText w:val="%2."/>
-      <w:lvlJc w:val="left"/>
-      <w:pPr>
-        <w:ind w:left="1440" w:hanging="360"/>
-      </w:pPr>
-    </w:lvl>
-    <w:lvl w:ilvl="2" w:tplc="0409001B" w:tentative="1">
-      <w:start w:val="1"/>
-      <w:numFmt w:val="lowerRoman"/>
-      <w:lvlText w:val="%3."/>
-      <w:lvlJc w:val="right"/>
-      <w:pPr>
-        <w:ind w:left="2160" w:hanging="180"/>
-      </w:pPr>
-    </w:lvl>
-    <w:lvl w:ilvl="3" w:tplc="0409000F" w:tentative="1">
-      <w:start w:val="1"/>
-      <w:numFmt w:val="decimal"/>
-      <w:lvlText w:val="%4."/>
-      <w:lvlJc w:val="left"/>
-      <w:pPr>
-        <w:ind w:left="2880" w:hanging="360"/>
-      </w:pPr>
-    </w:lvl>
-    <w:lvl w:ilvl="4" w:tplc="04090019" w:tentative="1">
-      <w:start w:val="1"/>
-      <w:numFmt w:val="lowerLetter"/>
-      <w:lvlText w:val="%5."/>
-      <w:lvlJc w:val="left"/>
-      <w:pPr>
-        <w:ind w:left="3600" w:hanging="360"/>
-      </w:pPr>
-    </w:lvl>
-    <w:lvl w:ilvl="5" w:tplc="0409001B" w:tentative="1">
-      <w:start w:val="1"/>
-      <w:numFmt w:val="lowerRoman"/>
-      <w:lvlText w:val="%6."/>
-      <w:lvlJc w:val="right"/>
-      <w:pPr>
-        <w:ind w:left="4320" w:hanging="180"/>
-      </w:pPr>
-    </w:lvl>
-    <w:lvl w:ilvl="6" w:tplc="0409000F" w:tentative="1">
-      <w:start w:val="1"/>
-      <w:numFmt w:val="decimal"/>
-      <w:lvlText w:val="%7."/>
-      <w:lvlJc w:val="left"/>
-      <w:pPr>
-        <w:ind w:left="5040" w:hanging="360"/>
-      </w:pPr>
-    </w:lvl>
-    <w:lvl w:ilvl="7" w:tplc="04090019" w:tentative="1">
-      <w:start w:val="1"/>
-      <w:numFmt w:val="lowerLetter"/>
-      <w:lvlText w:val="%8."/>
-      <w:lvlJc w:val="left"/>
-      <w:pPr>
-        <w:ind w:left="5760" w:hanging="360"/>
-      </w:pPr>
-    </w:lvl>
-    <w:lvl w:ilvl="8" w:tplc="0409001B" w:tentative="1">
-      <w:start w:val="1"/>
-      <w:numFmt w:val="lowerRoman"/>
-      <w:lvlText w:val="%9."/>
-      <w:lvlJc w:val="right"/>
-      <w:pPr>
         <w:ind w:left="6480" w:hanging="180"/>
       </w:pPr>
     </w:lvl>
   </w:abstractNum>
   <w:abstractNum w:abstractNumId="2" w15:restartNumberingAfterBreak="0">
+    <w:nsid w:val="19F74800"/>
+    <w:multiLevelType w:val="hybridMultilevel"/>
+    <w:tmpl w:val="03F662BE"/>
+    <w:lvl w:ilvl="0" w:tplc="176E173E">
+      <w:start w:val="1"/>
+      <w:numFmt w:val="bullet"/>
+      <w:lvlText w:val="-"/>
+      <w:lvlJc w:val="left"/>
+      <w:pPr>
+        <w:ind w:left="720" w:hanging="360"/>
+      </w:pPr>
+      <w:rPr>
+        <w:rFonts w:ascii="Calibri" w:eastAsia="Times New Roman" w:hAnsi="Calibri" w:cs="Times New Roman" w:hint="default"/>
+      </w:rPr>
+    </w:lvl>
+    <w:lvl w:ilvl="1" w:tplc="04090003" w:tentative="1">
+      <w:start w:val="1"/>
+      <w:numFmt w:val="bullet"/>
+      <w:lvlText w:val="o"/>
+      <w:lvlJc w:val="left"/>
+      <w:pPr>
+        <w:ind w:left="1440" w:hanging="360"/>
+      </w:pPr>
+      <w:rPr>
+        <w:rFonts w:ascii="Courier New" w:hAnsi="Courier New" w:cs="Courier New" w:hint="default"/>
+      </w:rPr>
+    </w:lvl>
+    <w:lvl w:ilvl="2" w:tplc="04090005" w:tentative="1">
+      <w:start w:val="1"/>
+      <w:numFmt w:val="bullet"/>
+      <w:lvlText w:val=""/>
+      <w:lvlJc w:val="left"/>
+      <w:pPr>
+        <w:ind w:left="2160" w:hanging="360"/>
+      </w:pPr>
+      <w:rPr>
+        <w:rFonts w:ascii="Wingdings" w:hAnsi="Wingdings" w:hint="default"/>
+      </w:rPr>
+    </w:lvl>
+    <w:lvl w:ilvl="3" w:tplc="04090001" w:tentative="1">
+      <w:start w:val="1"/>
+      <w:numFmt w:val="bullet"/>
+      <w:lvlText w:val=""/>
+      <w:lvlJc w:val="left"/>
+      <w:pPr>
+        <w:ind w:left="2880" w:hanging="360"/>
+      </w:pPr>
+      <w:rPr>
+        <w:rFonts w:ascii="Symbol" w:hAnsi="Symbol" w:hint="default"/>
+      </w:rPr>
+    </w:lvl>
+    <w:lvl w:ilvl="4" w:tplc="04090003" w:tentative="1">
+      <w:start w:val="1"/>
+      <w:numFmt w:val="bullet"/>
+      <w:lvlText w:val="o"/>
+      <w:lvlJc w:val="left"/>
+      <w:pPr>
+        <w:ind w:left="3600" w:hanging="360"/>
+      </w:pPr>
+      <w:rPr>
+        <w:rFonts w:ascii="Courier New" w:hAnsi="Courier New" w:cs="Courier New" w:hint="default"/>
+      </w:rPr>
+    </w:lvl>
+    <w:lvl w:ilvl="5" w:tplc="04090005" w:tentative="1">
+      <w:start w:val="1"/>
+      <w:numFmt w:val="bullet"/>
+      <w:lvlText w:val=""/>
+      <w:lvlJc w:val="left"/>
+      <w:pPr>
+        <w:ind w:left="4320" w:hanging="360"/>
+      </w:pPr>
+      <w:rPr>
+        <w:rFonts w:ascii="Wingdings" w:hAnsi="Wingdings" w:hint="default"/>
+      </w:rPr>
+    </w:lvl>
+    <w:lvl w:ilvl="6" w:tplc="04090001" w:tentative="1">
+      <w:start w:val="1"/>
+      <w:numFmt w:val="bullet"/>
+      <w:lvlText w:val=""/>
+      <w:lvlJc w:val="left"/>
+      <w:pPr>
+        <w:ind w:left="5040" w:hanging="360"/>
+      </w:pPr>
+      <w:rPr>
+        <w:rFonts w:ascii="Symbol" w:hAnsi="Symbol" w:hint="default"/>
+      </w:rPr>
+    </w:lvl>
+    <w:lvl w:ilvl="7" w:tplc="04090003" w:tentative="1">
+      <w:start w:val="1"/>
+      <w:numFmt w:val="bullet"/>
+      <w:lvlText w:val="o"/>
+      <w:lvlJc w:val="left"/>
+      <w:pPr>
+        <w:ind w:left="5760" w:hanging="360"/>
+      </w:pPr>
+      <w:rPr>
+        <w:rFonts w:ascii="Courier New" w:hAnsi="Courier New" w:cs="Courier New" w:hint="default"/>
+      </w:rPr>
+    </w:lvl>
+    <w:lvl w:ilvl="8" w:tplc="04090005" w:tentative="1">
+      <w:start w:val="1"/>
+      <w:numFmt w:val="bullet"/>
+      <w:lvlText w:val=""/>
+      <w:lvlJc w:val="left"/>
+      <w:pPr>
+        <w:ind w:left="6480" w:hanging="360"/>
+      </w:pPr>
+      <w:rPr>
+        <w:rFonts w:ascii="Wingdings" w:hAnsi="Wingdings" w:hint="default"/>
+      </w:rPr>
+    </w:lvl>
+  </w:abstractNum>
+  <w:abstractNum w:abstractNumId="3" w15:restartNumberingAfterBreak="0">
+    <w:nsid w:val="1FEE37A0"/>
+    <w:multiLevelType w:val="hybridMultilevel"/>
+    <w:tmpl w:val="8A0C6804"/>
+    <w:lvl w:ilvl="0" w:tplc="40090001">
+      <w:start w:val="1"/>
+      <w:numFmt w:val="bullet"/>
+      <w:lvlText w:val=""/>
+      <w:lvlJc w:val="left"/>
+      <w:pPr>
+        <w:ind w:left="720" w:hanging="360"/>
+      </w:pPr>
+      <w:rPr>
+        <w:rFonts w:ascii="Symbol" w:hAnsi="Symbol" w:hint="default"/>
+      </w:rPr>
+    </w:lvl>
+    <w:lvl w:ilvl="1" w:tplc="40090003" w:tentative="1">
+      <w:start w:val="1"/>
+      <w:numFmt w:val="bullet"/>
+      <w:lvlText w:val="o"/>
+      <w:lvlJc w:val="left"/>
+      <w:pPr>
+        <w:ind w:left="1440" w:hanging="360"/>
+      </w:pPr>
+      <w:rPr>
+        <w:rFonts w:ascii="Courier New" w:hAnsi="Courier New" w:cs="Courier New" w:hint="default"/>
+      </w:rPr>
+    </w:lvl>
+    <w:lvl w:ilvl="2" w:tplc="40090005" w:tentative="1">
+      <w:start w:val="1"/>
+      <w:numFmt w:val="bullet"/>
+      <w:lvlText w:val=""/>
+      <w:lvlJc w:val="left"/>
+      <w:pPr>
+        <w:ind w:left="2160" w:hanging="360"/>
+      </w:pPr>
+      <w:rPr>
+        <w:rFonts w:ascii="Wingdings" w:hAnsi="Wingdings" w:hint="default"/>
+      </w:rPr>
+    </w:lvl>
+    <w:lvl w:ilvl="3" w:tplc="40090001" w:tentative="1">
+      <w:start w:val="1"/>
+      <w:numFmt w:val="bullet"/>
+      <w:lvlText w:val=""/>
+      <w:lvlJc w:val="left"/>
+      <w:pPr>
+        <w:ind w:left="2880" w:hanging="360"/>
+      </w:pPr>
+      <w:rPr>
+        <w:rFonts w:ascii="Symbol" w:hAnsi="Symbol" w:hint="default"/>
+      </w:rPr>
+    </w:lvl>
+    <w:lvl w:ilvl="4" w:tplc="40090003" w:tentative="1">
+      <w:start w:val="1"/>
+      <w:numFmt w:val="bullet"/>
+      <w:lvlText w:val="o"/>
+      <w:lvlJc w:val="left"/>
+      <w:pPr>
+        <w:ind w:left="3600" w:hanging="360"/>
+      </w:pPr>
+      <w:rPr>
+        <w:rFonts w:ascii="Courier New" w:hAnsi="Courier New" w:cs="Courier New" w:hint="default"/>
+      </w:rPr>
+    </w:lvl>
+    <w:lvl w:ilvl="5" w:tplc="40090005" w:tentative="1">
+      <w:start w:val="1"/>
+      <w:numFmt w:val="bullet"/>
+      <w:lvlText w:val=""/>
+      <w:lvlJc w:val="left"/>
+      <w:pPr>
+        <w:ind w:left="4320" w:hanging="360"/>
+      </w:pPr>
+      <w:rPr>
+        <w:rFonts w:ascii="Wingdings" w:hAnsi="Wingdings" w:hint="default"/>
+      </w:rPr>
+    </w:lvl>
+    <w:lvl w:ilvl="6" w:tplc="40090001" w:tentative="1">
+      <w:start w:val="1"/>
+      <w:numFmt w:val="bullet"/>
+      <w:lvlText w:val=""/>
+      <w:lvlJc w:val="left"/>
+      <w:pPr>
+        <w:ind w:left="5040" w:hanging="360"/>
+      </w:pPr>
+      <w:rPr>
+        <w:rFonts w:ascii="Symbol" w:hAnsi="Symbol" w:hint="default"/>
+      </w:rPr>
+    </w:lvl>
+    <w:lvl w:ilvl="7" w:tplc="40090003" w:tentative="1">
+      <w:start w:val="1"/>
+      <w:numFmt w:val="bullet"/>
+      <w:lvlText w:val="o"/>
+      <w:lvlJc w:val="left"/>
+      <w:pPr>
+        <w:ind w:left="5760" w:hanging="360"/>
+      </w:pPr>
+      <w:rPr>
+        <w:rFonts w:ascii="Courier New" w:hAnsi="Courier New" w:cs="Courier New" w:hint="default"/>
+      </w:rPr>
+    </w:lvl>
+    <w:lvl w:ilvl="8" w:tplc="40090005" w:tentative="1">
+      <w:start w:val="1"/>
+      <w:numFmt w:val="bullet"/>
+      <w:lvlText w:val=""/>
+      <w:lvlJc w:val="left"/>
+      <w:pPr>
+        <w:ind w:left="6480" w:hanging="360"/>
+      </w:pPr>
+      <w:rPr>
+        <w:rFonts w:ascii="Wingdings" w:hAnsi="Wingdings" w:hint="default"/>
+      </w:rPr>
+    </w:lvl>
+  </w:abstractNum>
+  <w:abstractNum w:abstractNumId="4" w15:restartNumberingAfterBreak="0">
+    <w:nsid w:val="30DA5F01"/>
+    <w:multiLevelType w:val="hybridMultilevel"/>
+    <w:tmpl w:val="DF22E10A"/>
+    <w:lvl w:ilvl="0" w:tplc="AFB2F2DE">
+      <w:numFmt w:val="bullet"/>
+      <w:lvlText w:val="-"/>
+      <w:lvlJc w:val="left"/>
+      <w:pPr>
+        <w:ind w:left="720" w:hanging="360"/>
+      </w:pPr>
+      <w:rPr>
+        <w:rFonts w:ascii="Arial" w:eastAsia="Times New Roman" w:hAnsi="Arial" w:cs="Arial" w:hint="default"/>
+      </w:rPr>
+    </w:lvl>
+    <w:lvl w:ilvl="1" w:tplc="04090003" w:tentative="1">
+      <w:start w:val="1"/>
+      <w:numFmt w:val="bullet"/>
+      <w:lvlText w:val="o"/>
+      <w:lvlJc w:val="left"/>
+      <w:pPr>
+        <w:ind w:left="1440" w:hanging="360"/>
+      </w:pPr>
+      <w:rPr>
+        <w:rFonts w:ascii="Courier New" w:hAnsi="Courier New" w:cs="Courier New" w:hint="default"/>
+      </w:rPr>
+    </w:lvl>
+    <w:lvl w:ilvl="2" w:tplc="04090005" w:tentative="1">
+      <w:start w:val="1"/>
+      <w:numFmt w:val="bullet"/>
+      <w:lvlText w:val=""/>
+      <w:lvlJc w:val="left"/>
+      <w:pPr>
+        <w:ind w:left="2160" w:hanging="360"/>
+      </w:pPr>
+      <w:rPr>
+        <w:rFonts w:ascii="Wingdings" w:hAnsi="Wingdings" w:hint="default"/>
+      </w:rPr>
+    </w:lvl>
+    <w:lvl w:ilvl="3" w:tplc="04090001" w:tentative="1">
+      <w:start w:val="1"/>
+      <w:numFmt w:val="bullet"/>
+      <w:lvlText w:val=""/>
+      <w:lvlJc w:val="left"/>
+      <w:pPr>
+        <w:ind w:left="2880" w:hanging="360"/>
+      </w:pPr>
+      <w:rPr>
+        <w:rFonts w:ascii="Symbol" w:hAnsi="Symbol" w:hint="default"/>
+      </w:rPr>
+    </w:lvl>
+    <w:lvl w:ilvl="4" w:tplc="04090003" w:tentative="1">
+      <w:start w:val="1"/>
+      <w:numFmt w:val="bullet"/>
+      <w:lvlText w:val="o"/>
+      <w:lvlJc w:val="left"/>
+      <w:pPr>
+        <w:ind w:left="3600" w:hanging="360"/>
+      </w:pPr>
+      <w:rPr>
+        <w:rFonts w:ascii="Courier New" w:hAnsi="Courier New" w:cs="Courier New" w:hint="default"/>
+      </w:rPr>
+    </w:lvl>
+    <w:lvl w:ilvl="5" w:tplc="04090005" w:tentative="1">
+      <w:start w:val="1"/>
+      <w:numFmt w:val="bullet"/>
+      <w:lvlText w:val=""/>
+      <w:lvlJc w:val="left"/>
+      <w:pPr>
+        <w:ind w:left="4320" w:hanging="360"/>
+      </w:pPr>
+      <w:rPr>
+        <w:rFonts w:ascii="Wingdings" w:hAnsi="Wingdings" w:hint="default"/>
+      </w:rPr>
+    </w:lvl>
+    <w:lvl w:ilvl="6" w:tplc="04090001" w:tentative="1">
+      <w:start w:val="1"/>
+      <w:numFmt w:val="bullet"/>
+      <w:lvlText w:val=""/>
+      <w:lvlJc w:val="left"/>
+      <w:pPr>
+        <w:ind w:left="5040" w:hanging="360"/>
+      </w:pPr>
+      <w:rPr>
+        <w:rFonts w:ascii="Symbol" w:hAnsi="Symbol" w:hint="default"/>
+      </w:rPr>
+    </w:lvl>
+    <w:lvl w:ilvl="7" w:tplc="04090003" w:tentative="1">
+      <w:start w:val="1"/>
+      <w:numFmt w:val="bullet"/>
+      <w:lvlText w:val="o"/>
+      <w:lvlJc w:val="left"/>
+      <w:pPr>
+        <w:ind w:left="5760" w:hanging="360"/>
+      </w:pPr>
+      <w:rPr>
+        <w:rFonts w:ascii="Courier New" w:hAnsi="Courier New" w:cs="Courier New" w:hint="default"/>
+      </w:rPr>
+    </w:lvl>
+    <w:lvl w:ilvl="8" w:tplc="04090005" w:tentative="1">
+      <w:start w:val="1"/>
+      <w:numFmt w:val="bullet"/>
+      <w:lvlText w:val=""/>
+      <w:lvlJc w:val="left"/>
+      <w:pPr>
+        <w:ind w:left="6480" w:hanging="360"/>
+      </w:pPr>
+      <w:rPr>
+        <w:rFonts w:ascii="Wingdings" w:hAnsi="Wingdings" w:hint="default"/>
+      </w:rPr>
+    </w:lvl>
+  </w:abstractNum>
+  <w:abstractNum w:abstractNumId="5" w15:restartNumberingAfterBreak="0">
     <w:nsid w:val="34C9309D"/>
     <w:multiLevelType w:val="hybridMultilevel"/>
     <w:tmpl w:val="C8F6F7DC"/>
@@ -5699,10 +6071,480 @@
       </w:pPr>
     </w:lvl>
   </w:abstractNum>
-  <w:abstractNum w:abstractNumId="3" w15:restartNumberingAfterBreak="0">
-    <w:nsid w:val="3D1052ED"/>
+  <w:abstractNum w:abstractNumId="6" w15:restartNumberingAfterBreak="0">
+    <w:nsid w:val="36504A93"/>
+    <w:multiLevelType w:val="hybridMultilevel"/>
+    <w:tmpl w:val="F1A83C88"/>
+    <w:lvl w:ilvl="0" w:tplc="04090001">
+      <w:start w:val="1"/>
+      <w:numFmt w:val="bullet"/>
+      <w:lvlText w:val=""/>
+      <w:lvlJc w:val="left"/>
+      <w:pPr>
+        <w:ind w:left="720" w:hanging="360"/>
+      </w:pPr>
+      <w:rPr>
+        <w:rFonts w:ascii="Symbol" w:hAnsi="Symbol" w:hint="default"/>
+      </w:rPr>
+    </w:lvl>
+    <w:lvl w:ilvl="1" w:tplc="04090003" w:tentative="1">
+      <w:start w:val="1"/>
+      <w:numFmt w:val="bullet"/>
+      <w:lvlText w:val="o"/>
+      <w:lvlJc w:val="left"/>
+      <w:pPr>
+        <w:ind w:left="1440" w:hanging="360"/>
+      </w:pPr>
+      <w:rPr>
+        <w:rFonts w:ascii="Courier New" w:hAnsi="Courier New" w:cs="Courier New" w:hint="default"/>
+      </w:rPr>
+    </w:lvl>
+    <w:lvl w:ilvl="2" w:tplc="04090005" w:tentative="1">
+      <w:start w:val="1"/>
+      <w:numFmt w:val="bullet"/>
+      <w:lvlText w:val=""/>
+      <w:lvlJc w:val="left"/>
+      <w:pPr>
+        <w:ind w:left="2160" w:hanging="360"/>
+      </w:pPr>
+      <w:rPr>
+        <w:rFonts w:ascii="Wingdings" w:hAnsi="Wingdings" w:hint="default"/>
+      </w:rPr>
+    </w:lvl>
+    <w:lvl w:ilvl="3" w:tplc="04090001" w:tentative="1">
+      <w:start w:val="1"/>
+      <w:numFmt w:val="bullet"/>
+      <w:lvlText w:val=""/>
+      <w:lvlJc w:val="left"/>
+      <w:pPr>
+        <w:ind w:left="2880" w:hanging="360"/>
+      </w:pPr>
+      <w:rPr>
+        <w:rFonts w:ascii="Symbol" w:hAnsi="Symbol" w:hint="default"/>
+      </w:rPr>
+    </w:lvl>
+    <w:lvl w:ilvl="4" w:tplc="04090003" w:tentative="1">
+      <w:start w:val="1"/>
+      <w:numFmt w:val="bullet"/>
+      <w:lvlText w:val="o"/>
+      <w:lvlJc w:val="left"/>
+      <w:pPr>
+        <w:ind w:left="3600" w:hanging="360"/>
+      </w:pPr>
+      <w:rPr>
+        <w:rFonts w:ascii="Courier New" w:hAnsi="Courier New" w:cs="Courier New" w:hint="default"/>
+      </w:rPr>
+    </w:lvl>
+    <w:lvl w:ilvl="5" w:tplc="04090005" w:tentative="1">
+      <w:start w:val="1"/>
+      <w:numFmt w:val="bullet"/>
+      <w:lvlText w:val=""/>
+      <w:lvlJc w:val="left"/>
+      <w:pPr>
+        <w:ind w:left="4320" w:hanging="360"/>
+      </w:pPr>
+      <w:rPr>
+        <w:rFonts w:ascii="Wingdings" w:hAnsi="Wingdings" w:hint="default"/>
+      </w:rPr>
+    </w:lvl>
+    <w:lvl w:ilvl="6" w:tplc="04090001" w:tentative="1">
+      <w:start w:val="1"/>
+      <w:numFmt w:val="bullet"/>
+      <w:lvlText w:val=""/>
+      <w:lvlJc w:val="left"/>
+      <w:pPr>
+        <w:ind w:left="5040" w:hanging="360"/>
+      </w:pPr>
+      <w:rPr>
+        <w:rFonts w:ascii="Symbol" w:hAnsi="Symbol" w:hint="default"/>
+      </w:rPr>
+    </w:lvl>
+    <w:lvl w:ilvl="7" w:tplc="04090003" w:tentative="1">
+      <w:start w:val="1"/>
+      <w:numFmt w:val="bullet"/>
+      <w:lvlText w:val="o"/>
+      <w:lvlJc w:val="left"/>
+      <w:pPr>
+        <w:ind w:left="5760" w:hanging="360"/>
+      </w:pPr>
+      <w:rPr>
+        <w:rFonts w:ascii="Courier New" w:hAnsi="Courier New" w:cs="Courier New" w:hint="default"/>
+      </w:rPr>
+    </w:lvl>
+    <w:lvl w:ilvl="8" w:tplc="04090005" w:tentative="1">
+      <w:start w:val="1"/>
+      <w:numFmt w:val="bullet"/>
+      <w:lvlText w:val=""/>
+      <w:lvlJc w:val="left"/>
+      <w:pPr>
+        <w:ind w:left="6480" w:hanging="360"/>
+      </w:pPr>
+      <w:rPr>
+        <w:rFonts w:ascii="Wingdings" w:hAnsi="Wingdings" w:hint="default"/>
+      </w:rPr>
+    </w:lvl>
+  </w:abstractNum>
+  <w:abstractNum w:abstractNumId="7" w15:restartNumberingAfterBreak="0">
+    <w:nsid w:val="41064134"/>
+    <w:multiLevelType w:val="hybridMultilevel"/>
+    <w:tmpl w:val="8E2CD382"/>
+    <w:lvl w:ilvl="0" w:tplc="25B620E6">
+      <w:start w:val="1"/>
+      <w:numFmt w:val="lowerLetter"/>
+      <w:lvlText w:val="%1)"/>
+      <w:lvlJc w:val="left"/>
+      <w:pPr>
+        <w:ind w:left="810" w:hanging="360"/>
+      </w:pPr>
+      <w:rPr>
+        <w:rFonts w:hint="default"/>
+        <w:b/>
+      </w:rPr>
+    </w:lvl>
+    <w:lvl w:ilvl="1" w:tplc="04090019" w:tentative="1">
+      <w:start w:val="1"/>
+      <w:numFmt w:val="lowerLetter"/>
+      <w:lvlText w:val="%2."/>
+      <w:lvlJc w:val="left"/>
+      <w:pPr>
+        <w:ind w:left="1440" w:hanging="360"/>
+      </w:pPr>
+    </w:lvl>
+    <w:lvl w:ilvl="2" w:tplc="0409001B" w:tentative="1">
+      <w:start w:val="1"/>
+      <w:numFmt w:val="lowerRoman"/>
+      <w:lvlText w:val="%3."/>
+      <w:lvlJc w:val="right"/>
+      <w:pPr>
+        <w:ind w:left="2160" w:hanging="180"/>
+      </w:pPr>
+    </w:lvl>
+    <w:lvl w:ilvl="3" w:tplc="0409000F" w:tentative="1">
+      <w:start w:val="1"/>
+      <w:numFmt w:val="decimal"/>
+      <w:lvlText w:val="%4."/>
+      <w:lvlJc w:val="left"/>
+      <w:pPr>
+        <w:ind w:left="2880" w:hanging="360"/>
+      </w:pPr>
+    </w:lvl>
+    <w:lvl w:ilvl="4" w:tplc="04090019" w:tentative="1">
+      <w:start w:val="1"/>
+      <w:numFmt w:val="lowerLetter"/>
+      <w:lvlText w:val="%5."/>
+      <w:lvlJc w:val="left"/>
+      <w:pPr>
+        <w:ind w:left="3600" w:hanging="360"/>
+      </w:pPr>
+    </w:lvl>
+    <w:lvl w:ilvl="5" w:tplc="0409001B" w:tentative="1">
+      <w:start w:val="1"/>
+      <w:numFmt w:val="lowerRoman"/>
+      <w:lvlText w:val="%6."/>
+      <w:lvlJc w:val="right"/>
+      <w:pPr>
+        <w:ind w:left="4320" w:hanging="180"/>
+      </w:pPr>
+    </w:lvl>
+    <w:lvl w:ilvl="6" w:tplc="0409000F" w:tentative="1">
+      <w:start w:val="1"/>
+      <w:numFmt w:val="decimal"/>
+      <w:lvlText w:val="%7."/>
+      <w:lvlJc w:val="left"/>
+      <w:pPr>
+        <w:ind w:left="5040" w:hanging="360"/>
+      </w:pPr>
+    </w:lvl>
+    <w:lvl w:ilvl="7" w:tplc="04090019" w:tentative="1">
+      <w:start w:val="1"/>
+      <w:numFmt w:val="lowerLetter"/>
+      <w:lvlText w:val="%8."/>
+      <w:lvlJc w:val="left"/>
+      <w:pPr>
+        <w:ind w:left="5760" w:hanging="360"/>
+      </w:pPr>
+    </w:lvl>
+    <w:lvl w:ilvl="8" w:tplc="0409001B" w:tentative="1">
+      <w:start w:val="1"/>
+      <w:numFmt w:val="lowerRoman"/>
+      <w:lvlText w:val="%9."/>
+      <w:lvlJc w:val="right"/>
+      <w:pPr>
+        <w:ind w:left="6480" w:hanging="180"/>
+      </w:pPr>
+    </w:lvl>
+  </w:abstractNum>
+  <w:abstractNum w:abstractNumId="8" w15:restartNumberingAfterBreak="0">
+    <w:nsid w:val="4283632C"/>
+    <w:multiLevelType w:val="hybridMultilevel"/>
+    <w:tmpl w:val="32EA9062"/>
+    <w:lvl w:ilvl="0" w:tplc="4009000F">
+      <w:start w:val="1"/>
+      <w:numFmt w:val="decimal"/>
+      <w:lvlText w:val="%1."/>
+      <w:lvlJc w:val="left"/>
+      <w:pPr>
+        <w:ind w:left="720" w:hanging="360"/>
+      </w:pPr>
+      <w:rPr>
+        <w:rFonts w:hint="default"/>
+      </w:rPr>
+    </w:lvl>
+    <w:lvl w:ilvl="1" w:tplc="40090019" w:tentative="1">
+      <w:start w:val="1"/>
+      <w:numFmt w:val="lowerLetter"/>
+      <w:lvlText w:val="%2."/>
+      <w:lvlJc w:val="left"/>
+      <w:pPr>
+        <w:ind w:left="1440" w:hanging="360"/>
+      </w:pPr>
+    </w:lvl>
+    <w:lvl w:ilvl="2" w:tplc="4009001B" w:tentative="1">
+      <w:start w:val="1"/>
+      <w:numFmt w:val="lowerRoman"/>
+      <w:lvlText w:val="%3."/>
+      <w:lvlJc w:val="right"/>
+      <w:pPr>
+        <w:ind w:left="2160" w:hanging="180"/>
+      </w:pPr>
+    </w:lvl>
+    <w:lvl w:ilvl="3" w:tplc="4009000F" w:tentative="1">
+      <w:start w:val="1"/>
+      <w:numFmt w:val="decimal"/>
+      <w:lvlText w:val="%4."/>
+      <w:lvlJc w:val="left"/>
+      <w:pPr>
+        <w:ind w:left="2880" w:hanging="360"/>
+      </w:pPr>
+    </w:lvl>
+    <w:lvl w:ilvl="4" w:tplc="40090019" w:tentative="1">
+      <w:start w:val="1"/>
+      <w:numFmt w:val="lowerLetter"/>
+      <w:lvlText w:val="%5."/>
+      <w:lvlJc w:val="left"/>
+      <w:pPr>
+        <w:ind w:left="3600" w:hanging="360"/>
+      </w:pPr>
+    </w:lvl>
+    <w:lvl w:ilvl="5" w:tplc="4009001B" w:tentative="1">
+      <w:start w:val="1"/>
+      <w:numFmt w:val="lowerRoman"/>
+      <w:lvlText w:val="%6."/>
+      <w:lvlJc w:val="right"/>
+      <w:pPr>
+        <w:ind w:left="4320" w:hanging="180"/>
+      </w:pPr>
+    </w:lvl>
+    <w:lvl w:ilvl="6" w:tplc="4009000F" w:tentative="1">
+      <w:start w:val="1"/>
+      <w:numFmt w:val="decimal"/>
+      <w:lvlText w:val="%7."/>
+      <w:lvlJc w:val="left"/>
+      <w:pPr>
+        <w:ind w:left="5040" w:hanging="360"/>
+      </w:pPr>
+    </w:lvl>
+    <w:lvl w:ilvl="7" w:tplc="40090019" w:tentative="1">
+      <w:start w:val="1"/>
+      <w:numFmt w:val="lowerLetter"/>
+      <w:lvlText w:val="%8."/>
+      <w:lvlJc w:val="left"/>
+      <w:pPr>
+        <w:ind w:left="5760" w:hanging="360"/>
+      </w:pPr>
+    </w:lvl>
+    <w:lvl w:ilvl="8" w:tplc="4009001B" w:tentative="1">
+      <w:start w:val="1"/>
+      <w:numFmt w:val="lowerRoman"/>
+      <w:lvlText w:val="%9."/>
+      <w:lvlJc w:val="right"/>
+      <w:pPr>
+        <w:ind w:left="6480" w:hanging="180"/>
+      </w:pPr>
+    </w:lvl>
+  </w:abstractNum>
+  <w:abstractNum w:abstractNumId="9" w15:restartNumberingAfterBreak="0">
+    <w:nsid w:val="44901E3C"/>
+    <w:multiLevelType w:val="hybridMultilevel"/>
+    <w:tmpl w:val="1528F138"/>
+    <w:lvl w:ilvl="0" w:tplc="8D56A134">
+      <w:start w:val="1"/>
+      <w:numFmt w:val="lowerLetter"/>
+      <w:lvlText w:val="%1)"/>
+      <w:lvlJc w:val="left"/>
+      <w:pPr>
+        <w:ind w:left="786" w:hanging="360"/>
+      </w:pPr>
+      <w:rPr>
+        <w:rFonts w:ascii="Arial" w:eastAsia="Calibri" w:hAnsi="Arial" w:cs="Arial"/>
+      </w:rPr>
+    </w:lvl>
+    <w:lvl w:ilvl="1" w:tplc="40090019">
+      <w:start w:val="1"/>
+      <w:numFmt w:val="lowerLetter"/>
+      <w:lvlText w:val="%2."/>
+      <w:lvlJc w:val="left"/>
+      <w:pPr>
+        <w:ind w:left="1440" w:hanging="360"/>
+      </w:pPr>
+    </w:lvl>
+    <w:lvl w:ilvl="2" w:tplc="4009001B" w:tentative="1">
+      <w:start w:val="1"/>
+      <w:numFmt w:val="lowerRoman"/>
+      <w:lvlText w:val="%3."/>
+      <w:lvlJc w:val="right"/>
+      <w:pPr>
+        <w:ind w:left="2160" w:hanging="180"/>
+      </w:pPr>
+    </w:lvl>
+    <w:lvl w:ilvl="3" w:tplc="4009000F" w:tentative="1">
+      <w:start w:val="1"/>
+      <w:numFmt w:val="decimal"/>
+      <w:lvlText w:val="%4."/>
+      <w:lvlJc w:val="left"/>
+      <w:pPr>
+        <w:ind w:left="2880" w:hanging="360"/>
+      </w:pPr>
+    </w:lvl>
+    <w:lvl w:ilvl="4" w:tplc="40090019" w:tentative="1">
+      <w:start w:val="1"/>
+      <w:numFmt w:val="lowerLetter"/>
+      <w:lvlText w:val="%5."/>
+      <w:lvlJc w:val="left"/>
+      <w:pPr>
+        <w:ind w:left="3600" w:hanging="360"/>
+      </w:pPr>
+    </w:lvl>
+    <w:lvl w:ilvl="5" w:tplc="4009001B" w:tentative="1">
+      <w:start w:val="1"/>
+      <w:numFmt w:val="lowerRoman"/>
+      <w:lvlText w:val="%6."/>
+      <w:lvlJc w:val="right"/>
+      <w:pPr>
+        <w:ind w:left="4320" w:hanging="180"/>
+      </w:pPr>
+    </w:lvl>
+    <w:lvl w:ilvl="6" w:tplc="4009000F" w:tentative="1">
+      <w:start w:val="1"/>
+      <w:numFmt w:val="decimal"/>
+      <w:lvlText w:val="%7."/>
+      <w:lvlJc w:val="left"/>
+      <w:pPr>
+        <w:ind w:left="5040" w:hanging="360"/>
+      </w:pPr>
+    </w:lvl>
+    <w:lvl w:ilvl="7" w:tplc="40090019" w:tentative="1">
+      <w:start w:val="1"/>
+      <w:numFmt w:val="lowerLetter"/>
+      <w:lvlText w:val="%8."/>
+      <w:lvlJc w:val="left"/>
+      <w:pPr>
+        <w:ind w:left="5760" w:hanging="360"/>
+      </w:pPr>
+    </w:lvl>
+    <w:lvl w:ilvl="8" w:tplc="4009001B" w:tentative="1">
+      <w:start w:val="1"/>
+      <w:numFmt w:val="lowerRoman"/>
+      <w:lvlText w:val="%9."/>
+      <w:lvlJc w:val="right"/>
+      <w:pPr>
+        <w:ind w:left="6480" w:hanging="180"/>
+      </w:pPr>
+    </w:lvl>
+  </w:abstractNum>
+  <w:abstractNum w:abstractNumId="10" w15:restartNumberingAfterBreak="0">
+    <w:nsid w:val="4B7C1BB5"/>
+    <w:multiLevelType w:val="hybridMultilevel"/>
+    <w:tmpl w:val="529CBA20"/>
+    <w:lvl w:ilvl="0" w:tplc="04090017">
+      <w:start w:val="1"/>
+      <w:numFmt w:val="lowerLetter"/>
+      <w:lvlText w:val="%1)"/>
+      <w:lvlJc w:val="left"/>
+      <w:pPr>
+        <w:ind w:left="720" w:hanging="360"/>
+      </w:pPr>
+      <w:rPr>
+        <w:rFonts w:hint="default"/>
+      </w:rPr>
+    </w:lvl>
+    <w:lvl w:ilvl="1" w:tplc="04090019" w:tentative="1">
+      <w:start w:val="1"/>
+      <w:numFmt w:val="lowerLetter"/>
+      <w:lvlText w:val="%2."/>
+      <w:lvlJc w:val="left"/>
+      <w:pPr>
+        <w:ind w:left="1440" w:hanging="360"/>
+      </w:pPr>
+    </w:lvl>
+    <w:lvl w:ilvl="2" w:tplc="0409001B" w:tentative="1">
+      <w:start w:val="1"/>
+      <w:numFmt w:val="lowerRoman"/>
+      <w:lvlText w:val="%3."/>
+      <w:lvlJc w:val="right"/>
+      <w:pPr>
+        <w:ind w:left="2160" w:hanging="180"/>
+      </w:pPr>
+    </w:lvl>
+    <w:lvl w:ilvl="3" w:tplc="0409000F" w:tentative="1">
+      <w:start w:val="1"/>
+      <w:numFmt w:val="decimal"/>
+      <w:lvlText w:val="%4."/>
+      <w:lvlJc w:val="left"/>
+      <w:pPr>
+        <w:ind w:left="2880" w:hanging="360"/>
+      </w:pPr>
+    </w:lvl>
+    <w:lvl w:ilvl="4" w:tplc="04090019" w:tentative="1">
+      <w:start w:val="1"/>
+      <w:numFmt w:val="lowerLetter"/>
+      <w:lvlText w:val="%5."/>
+      <w:lvlJc w:val="left"/>
+      <w:pPr>
+        <w:ind w:left="3600" w:hanging="360"/>
+      </w:pPr>
+    </w:lvl>
+    <w:lvl w:ilvl="5" w:tplc="0409001B" w:tentative="1">
+      <w:start w:val="1"/>
+      <w:numFmt w:val="lowerRoman"/>
+      <w:lvlText w:val="%6."/>
+      <w:lvlJc w:val="right"/>
+      <w:pPr>
+        <w:ind w:left="4320" w:hanging="180"/>
+      </w:pPr>
+    </w:lvl>
+    <w:lvl w:ilvl="6" w:tplc="0409000F" w:tentative="1">
+      <w:start w:val="1"/>
+      <w:numFmt w:val="decimal"/>
+      <w:lvlText w:val="%7."/>
+      <w:lvlJc w:val="left"/>
+      <w:pPr>
+        <w:ind w:left="5040" w:hanging="360"/>
+      </w:pPr>
+    </w:lvl>
+    <w:lvl w:ilvl="7" w:tplc="04090019" w:tentative="1">
+      <w:start w:val="1"/>
+      <w:numFmt w:val="lowerLetter"/>
+      <w:lvlText w:val="%8."/>
+      <w:lvlJc w:val="left"/>
+      <w:pPr>
+        <w:ind w:left="5760" w:hanging="360"/>
+      </w:pPr>
+    </w:lvl>
+    <w:lvl w:ilvl="8" w:tplc="0409001B" w:tentative="1">
+      <w:start w:val="1"/>
+      <w:numFmt w:val="lowerRoman"/>
+      <w:lvlText w:val="%9."/>
+      <w:lvlJc w:val="right"/>
+      <w:pPr>
+        <w:ind w:left="6480" w:hanging="180"/>
+      </w:pPr>
+    </w:lvl>
+  </w:abstractNum>
+  <w:abstractNum w:abstractNumId="11" w15:restartNumberingAfterBreak="0">
+    <w:nsid w:val="4D0C0502"/>
     <w:multiLevelType w:val="multilevel"/>
-    <w:tmpl w:val="492CA1C8"/>
+    <w:tmpl w:val="BB0C5028"/>
     <w:lvl w:ilvl="0">
       <w:start w:val="1"/>
       <w:numFmt w:val="bullet"/>
@@ -5722,7 +6564,7 @@
     <w:lvl w:ilvl="1" w:tentative="1">
       <w:start w:val="1"/>
       <w:numFmt w:val="bullet"/>
-      <w:lvlText w:val=""/>
+      <w:lvlText w:val="o"/>
       <w:lvlJc w:val="left"/>
       <w:pPr>
         <w:tabs>
@@ -5731,14 +6573,14 @@
         <w:ind w:left="1440" w:hanging="360"/>
       </w:pPr>
       <w:rPr>
-        <w:rFonts w:ascii="Symbol" w:hAnsi="Symbol" w:hint="default"/>
+        <w:rFonts w:ascii="Courier New" w:hAnsi="Courier New" w:hint="default"/>
         <w:sz w:val="20"/>
       </w:rPr>
     </w:lvl>
     <w:lvl w:ilvl="2" w:tentative="1">
       <w:start w:val="1"/>
       <w:numFmt w:val="bullet"/>
-      <w:lvlText w:val=""/>
+      <w:lvlText w:val=""/>
       <w:lvlJc w:val="left"/>
       <w:pPr>
         <w:tabs>
@@ -5747,14 +6589,14 @@
         <w:ind w:left="2160" w:hanging="360"/>
       </w:pPr>
       <w:rPr>
-        <w:rFonts w:ascii="Symbol" w:hAnsi="Symbol" w:hint="default"/>
+        <w:rFonts w:ascii="Wingdings" w:hAnsi="Wingdings" w:hint="default"/>
         <w:sz w:val="20"/>
       </w:rPr>
     </w:lvl>
     <w:lvl w:ilvl="3" w:tentative="1">
       <w:start w:val="1"/>
       <w:numFmt w:val="bullet"/>
-      <w:lvlText w:val=""/>
+      <w:lvlText w:val=""/>
       <w:lvlJc w:val="left"/>
       <w:pPr>
         <w:tabs>
@@ -5763,14 +6605,14 @@
         <w:ind w:left="2880" w:hanging="360"/>
       </w:pPr>
       <w:rPr>
-        <w:rFonts w:ascii="Symbol" w:hAnsi="Symbol" w:hint="default"/>
+        <w:rFonts w:ascii="Wingdings" w:hAnsi="Wingdings" w:hint="default"/>
         <w:sz w:val="20"/>
       </w:rPr>
     </w:lvl>
     <w:lvl w:ilvl="4" w:tentative="1">
       <w:start w:val="1"/>
       <w:numFmt w:val="bullet"/>
-      <w:lvlText w:val=""/>
+      <w:lvlText w:val=""/>
       <w:lvlJc w:val="left"/>
       <w:pPr>
         <w:tabs>
@@ -5779,14 +6621,14 @@
         <w:ind w:left="3600" w:hanging="360"/>
       </w:pPr>
       <w:rPr>
-        <w:rFonts w:ascii="Symbol" w:hAnsi="Symbol" w:hint="default"/>
+        <w:rFonts w:ascii="Wingdings" w:hAnsi="Wingdings" w:hint="default"/>
         <w:sz w:val="20"/>
       </w:rPr>
     </w:lvl>
     <w:lvl w:ilvl="5" w:tentative="1">
       <w:start w:val="1"/>
       <w:numFmt w:val="bullet"/>
-      <w:lvlText w:val=""/>
+      <w:lvlText w:val=""/>
       <w:lvlJc w:val="left"/>
       <w:pPr>
         <w:tabs>
@@ -5795,14 +6637,14 @@
         <w:ind w:left="4320" w:hanging="360"/>
       </w:pPr>
       <w:rPr>
-        <w:rFonts w:ascii="Symbol" w:hAnsi="Symbol" w:hint="default"/>
+        <w:rFonts w:ascii="Wingdings" w:hAnsi="Wingdings" w:hint="default"/>
         <w:sz w:val="20"/>
       </w:rPr>
     </w:lvl>
     <w:lvl w:ilvl="6" w:tentative="1">
       <w:start w:val="1"/>
       <w:numFmt w:val="bullet"/>
-      <w:lvlText w:val=""/>
+      <w:lvlText w:val=""/>
       <w:lvlJc w:val="left"/>
       <w:pPr>
         <w:tabs>
@@ -5811,14 +6653,14 @@
         <w:ind w:left="5040" w:hanging="360"/>
       </w:pPr>
       <w:rPr>
-        <w:rFonts w:ascii="Symbol" w:hAnsi="Symbol" w:hint="default"/>
+        <w:rFonts w:ascii="Wingdings" w:hAnsi="Wingdings" w:hint="default"/>
         <w:sz w:val="20"/>
       </w:rPr>
     </w:lvl>
     <w:lvl w:ilvl="7" w:tentative="1">
       <w:start w:val="1"/>
       <w:numFmt w:val="bullet"/>
-      <w:lvlText w:val=""/>
+      <w:lvlText w:val=""/>
       <w:lvlJc w:val="left"/>
       <w:pPr>
         <w:tabs>
@@ -5827,14 +6669,14 @@
         <w:ind w:left="5760" w:hanging="360"/>
       </w:pPr>
       <w:rPr>
-        <w:rFonts w:ascii="Symbol" w:hAnsi="Symbol" w:hint="default"/>
+        <w:rFonts w:ascii="Wingdings" w:hAnsi="Wingdings" w:hint="default"/>
         <w:sz w:val="20"/>
       </w:rPr>
     </w:lvl>
     <w:lvl w:ilvl="8" w:tentative="1">
       <w:start w:val="1"/>
       <w:numFmt w:val="bullet"/>
-      <w:lvlText w:val=""/>
+      <w:lvlText w:val=""/>
       <w:lvlJc w:val="left"/>
       <w:pPr>
         <w:tabs>
@@ -5843,12 +6685,511 @@
         <w:ind w:left="6480" w:hanging="360"/>
       </w:pPr>
       <w:rPr>
+        <w:rFonts w:ascii="Wingdings" w:hAnsi="Wingdings" w:hint="default"/>
+        <w:sz w:val="20"/>
+      </w:rPr>
+    </w:lvl>
+  </w:abstractNum>
+  <w:abstractNum w:abstractNumId="12" w15:restartNumberingAfterBreak="0">
+    <w:nsid w:val="5FF21C48"/>
+    <w:multiLevelType w:val="hybridMultilevel"/>
+    <w:tmpl w:val="383CDA82"/>
+    <w:lvl w:ilvl="0" w:tplc="40090015">
+      <w:start w:val="1"/>
+      <w:numFmt w:val="upperLetter"/>
+      <w:lvlText w:val="%1."/>
+      <w:lvlJc w:val="left"/>
+      <w:pPr>
+        <w:ind w:left="720" w:hanging="360"/>
+      </w:pPr>
+      <w:rPr>
+        <w:rFonts w:hint="default"/>
+      </w:rPr>
+    </w:lvl>
+    <w:lvl w:ilvl="1" w:tplc="40090019" w:tentative="1">
+      <w:start w:val="1"/>
+      <w:numFmt w:val="lowerLetter"/>
+      <w:lvlText w:val="%2."/>
+      <w:lvlJc w:val="left"/>
+      <w:pPr>
+        <w:ind w:left="1440" w:hanging="360"/>
+      </w:pPr>
+    </w:lvl>
+    <w:lvl w:ilvl="2" w:tplc="4009001B" w:tentative="1">
+      <w:start w:val="1"/>
+      <w:numFmt w:val="lowerRoman"/>
+      <w:lvlText w:val="%3."/>
+      <w:lvlJc w:val="right"/>
+      <w:pPr>
+        <w:ind w:left="2160" w:hanging="180"/>
+      </w:pPr>
+    </w:lvl>
+    <w:lvl w:ilvl="3" w:tplc="4009000F" w:tentative="1">
+      <w:start w:val="1"/>
+      <w:numFmt w:val="decimal"/>
+      <w:lvlText w:val="%4."/>
+      <w:lvlJc w:val="left"/>
+      <w:pPr>
+        <w:ind w:left="2880" w:hanging="360"/>
+      </w:pPr>
+    </w:lvl>
+    <w:lvl w:ilvl="4" w:tplc="40090019" w:tentative="1">
+      <w:start w:val="1"/>
+      <w:numFmt w:val="lowerLetter"/>
+      <w:lvlText w:val="%5."/>
+      <w:lvlJc w:val="left"/>
+      <w:pPr>
+        <w:ind w:left="3600" w:hanging="360"/>
+      </w:pPr>
+    </w:lvl>
+    <w:lvl w:ilvl="5" w:tplc="4009001B" w:tentative="1">
+      <w:start w:val="1"/>
+      <w:numFmt w:val="lowerRoman"/>
+      <w:lvlText w:val="%6."/>
+      <w:lvlJc w:val="right"/>
+      <w:pPr>
+        <w:ind w:left="4320" w:hanging="180"/>
+      </w:pPr>
+    </w:lvl>
+    <w:lvl w:ilvl="6" w:tplc="4009000F" w:tentative="1">
+      <w:start w:val="1"/>
+      <w:numFmt w:val="decimal"/>
+      <w:lvlText w:val="%7."/>
+      <w:lvlJc w:val="left"/>
+      <w:pPr>
+        <w:ind w:left="5040" w:hanging="360"/>
+      </w:pPr>
+    </w:lvl>
+    <w:lvl w:ilvl="7" w:tplc="40090019" w:tentative="1">
+      <w:start w:val="1"/>
+      <w:numFmt w:val="lowerLetter"/>
+      <w:lvlText w:val="%8."/>
+      <w:lvlJc w:val="left"/>
+      <w:pPr>
+        <w:ind w:left="5760" w:hanging="360"/>
+      </w:pPr>
+    </w:lvl>
+    <w:lvl w:ilvl="8" w:tplc="4009001B" w:tentative="1">
+      <w:start w:val="1"/>
+      <w:numFmt w:val="lowerRoman"/>
+      <w:lvlText w:val="%9."/>
+      <w:lvlJc w:val="right"/>
+      <w:pPr>
+        <w:ind w:left="6480" w:hanging="180"/>
+      </w:pPr>
+    </w:lvl>
+  </w:abstractNum>
+  <w:abstractNum w:abstractNumId="13" w15:restartNumberingAfterBreak="0">
+    <w:nsid w:val="61CC2222"/>
+    <w:multiLevelType w:val="hybridMultilevel"/>
+    <w:tmpl w:val="55BC69C6"/>
+    <w:lvl w:ilvl="0" w:tplc="4009000F">
+      <w:start w:val="1"/>
+      <w:numFmt w:val="decimal"/>
+      <w:lvlText w:val="%1."/>
+      <w:lvlJc w:val="left"/>
+      <w:pPr>
+        <w:ind w:left="720" w:hanging="360"/>
+      </w:pPr>
+    </w:lvl>
+    <w:lvl w:ilvl="1" w:tplc="40090019" w:tentative="1">
+      <w:start w:val="1"/>
+      <w:numFmt w:val="lowerLetter"/>
+      <w:lvlText w:val="%2."/>
+      <w:lvlJc w:val="left"/>
+      <w:pPr>
+        <w:ind w:left="1440" w:hanging="360"/>
+      </w:pPr>
+    </w:lvl>
+    <w:lvl w:ilvl="2" w:tplc="4009001B" w:tentative="1">
+      <w:start w:val="1"/>
+      <w:numFmt w:val="lowerRoman"/>
+      <w:lvlText w:val="%3."/>
+      <w:lvlJc w:val="right"/>
+      <w:pPr>
+        <w:ind w:left="2160" w:hanging="180"/>
+      </w:pPr>
+    </w:lvl>
+    <w:lvl w:ilvl="3" w:tplc="4009000F" w:tentative="1">
+      <w:start w:val="1"/>
+      <w:numFmt w:val="decimal"/>
+      <w:lvlText w:val="%4."/>
+      <w:lvlJc w:val="left"/>
+      <w:pPr>
+        <w:ind w:left="2880" w:hanging="360"/>
+      </w:pPr>
+    </w:lvl>
+    <w:lvl w:ilvl="4" w:tplc="40090019" w:tentative="1">
+      <w:start w:val="1"/>
+      <w:numFmt w:val="lowerLetter"/>
+      <w:lvlText w:val="%5."/>
+      <w:lvlJc w:val="left"/>
+      <w:pPr>
+        <w:ind w:left="3600" w:hanging="360"/>
+      </w:pPr>
+    </w:lvl>
+    <w:lvl w:ilvl="5" w:tplc="4009001B" w:tentative="1">
+      <w:start w:val="1"/>
+      <w:numFmt w:val="lowerRoman"/>
+      <w:lvlText w:val="%6."/>
+      <w:lvlJc w:val="right"/>
+      <w:pPr>
+        <w:ind w:left="4320" w:hanging="180"/>
+      </w:pPr>
+    </w:lvl>
+    <w:lvl w:ilvl="6" w:tplc="4009000F" w:tentative="1">
+      <w:start w:val="1"/>
+      <w:numFmt w:val="decimal"/>
+      <w:lvlText w:val="%7."/>
+      <w:lvlJc w:val="left"/>
+      <w:pPr>
+        <w:ind w:left="5040" w:hanging="360"/>
+      </w:pPr>
+    </w:lvl>
+    <w:lvl w:ilvl="7" w:tplc="40090019" w:tentative="1">
+      <w:start w:val="1"/>
+      <w:numFmt w:val="lowerLetter"/>
+      <w:lvlText w:val="%8."/>
+      <w:lvlJc w:val="left"/>
+      <w:pPr>
+        <w:ind w:left="5760" w:hanging="360"/>
+      </w:pPr>
+    </w:lvl>
+    <w:lvl w:ilvl="8" w:tplc="4009001B" w:tentative="1">
+      <w:start w:val="1"/>
+      <w:numFmt w:val="lowerRoman"/>
+      <w:lvlText w:val="%9."/>
+      <w:lvlJc w:val="right"/>
+      <w:pPr>
+        <w:ind w:left="6480" w:hanging="180"/>
+      </w:pPr>
+    </w:lvl>
+  </w:abstractNum>
+  <w:abstractNum w:abstractNumId="14" w15:restartNumberingAfterBreak="0">
+    <w:nsid w:val="66A634D8"/>
+    <w:multiLevelType w:val="hybridMultilevel"/>
+    <w:tmpl w:val="E2D81EB0"/>
+    <w:lvl w:ilvl="0" w:tplc="04090017">
+      <w:start w:val="1"/>
+      <w:numFmt w:val="lowerLetter"/>
+      <w:lvlText w:val="%1)"/>
+      <w:lvlJc w:val="left"/>
+      <w:pPr>
+        <w:ind w:left="720" w:hanging="360"/>
+      </w:pPr>
+    </w:lvl>
+    <w:lvl w:ilvl="1" w:tplc="04090019" w:tentative="1">
+      <w:start w:val="1"/>
+      <w:numFmt w:val="lowerLetter"/>
+      <w:lvlText w:val="%2."/>
+      <w:lvlJc w:val="left"/>
+      <w:pPr>
+        <w:ind w:left="1440" w:hanging="360"/>
+      </w:pPr>
+    </w:lvl>
+    <w:lvl w:ilvl="2" w:tplc="0409001B" w:tentative="1">
+      <w:start w:val="1"/>
+      <w:numFmt w:val="lowerRoman"/>
+      <w:lvlText w:val="%3."/>
+      <w:lvlJc w:val="right"/>
+      <w:pPr>
+        <w:ind w:left="2160" w:hanging="180"/>
+      </w:pPr>
+    </w:lvl>
+    <w:lvl w:ilvl="3" w:tplc="0409000F" w:tentative="1">
+      <w:start w:val="1"/>
+      <w:numFmt w:val="decimal"/>
+      <w:lvlText w:val="%4."/>
+      <w:lvlJc w:val="left"/>
+      <w:pPr>
+        <w:ind w:left="2880" w:hanging="360"/>
+      </w:pPr>
+    </w:lvl>
+    <w:lvl w:ilvl="4" w:tplc="04090019" w:tentative="1">
+      <w:start w:val="1"/>
+      <w:numFmt w:val="lowerLetter"/>
+      <w:lvlText w:val="%5."/>
+      <w:lvlJc w:val="left"/>
+      <w:pPr>
+        <w:ind w:left="3600" w:hanging="360"/>
+      </w:pPr>
+    </w:lvl>
+    <w:lvl w:ilvl="5" w:tplc="0409001B" w:tentative="1">
+      <w:start w:val="1"/>
+      <w:numFmt w:val="lowerRoman"/>
+      <w:lvlText w:val="%6."/>
+      <w:lvlJc w:val="right"/>
+      <w:pPr>
+        <w:ind w:left="4320" w:hanging="180"/>
+      </w:pPr>
+    </w:lvl>
+    <w:lvl w:ilvl="6" w:tplc="0409000F" w:tentative="1">
+      <w:start w:val="1"/>
+      <w:numFmt w:val="decimal"/>
+      <w:lvlText w:val="%7."/>
+      <w:lvlJc w:val="left"/>
+      <w:pPr>
+        <w:ind w:left="5040" w:hanging="360"/>
+      </w:pPr>
+    </w:lvl>
+    <w:lvl w:ilvl="7" w:tplc="04090019" w:tentative="1">
+      <w:start w:val="1"/>
+      <w:numFmt w:val="lowerLetter"/>
+      <w:lvlText w:val="%8."/>
+      <w:lvlJc w:val="left"/>
+      <w:pPr>
+        <w:ind w:left="5760" w:hanging="360"/>
+      </w:pPr>
+    </w:lvl>
+    <w:lvl w:ilvl="8" w:tplc="0409001B" w:tentative="1">
+      <w:start w:val="1"/>
+      <w:numFmt w:val="lowerRoman"/>
+      <w:lvlText w:val="%9."/>
+      <w:lvlJc w:val="right"/>
+      <w:pPr>
+        <w:ind w:left="6480" w:hanging="180"/>
+      </w:pPr>
+    </w:lvl>
+  </w:abstractNum>
+  <w:abstractNum w:abstractNumId="15" w15:restartNumberingAfterBreak="0">
+    <w:nsid w:val="6E2F3D5B"/>
+    <w:multiLevelType w:val="hybridMultilevel"/>
+    <w:tmpl w:val="7ACC5F0C"/>
+    <w:lvl w:ilvl="0" w:tplc="0409000F">
+      <w:start w:val="1"/>
+      <w:numFmt w:val="decimal"/>
+      <w:lvlText w:val="%1."/>
+      <w:lvlJc w:val="left"/>
+      <w:pPr>
+        <w:ind w:left="720" w:hanging="360"/>
+      </w:pPr>
+      <w:rPr>
+        <w:rFonts w:hint="default"/>
+      </w:rPr>
+    </w:lvl>
+    <w:lvl w:ilvl="1" w:tplc="04090019" w:tentative="1">
+      <w:start w:val="1"/>
+      <w:numFmt w:val="lowerLetter"/>
+      <w:lvlText w:val="%2."/>
+      <w:lvlJc w:val="left"/>
+      <w:pPr>
+        <w:ind w:left="1440" w:hanging="360"/>
+      </w:pPr>
+    </w:lvl>
+    <w:lvl w:ilvl="2" w:tplc="0409001B" w:tentative="1">
+      <w:start w:val="1"/>
+      <w:numFmt w:val="lowerRoman"/>
+      <w:lvlText w:val="%3."/>
+      <w:lvlJc w:val="right"/>
+      <w:pPr>
+        <w:ind w:left="2160" w:hanging="180"/>
+      </w:pPr>
+    </w:lvl>
+    <w:lvl w:ilvl="3" w:tplc="0409000F" w:tentative="1">
+      <w:start w:val="1"/>
+      <w:numFmt w:val="decimal"/>
+      <w:lvlText w:val="%4."/>
+      <w:lvlJc w:val="left"/>
+      <w:pPr>
+        <w:ind w:left="2880" w:hanging="360"/>
+      </w:pPr>
+    </w:lvl>
+    <w:lvl w:ilvl="4" w:tplc="04090019" w:tentative="1">
+      <w:start w:val="1"/>
+      <w:numFmt w:val="lowerLetter"/>
+      <w:lvlText w:val="%5."/>
+      <w:lvlJc w:val="left"/>
+      <w:pPr>
+        <w:ind w:left="3600" w:hanging="360"/>
+      </w:pPr>
+    </w:lvl>
+    <w:lvl w:ilvl="5" w:tplc="0409001B" w:tentative="1">
+      <w:start w:val="1"/>
+      <w:numFmt w:val="lowerRoman"/>
+      <w:lvlText w:val="%6."/>
+      <w:lvlJc w:val="right"/>
+      <w:pPr>
+        <w:ind w:left="4320" w:hanging="180"/>
+      </w:pPr>
+    </w:lvl>
+    <w:lvl w:ilvl="6" w:tplc="0409000F" w:tentative="1">
+      <w:start w:val="1"/>
+      <w:numFmt w:val="decimal"/>
+      <w:lvlText w:val="%7."/>
+      <w:lvlJc w:val="left"/>
+      <w:pPr>
+        <w:ind w:left="5040" w:hanging="360"/>
+      </w:pPr>
+    </w:lvl>
+    <w:lvl w:ilvl="7" w:tplc="04090019" w:tentative="1">
+      <w:start w:val="1"/>
+      <w:numFmt w:val="lowerLetter"/>
+      <w:lvlText w:val="%8."/>
+      <w:lvlJc w:val="left"/>
+      <w:pPr>
+        <w:ind w:left="5760" w:hanging="360"/>
+      </w:pPr>
+    </w:lvl>
+    <w:lvl w:ilvl="8" w:tplc="0409001B" w:tentative="1">
+      <w:start w:val="1"/>
+      <w:numFmt w:val="lowerRoman"/>
+      <w:lvlText w:val="%9."/>
+      <w:lvlJc w:val="right"/>
+      <w:pPr>
+        <w:ind w:left="6480" w:hanging="180"/>
+      </w:pPr>
+    </w:lvl>
+  </w:abstractNum>
+  <w:abstractNum w:abstractNumId="16" w15:restartNumberingAfterBreak="0">
+    <w:nsid w:val="712B4B5A"/>
+    <w:multiLevelType w:val="multilevel"/>
+    <w:tmpl w:val="FD6A7CDE"/>
+    <w:lvl w:ilvl="0">
+      <w:start w:val="1"/>
+      <w:numFmt w:val="bullet"/>
+      <w:lvlText w:val=""/>
+      <w:lvlJc w:val="left"/>
+      <w:pPr>
+        <w:tabs>
+          <w:tab w:val="num" w:pos="720"/>
+        </w:tabs>
+        <w:ind w:left="720" w:hanging="360"/>
+      </w:pPr>
+      <w:rPr>
         <w:rFonts w:ascii="Symbol" w:hAnsi="Symbol" w:hint="default"/>
         <w:sz w:val="20"/>
       </w:rPr>
     </w:lvl>
+    <w:lvl w:ilvl="1" w:tentative="1">
+      <w:start w:val="1"/>
+      <w:numFmt w:val="bullet"/>
+      <w:lvlText w:val="o"/>
+      <w:lvlJc w:val="left"/>
+      <w:pPr>
+        <w:tabs>
+          <w:tab w:val="num" w:pos="1440"/>
+        </w:tabs>
+        <w:ind w:left="1440" w:hanging="360"/>
+      </w:pPr>
+      <w:rPr>
+        <w:rFonts w:ascii="Courier New" w:hAnsi="Courier New" w:hint="default"/>
+        <w:sz w:val="20"/>
+      </w:rPr>
+    </w:lvl>
+    <w:lvl w:ilvl="2" w:tentative="1">
+      <w:start w:val="1"/>
+      <w:numFmt w:val="bullet"/>
+      <w:lvlText w:val=""/>
+      <w:lvlJc w:val="left"/>
+      <w:pPr>
+        <w:tabs>
+          <w:tab w:val="num" w:pos="2160"/>
+        </w:tabs>
+        <w:ind w:left="2160" w:hanging="360"/>
+      </w:pPr>
+      <w:rPr>
+        <w:rFonts w:ascii="Wingdings" w:hAnsi="Wingdings" w:hint="default"/>
+        <w:sz w:val="20"/>
+      </w:rPr>
+    </w:lvl>
+    <w:lvl w:ilvl="3" w:tentative="1">
+      <w:start w:val="1"/>
+      <w:numFmt w:val="bullet"/>
+      <w:lvlText w:val=""/>
+      <w:lvlJc w:val="left"/>
+      <w:pPr>
+        <w:tabs>
+          <w:tab w:val="num" w:pos="2880"/>
+        </w:tabs>
+        <w:ind w:left="2880" w:hanging="360"/>
+      </w:pPr>
+      <w:rPr>
+        <w:rFonts w:ascii="Wingdings" w:hAnsi="Wingdings" w:hint="default"/>
+        <w:sz w:val="20"/>
+      </w:rPr>
+    </w:lvl>
+    <w:lvl w:ilvl="4" w:tentative="1">
+      <w:start w:val="1"/>
+      <w:numFmt w:val="bullet"/>
+      <w:lvlText w:val=""/>
+      <w:lvlJc w:val="left"/>
+      <w:pPr>
+        <w:tabs>
+          <w:tab w:val="num" w:pos="3600"/>
+        </w:tabs>
+        <w:ind w:left="3600" w:hanging="360"/>
+      </w:pPr>
+      <w:rPr>
+        <w:rFonts w:ascii="Wingdings" w:hAnsi="Wingdings" w:hint="default"/>
+        <w:sz w:val="20"/>
+      </w:rPr>
+    </w:lvl>
+    <w:lvl w:ilvl="5" w:tentative="1">
+      <w:start w:val="1"/>
+      <w:numFmt w:val="bullet"/>
+      <w:lvlText w:val=""/>
+      <w:lvlJc w:val="left"/>
+      <w:pPr>
+        <w:tabs>
+          <w:tab w:val="num" w:pos="4320"/>
+        </w:tabs>
+        <w:ind w:left="4320" w:hanging="360"/>
+      </w:pPr>
+      <w:rPr>
+        <w:rFonts w:ascii="Wingdings" w:hAnsi="Wingdings" w:hint="default"/>
+        <w:sz w:val="20"/>
+      </w:rPr>
+    </w:lvl>
+    <w:lvl w:ilvl="6" w:tentative="1">
+      <w:start w:val="1"/>
+      <w:numFmt w:val="bullet"/>
+      <w:lvlText w:val=""/>
+      <w:lvlJc w:val="left"/>
+      <w:pPr>
+        <w:tabs>
+          <w:tab w:val="num" w:pos="5040"/>
+        </w:tabs>
+        <w:ind w:left="5040" w:hanging="360"/>
+      </w:pPr>
+      <w:rPr>
+        <w:rFonts w:ascii="Wingdings" w:hAnsi="Wingdings" w:hint="default"/>
+        <w:sz w:val="20"/>
+      </w:rPr>
+    </w:lvl>
+    <w:lvl w:ilvl="7" w:tentative="1">
+      <w:start w:val="1"/>
+      <w:numFmt w:val="bullet"/>
+      <w:lvlText w:val=""/>
+      <w:lvlJc w:val="left"/>
+      <w:pPr>
+        <w:tabs>
+          <w:tab w:val="num" w:pos="5760"/>
+        </w:tabs>
+        <w:ind w:left="5760" w:hanging="360"/>
+      </w:pPr>
+      <w:rPr>
+        <w:rFonts w:ascii="Wingdings" w:hAnsi="Wingdings" w:hint="default"/>
+        <w:sz w:val="20"/>
+      </w:rPr>
+    </w:lvl>
+    <w:lvl w:ilvl="8" w:tentative="1">
+      <w:start w:val="1"/>
+      <w:numFmt w:val="bullet"/>
+      <w:lvlText w:val=""/>
+      <w:lvlJc w:val="left"/>
+      <w:pPr>
+        <w:tabs>
+          <w:tab w:val="num" w:pos="6480"/>
+        </w:tabs>
+        <w:ind w:left="6480" w:hanging="360"/>
+      </w:pPr>
+      <w:rPr>
+        <w:rFonts w:ascii="Wingdings" w:hAnsi="Wingdings" w:hint="default"/>
+        <w:sz w:val="20"/>
+      </w:rPr>
+    </w:lvl>
   </w:abstractNum>
-  <w:abstractNum w:abstractNumId="4" w15:restartNumberingAfterBreak="0">
+  <w:abstractNum w:abstractNumId="17" w15:restartNumberingAfterBreak="0">
     <w:nsid w:val="72CB2976"/>
     <w:multiLevelType w:val="hybridMultilevel"/>
     <w:tmpl w:val="A66E651E"/>
@@ -5961,202 +7302,175 @@
       </w:rPr>
     </w:lvl>
   </w:abstractNum>
-  <w:abstractNum w:abstractNumId="5" w15:restartNumberingAfterBreak="0">
-    <w:nsid w:val="78104715"/>
+  <w:abstractNum w:abstractNumId="18" w15:restartNumberingAfterBreak="0">
+    <w:nsid w:val="72D10656"/>
     <w:multiLevelType w:val="hybridMultilevel"/>
-    <w:tmpl w:val="EDEC115E"/>
-    <w:lvl w:ilvl="0" w:tplc="948EB604">
-      <w:start w:val="1"/>
-      <w:numFmt w:val="decimal"/>
-      <w:lvlText w:val="%1."/>
+    <w:tmpl w:val="8E5E1430"/>
+    <w:lvl w:ilvl="0" w:tplc="04090001">
+      <w:start w:val="1"/>
+      <w:numFmt w:val="bullet"/>
+      <w:lvlText w:val=""/>
       <w:lvlJc w:val="left"/>
       <w:pPr>
         <w:ind w:left="720" w:hanging="360"/>
       </w:pPr>
       <w:rPr>
-        <w:b w:val="0"/>
-        <w:bCs w:val="0"/>
+        <w:rFonts w:ascii="Symbol" w:hAnsi="Symbol" w:hint="default"/>
       </w:rPr>
     </w:lvl>
-    <w:lvl w:ilvl="1" w:tplc="04090019" w:tentative="1">
-      <w:start w:val="1"/>
-      <w:numFmt w:val="lowerLetter"/>
-      <w:lvlText w:val="%2."/>
+    <w:lvl w:ilvl="1" w:tplc="04090003" w:tentative="1">
+      <w:start w:val="1"/>
+      <w:numFmt w:val="bullet"/>
+      <w:lvlText w:val="o"/>
       <w:lvlJc w:val="left"/>
       <w:pPr>
         <w:ind w:left="1440" w:hanging="360"/>
       </w:pPr>
-    </w:lvl>
-    <w:lvl w:ilvl="2" w:tplc="0409001B" w:tentative="1">
-      <w:start w:val="1"/>
-      <w:numFmt w:val="lowerRoman"/>
-      <w:lvlText w:val="%3."/>
-      <w:lvlJc w:val="right"/>
-      <w:pPr>
-        <w:ind w:left="2160" w:hanging="180"/>
-      </w:pPr>
-    </w:lvl>
-    <w:lvl w:ilvl="3" w:tplc="0409000F" w:tentative="1">
-      <w:start w:val="1"/>
-      <w:numFmt w:val="decimal"/>
-      <w:lvlText w:val="%4."/>
+      <w:rPr>
+        <w:rFonts w:ascii="Courier New" w:hAnsi="Courier New" w:cs="Courier New" w:hint="default"/>
+      </w:rPr>
+    </w:lvl>
+    <w:lvl w:ilvl="2" w:tplc="04090005" w:tentative="1">
+      <w:start w:val="1"/>
+      <w:numFmt w:val="bullet"/>
+      <w:lvlText w:val=""/>
+      <w:lvlJc w:val="left"/>
+      <w:pPr>
+        <w:ind w:left="2160" w:hanging="360"/>
+      </w:pPr>
+      <w:rPr>
+        <w:rFonts w:ascii="Wingdings" w:hAnsi="Wingdings" w:hint="default"/>
+      </w:rPr>
+    </w:lvl>
+    <w:lvl w:ilvl="3" w:tplc="04090001" w:tentative="1">
+      <w:start w:val="1"/>
+      <w:numFmt w:val="bullet"/>
+      <w:lvlText w:val=""/>
       <w:lvlJc w:val="left"/>
       <w:pPr>
         <w:ind w:left="2880" w:hanging="360"/>
       </w:pPr>
-    </w:lvl>
-    <w:lvl w:ilvl="4" w:tplc="04090019" w:tentative="1">
-      <w:start w:val="1"/>
-      <w:numFmt w:val="lowerLetter"/>
-      <w:lvlText w:val="%5."/>
+      <w:rPr>
+        <w:rFonts w:ascii="Symbol" w:hAnsi="Symbol" w:hint="default"/>
+      </w:rPr>
+    </w:lvl>
+    <w:lvl w:ilvl="4" w:tplc="04090003" w:tentative="1">
+      <w:start w:val="1"/>
+      <w:numFmt w:val="bullet"/>
+      <w:lvlText w:val="o"/>
       <w:lvlJc w:val="left"/>
       <w:pPr>
         <w:ind w:left="3600" w:hanging="360"/>
       </w:pPr>
-    </w:lvl>
-    <w:lvl w:ilvl="5" w:tplc="0409001B" w:tentative="1">
-      <w:start w:val="1"/>
-      <w:numFmt w:val="lowerRoman"/>
-      <w:lvlText w:val="%6."/>
-      <w:lvlJc w:val="right"/>
-      <w:pPr>
-        <w:ind w:left="4320" w:hanging="180"/>
-      </w:pPr>
-    </w:lvl>
-    <w:lvl w:ilvl="6" w:tplc="0409000F" w:tentative="1">
-      <w:start w:val="1"/>
-      <w:numFmt w:val="decimal"/>
-      <w:lvlText w:val="%7."/>
+      <w:rPr>
+        <w:rFonts w:ascii="Courier New" w:hAnsi="Courier New" w:cs="Courier New" w:hint="default"/>
+      </w:rPr>
+    </w:lvl>
+    <w:lvl w:ilvl="5" w:tplc="04090005" w:tentative="1">
+      <w:start w:val="1"/>
+      <w:numFmt w:val="bullet"/>
+      <w:lvlText w:val=""/>
+      <w:lvlJc w:val="left"/>
+      <w:pPr>
+        <w:ind w:left="4320" w:hanging="360"/>
+      </w:pPr>
+      <w:rPr>
+        <w:rFonts w:ascii="Wingdings" w:hAnsi="Wingdings" w:hint="default"/>
+      </w:rPr>
+    </w:lvl>
+    <w:lvl w:ilvl="6" w:tplc="04090001" w:tentative="1">
+      <w:start w:val="1"/>
+      <w:numFmt w:val="bullet"/>
+      <w:lvlText w:val=""/>
       <w:lvlJc w:val="left"/>
       <w:pPr>
         <w:ind w:left="5040" w:hanging="360"/>
       </w:pPr>
-    </w:lvl>
-    <w:lvl w:ilvl="7" w:tplc="04090019" w:tentative="1">
-      <w:start w:val="1"/>
-      <w:numFmt w:val="lowerLetter"/>
-      <w:lvlText w:val="%8."/>
+      <w:rPr>
+        <w:rFonts w:ascii="Symbol" w:hAnsi="Symbol" w:hint="default"/>
+      </w:rPr>
+    </w:lvl>
+    <w:lvl w:ilvl="7" w:tplc="04090003" w:tentative="1">
+      <w:start w:val="1"/>
+      <w:numFmt w:val="bullet"/>
+      <w:lvlText w:val="o"/>
       <w:lvlJc w:val="left"/>
       <w:pPr>
         <w:ind w:left="5760" w:hanging="360"/>
       </w:pPr>
-    </w:lvl>
-    <w:lvl w:ilvl="8" w:tplc="0409001B" w:tentative="1">
-      <w:start w:val="1"/>
-      <w:numFmt w:val="lowerRoman"/>
-      <w:lvlText w:val="%9."/>
-      <w:lvlJc w:val="right"/>
-      <w:pPr>
-        <w:ind w:left="6480" w:hanging="180"/>
-      </w:pPr>
+      <w:rPr>
+        <w:rFonts w:ascii="Courier New" w:hAnsi="Courier New" w:cs="Courier New" w:hint="default"/>
+      </w:rPr>
+    </w:lvl>
+    <w:lvl w:ilvl="8" w:tplc="04090005" w:tentative="1">
+      <w:start w:val="1"/>
+      <w:numFmt w:val="bullet"/>
+      <w:lvlText w:val=""/>
+      <w:lvlJc w:val="left"/>
+      <w:pPr>
+        <w:ind w:left="6480" w:hanging="360"/>
+      </w:pPr>
+      <w:rPr>
+        <w:rFonts w:ascii="Wingdings" w:hAnsi="Wingdings" w:hint="default"/>
+      </w:rPr>
     </w:lvl>
   </w:abstractNum>
-  <w:abstractNum w:abstractNumId="6" w15:restartNumberingAfterBreak="0">
-    <w:nsid w:val="7DCB3AAD"/>
-    <w:multiLevelType w:val="hybridMultilevel"/>
-    <w:tmpl w:val="8B62C78E"/>
-    <w:lvl w:ilvl="0" w:tplc="0409000F">
-      <w:start w:val="1"/>
-      <w:numFmt w:val="decimal"/>
-      <w:lvlText w:val="%1."/>
-      <w:lvlJc w:val="left"/>
-      <w:pPr>
-        <w:ind w:left="720" w:hanging="360"/>
-      </w:pPr>
-    </w:lvl>
-    <w:lvl w:ilvl="1" w:tplc="04090019" w:tentative="1">
-      <w:start w:val="1"/>
-      <w:numFmt w:val="lowerLetter"/>
-      <w:lvlText w:val="%2."/>
-      <w:lvlJc w:val="left"/>
-      <w:pPr>
-        <w:ind w:left="1440" w:hanging="360"/>
-      </w:pPr>
-    </w:lvl>
-    <w:lvl w:ilvl="2" w:tplc="0409001B" w:tentative="1">
-      <w:start w:val="1"/>
-      <w:numFmt w:val="lowerRoman"/>
-      <w:lvlText w:val="%3."/>
-      <w:lvlJc w:val="right"/>
-      <w:pPr>
-        <w:ind w:left="2160" w:hanging="180"/>
-      </w:pPr>
-    </w:lvl>
-    <w:lvl w:ilvl="3" w:tplc="0409000F" w:tentative="1">
-      <w:start w:val="1"/>
-      <w:numFmt w:val="decimal"/>
-      <w:lvlText w:val="%4."/>
-      <w:lvlJc w:val="left"/>
-      <w:pPr>
-        <w:ind w:left="2880" w:hanging="360"/>
-      </w:pPr>
-    </w:lvl>
-    <w:lvl w:ilvl="4" w:tplc="04090019" w:tentative="1">
-      <w:start w:val="1"/>
-      <w:numFmt w:val="lowerLetter"/>
-      <w:lvlText w:val="%5."/>
-      <w:lvlJc w:val="left"/>
-      <w:pPr>
-        <w:ind w:left="3600" w:hanging="360"/>
-      </w:pPr>
-    </w:lvl>
-    <w:lvl w:ilvl="5" w:tplc="0409001B" w:tentative="1">
-      <w:start w:val="1"/>
-      <w:numFmt w:val="lowerRoman"/>
-      <w:lvlText w:val="%6."/>
-      <w:lvlJc w:val="right"/>
-      <w:pPr>
-        <w:ind w:left="4320" w:hanging="180"/>
-      </w:pPr>
-    </w:lvl>
-    <w:lvl w:ilvl="6" w:tplc="0409000F" w:tentative="1">
-      <w:start w:val="1"/>
-      <w:numFmt w:val="decimal"/>
-      <w:lvlText w:val="%7."/>
-      <w:lvlJc w:val="left"/>
-      <w:pPr>
-        <w:ind w:left="5040" w:hanging="360"/>
-      </w:pPr>
-    </w:lvl>
-    <w:lvl w:ilvl="7" w:tplc="04090019" w:tentative="1">
-      <w:start w:val="1"/>
-      <w:numFmt w:val="lowerLetter"/>
-      <w:lvlText w:val="%8."/>
-      <w:lvlJc w:val="left"/>
-      <w:pPr>
-        <w:ind w:left="5760" w:hanging="360"/>
-      </w:pPr>
-    </w:lvl>
-    <w:lvl w:ilvl="8" w:tplc="0409001B" w:tentative="1">
-      <w:start w:val="1"/>
-      <w:numFmt w:val="lowerRoman"/>
-      <w:lvlText w:val="%9."/>
-      <w:lvlJc w:val="right"/>
-      <w:pPr>
-        <w:ind w:left="6480" w:hanging="180"/>
-      </w:pPr>
-    </w:lvl>
-  </w:abstractNum>
-  <w:num w:numId="1" w16cid:durableId="1459369922">
+  <w:num w:numId="1" w16cid:durableId="89550362">
+    <w:abstractNumId w:val="2"/>
+  </w:num>
+  <w:num w:numId="2" w16cid:durableId="926689277">
+    <w:abstractNumId w:val="15"/>
+  </w:num>
+  <w:num w:numId="3" w16cid:durableId="1551990156">
+    <w:abstractNumId w:val="10"/>
+  </w:num>
+  <w:num w:numId="4" w16cid:durableId="1075709057">
+    <w:abstractNumId w:val="6"/>
+  </w:num>
+  <w:num w:numId="5" w16cid:durableId="2019504319">
+    <w:abstractNumId w:val="14"/>
+  </w:num>
+  <w:num w:numId="6" w16cid:durableId="1527718584">
+    <w:abstractNumId w:val="12"/>
+  </w:num>
+  <w:num w:numId="7" w16cid:durableId="663241148">
+    <w:abstractNumId w:val="4"/>
+  </w:num>
+  <w:num w:numId="8" w16cid:durableId="2066101029">
+    <w:abstractNumId w:val="13"/>
+  </w:num>
+  <w:num w:numId="9" w16cid:durableId="1561595357">
+    <w:abstractNumId w:val="0"/>
+  </w:num>
+  <w:num w:numId="10" w16cid:durableId="1997830921">
+    <w:abstractNumId w:val="7"/>
+  </w:num>
+  <w:num w:numId="11" w16cid:durableId="1755738052">
     <w:abstractNumId w:val="1"/>
   </w:num>
-  <w:num w:numId="2" w16cid:durableId="1209687079">
-    <w:abstractNumId w:val="0"/>
+  <w:num w:numId="12" w16cid:durableId="210577548">
+    <w:abstractNumId w:val="3"/>
   </w:num>
-  <w:num w:numId="3" w16cid:durableId="539902321">
-    <w:abstractNumId w:val="6"/>
+  <w:num w:numId="13" w16cid:durableId="1131249264">
+    <w:abstractNumId w:val="18"/>
   </w:num>
-  <w:num w:numId="4" w16cid:durableId="1409158712">
+  <w:num w:numId="14" w16cid:durableId="1545677400">
+    <w:abstractNumId w:val="9"/>
+  </w:num>
+  <w:num w:numId="15" w16cid:durableId="495150732">
+    <w:abstractNumId w:val="8"/>
+  </w:num>
+  <w:num w:numId="16" w16cid:durableId="1313603990">
+    <w:abstractNumId w:val="16"/>
+  </w:num>
+  <w:num w:numId="17" w16cid:durableId="219174537">
+    <w:abstractNumId w:val="11"/>
+  </w:num>
+  <w:num w:numId="18" w16cid:durableId="1572539782">
     <w:abstractNumId w:val="5"/>
   </w:num>
-  <w:num w:numId="5" w16cid:durableId="941299315">
-    <w:abstractNumId w:val="3"/>
-  </w:num>
-  <w:num w:numId="6" w16cid:durableId="1572539782">
-    <w:abstractNumId w:val="2"/>
-  </w:num>
-  <w:num w:numId="7" w16cid:durableId="314646331">
-    <w:abstractNumId w:val="4"/>
+  <w:num w:numId="19" w16cid:durableId="314646331">
+    <w:abstractNumId w:val="17"/>
   </w:num>
 </w:numbering>
 </file>
@@ -6239,7 +7553,7 @@
     <w:lsdException w:name="Closing" w:semiHidden="1" w:unhideWhenUsed="1"/>
     <w:lsdException w:name="Signature" w:semiHidden="1" w:unhideWhenUsed="1"/>
     <w:lsdException w:name="Default Paragraph Font" w:semiHidden="1" w:uiPriority="1" w:unhideWhenUsed="1"/>
-    <w:lsdException w:name="Body Text" w:semiHidden="1" w:unhideWhenUsed="1"/>
+    <w:lsdException w:name="Body Text" w:semiHidden="1" w:uiPriority="1" w:unhideWhenUsed="1" w:qFormat="1"/>
     <w:lsdException w:name="Body Text Indent" w:semiHidden="1" w:unhideWhenUsed="1"/>
     <w:lsdException w:name="List Continue" w:semiHidden="1" w:unhideWhenUsed="1"/>
     <w:lsdException w:name="List Continue 2" w:semiHidden="1" w:unhideWhenUsed="1"/>
@@ -6553,32 +7867,13 @@
   <w:style w:type="paragraph" w:default="1" w:styleId="Normal">
     <w:name w:val="Normal"/>
     <w:qFormat/>
-    <w:rsid w:val="006715C8"/>
+    <w:rsid w:val="00894475"/>
     <w:pPr>
       <w:spacing w:after="200" w:line="276" w:lineRule="auto"/>
     </w:pPr>
     <w:rPr>
       <w:sz w:val="22"/>
       <w:szCs w:val="22"/>
-    </w:rPr>
-  </w:style>
-  <w:style w:type="paragraph" w:styleId="Heading3">
-    <w:name w:val="heading 3"/>
-    <w:basedOn w:val="Normal"/>
-    <w:link w:val="Heading3Char"/>
-    <w:uiPriority w:val="9"/>
-    <w:qFormat/>
-    <w:rsid w:val="00121898"/>
-    <w:pPr>
-      <w:spacing w:before="100" w:beforeAutospacing="1" w:after="100" w:afterAutospacing="1" w:line="240" w:lineRule="auto"/>
-      <w:outlineLvl w:val="2"/>
-    </w:pPr>
-    <w:rPr>
-      <w:rFonts w:ascii="Times New Roman" w:hAnsi="Times New Roman"/>
-      <w:b/>
-      <w:bCs/>
-      <w:sz w:val="27"/>
-      <w:szCs w:val="27"/>
     </w:rPr>
   </w:style>
   <w:style w:type="character" w:default="1" w:styleId="DefaultParagraphFont">
@@ -6608,56 +7903,42 @@
     <w:semiHidden/>
     <w:unhideWhenUsed/>
   </w:style>
-  <w:style w:type="paragraph" w:styleId="NoSpacing">
-    <w:name w:val="No Spacing"/>
-    <w:uiPriority w:val="1"/>
+  <w:style w:type="paragraph" w:styleId="ListParagraph">
+    <w:name w:val="List Paragraph"/>
+    <w:basedOn w:val="Normal"/>
+    <w:uiPriority w:val="34"/>
     <w:qFormat/>
-    <w:rsid w:val="00025BF9"/>
-    <w:rPr>
-      <w:sz w:val="22"/>
-      <w:szCs w:val="22"/>
-    </w:rPr>
-  </w:style>
-  <w:style w:type="character" w:customStyle="1" w:styleId="gd">
-    <w:name w:val="gd"/>
-    <w:basedOn w:val="DefaultParagraphFont"/>
-    <w:rsid w:val="006E5664"/>
-  </w:style>
-  <w:style w:type="character" w:customStyle="1" w:styleId="g3">
-    <w:name w:val="g3"/>
-    <w:basedOn w:val="DefaultParagraphFont"/>
-    <w:rsid w:val="006E5664"/>
-  </w:style>
-  <w:style w:type="character" w:customStyle="1" w:styleId="hb">
-    <w:name w:val="hb"/>
-    <w:basedOn w:val="DefaultParagraphFont"/>
-    <w:rsid w:val="006E5664"/>
+    <w:rsid w:val="00BF1CF0"/>
+    <w:pPr>
+      <w:ind w:left="720"/>
+      <w:contextualSpacing/>
+    </w:pPr>
   </w:style>
   <w:style w:type="character" w:customStyle="1" w:styleId="apple-converted-space">
     <w:name w:val="apple-converted-space"/>
     <w:basedOn w:val="DefaultParagraphFont"/>
-    <w:rsid w:val="006E5664"/>
-  </w:style>
-  <w:style w:type="character" w:customStyle="1" w:styleId="g2">
-    <w:name w:val="g2"/>
-    <w:basedOn w:val="DefaultParagraphFont"/>
-    <w:rsid w:val="006E5664"/>
+    <w:rsid w:val="001C468A"/>
   </w:style>
   <w:style w:type="character" w:customStyle="1" w:styleId="il">
     <w:name w:val="il"/>
     <w:basedOn w:val="DefaultParagraphFont"/>
-    <w:rsid w:val="006E5664"/>
+    <w:rsid w:val="001C468A"/>
   </w:style>
-  <w:style w:type="character" w:styleId="Hyperlink">
-    <w:name w:val="Hyperlink"/>
-    <w:uiPriority w:val="99"/>
-    <w:semiHidden/>
-    <w:unhideWhenUsed/>
-    <w:rsid w:val="006E5664"/>
-    <w:rPr>
-      <w:color w:val="0000FF"/>
-      <w:u w:val="single"/>
-    </w:rPr>
+  <w:style w:type="table" w:styleId="TableGrid">
+    <w:name w:val="Table Grid"/>
+    <w:basedOn w:val="TableNormal"/>
+    <w:uiPriority w:val="59"/>
+    <w:rsid w:val="00071790"/>
+    <w:tblPr>
+      <w:tblBorders>
+        <w:top w:val="single" w:sz="4" w:space="0" w:color="000000"/>
+        <w:left w:val="single" w:sz="4" w:space="0" w:color="000000"/>
+        <w:bottom w:val="single" w:sz="4" w:space="0" w:color="000000"/>
+        <w:right w:val="single" w:sz="4" w:space="0" w:color="000000"/>
+        <w:insideH w:val="single" w:sz="4" w:space="0" w:color="000000"/>
+        <w:insideV w:val="single" w:sz="4" w:space="0" w:color="000000"/>
+      </w:tblBorders>
+    </w:tblPr>
   </w:style>
   <w:style w:type="paragraph" w:styleId="BalloonText">
     <w:name w:val="Balloon Text"/>
@@ -6666,7 +7947,7 @@
     <w:uiPriority w:val="99"/>
     <w:semiHidden/>
     <w:unhideWhenUsed/>
-    <w:rsid w:val="006E5664"/>
+    <w:rsid w:val="003A7009"/>
     <w:pPr>
       <w:spacing w:after="0" w:line="240" w:lineRule="auto"/>
     </w:pPr>
@@ -6682,23 +7963,148 @@
     <w:link w:val="BalloonText"/>
     <w:uiPriority w:val="99"/>
     <w:semiHidden/>
-    <w:rsid w:val="006E5664"/>
+    <w:rsid w:val="003A7009"/>
     <w:rPr>
-      <w:rFonts w:ascii="Tahoma" w:hAnsi="Tahoma" w:cs="Tahoma"/>
+      <w:rFonts w:ascii="Tahoma" w:eastAsia="Times New Roman" w:hAnsi="Tahoma" w:cs="Tahoma"/>
       <w:sz w:val="16"/>
       <w:szCs w:val="16"/>
     </w:rPr>
   </w:style>
-  <w:style w:type="paragraph" w:styleId="ListParagraph">
-    <w:name w:val="List Paragraph"/>
+  <w:style w:type="paragraph" w:styleId="NoSpacing">
+    <w:name w:val="No Spacing"/>
+    <w:uiPriority w:val="1"/>
+    <w:qFormat/>
+    <w:rsid w:val="003A7009"/>
+    <w:rPr>
+      <w:sz w:val="22"/>
+      <w:szCs w:val="22"/>
+    </w:rPr>
+  </w:style>
+  <w:style w:type="paragraph" w:customStyle="1" w:styleId="Default">
+    <w:name w:val="Default"/>
+    <w:rsid w:val="00091258"/>
+    <w:pPr>
+      <w:autoSpaceDE w:val="0"/>
+      <w:autoSpaceDN w:val="0"/>
+      <w:adjustRightInd w:val="0"/>
+    </w:pPr>
+    <w:rPr>
+      <w:rFonts w:ascii="Arial" w:hAnsi="Arial" w:cs="Arial"/>
+      <w:color w:val="000000"/>
+      <w:sz w:val="24"/>
+      <w:szCs w:val="24"/>
+      <w:lang w:val="en-IN" w:eastAsia="en-IN"/>
+    </w:rPr>
+  </w:style>
+  <w:style w:type="paragraph" w:styleId="Header">
+    <w:name w:val="header"/>
     <w:basedOn w:val="Normal"/>
-    <w:uiPriority w:val="34"/>
+    <w:link w:val="HeaderChar"/>
+    <w:uiPriority w:val="99"/>
+    <w:unhideWhenUsed/>
+    <w:rsid w:val="006A4E07"/>
+    <w:pPr>
+      <w:tabs>
+        <w:tab w:val="center" w:pos="4513"/>
+        <w:tab w:val="right" w:pos="9026"/>
+      </w:tabs>
+    </w:pPr>
+  </w:style>
+  <w:style w:type="character" w:customStyle="1" w:styleId="HeaderChar">
+    <w:name w:val="Header Char"/>
+    <w:link w:val="Header"/>
+    <w:uiPriority w:val="99"/>
+    <w:rsid w:val="006A4E07"/>
+    <w:rPr>
+      <w:sz w:val="22"/>
+      <w:szCs w:val="22"/>
+      <w:lang w:val="en-US" w:eastAsia="en-US"/>
+    </w:rPr>
+  </w:style>
+  <w:style w:type="paragraph" w:styleId="Footer">
+    <w:name w:val="footer"/>
+    <w:basedOn w:val="Normal"/>
+    <w:link w:val="FooterChar"/>
+    <w:uiPriority w:val="99"/>
+    <w:unhideWhenUsed/>
+    <w:rsid w:val="006A4E07"/>
+    <w:pPr>
+      <w:tabs>
+        <w:tab w:val="center" w:pos="4513"/>
+        <w:tab w:val="right" w:pos="9026"/>
+      </w:tabs>
+    </w:pPr>
+  </w:style>
+  <w:style w:type="character" w:customStyle="1" w:styleId="FooterChar">
+    <w:name w:val="Footer Char"/>
+    <w:link w:val="Footer"/>
+    <w:uiPriority w:val="99"/>
+    <w:rsid w:val="006A4E07"/>
+    <w:rPr>
+      <w:sz w:val="22"/>
+      <w:szCs w:val="22"/>
+      <w:lang w:val="en-US" w:eastAsia="en-US"/>
+    </w:rPr>
+  </w:style>
+  <w:style w:type="character" w:styleId="Hyperlink">
+    <w:name w:val="Hyperlink"/>
+    <w:uiPriority w:val="99"/>
+    <w:unhideWhenUsed/>
+    <w:rsid w:val="00CD7C30"/>
+    <w:rPr>
+      <w:color w:val="993300"/>
+      <w:u w:val="single"/>
+    </w:rPr>
+  </w:style>
+  <w:style w:type="paragraph" w:styleId="BodyText">
+    <w:name w:val="Body Text"/>
+    <w:basedOn w:val="Normal"/>
+    <w:link w:val="BodyTextChar"/>
+    <w:uiPriority w:val="1"/>
     <w:qFormat/>
-    <w:rsid w:val="00372BA8"/>
+    <w:rsid w:val="0006391C"/>
     <w:pPr>
-      <w:ind w:left="720"/>
-      <w:contextualSpacing/>
+      <w:widowControl w:val="0"/>
+      <w:autoSpaceDE w:val="0"/>
+      <w:autoSpaceDN w:val="0"/>
+      <w:spacing w:after="0" w:line="240" w:lineRule="auto"/>
     </w:pPr>
+    <w:rPr>
+      <w:rFonts w:ascii="Arial" w:eastAsia="Arial" w:hAnsi="Arial"/>
+      <w:b/>
+      <w:bCs/>
+      <w:sz w:val="20"/>
+      <w:szCs w:val="20"/>
+    </w:rPr>
+  </w:style>
+  <w:style w:type="character" w:customStyle="1" w:styleId="BodyTextChar">
+    <w:name w:val="Body Text Char"/>
+    <w:link w:val="BodyText"/>
+    <w:uiPriority w:val="1"/>
+    <w:rsid w:val="0006391C"/>
+    <w:rPr>
+      <w:rFonts w:ascii="Arial" w:eastAsia="Arial" w:hAnsi="Arial" w:cs="Arial"/>
+      <w:b/>
+      <w:bCs/>
+      <w:lang w:val="en-US" w:eastAsia="en-US"/>
+    </w:rPr>
+  </w:style>
+  <w:style w:type="paragraph" w:customStyle="1" w:styleId="TableParagraph">
+    <w:name w:val="Table Paragraph"/>
+    <w:basedOn w:val="Normal"/>
+    <w:uiPriority w:val="1"/>
+    <w:qFormat/>
+    <w:rsid w:val="00FB5F3A"/>
+    <w:pPr>
+      <w:widowControl w:val="0"/>
+      <w:autoSpaceDE w:val="0"/>
+      <w:autoSpaceDN w:val="0"/>
+      <w:spacing w:before="6" w:after="0" w:line="273" w:lineRule="exact"/>
+      <w:ind w:left="468"/>
+    </w:pPr>
+    <w:rPr>
+      <w:rFonts w:eastAsia="Calibri" w:cs="Calibri"/>
+    </w:rPr>
   </w:style>
   <w:style w:type="paragraph" w:styleId="NormalWeb">
     <w:name w:val="Normal (Web)"/>
@@ -6706,7 +8112,7 @@
     <w:uiPriority w:val="99"/>
     <w:semiHidden/>
     <w:unhideWhenUsed/>
-    <w:rsid w:val="00072D42"/>
+    <w:rsid w:val="0009778E"/>
     <w:pPr>
       <w:spacing w:before="100" w:beforeAutospacing="1" w:after="100" w:afterAutospacing="1" w:line="240" w:lineRule="auto"/>
     </w:pPr>
@@ -6714,45 +8120,6 @@
       <w:rFonts w:ascii="Times New Roman" w:hAnsi="Times New Roman"/>
       <w:sz w:val="24"/>
       <w:szCs w:val="24"/>
-    </w:rPr>
-  </w:style>
-  <w:style w:type="character" w:styleId="Strong">
-    <w:name w:val="Strong"/>
-    <w:uiPriority w:val="22"/>
-    <w:qFormat/>
-    <w:rsid w:val="00072D42"/>
-    <w:rPr>
-      <w:b/>
-      <w:bCs/>
-    </w:rPr>
-  </w:style>
-  <w:style w:type="character" w:customStyle="1" w:styleId="Heading3Char">
-    <w:name w:val="Heading 3 Char"/>
-    <w:link w:val="Heading3"/>
-    <w:uiPriority w:val="9"/>
-    <w:rsid w:val="00121898"/>
-    <w:rPr>
-      <w:rFonts w:ascii="Times New Roman" w:hAnsi="Times New Roman"/>
-      <w:b/>
-      <w:bCs/>
-      <w:sz w:val="27"/>
-      <w:szCs w:val="27"/>
-    </w:rPr>
-  </w:style>
-  <w:style w:type="paragraph" w:customStyle="1" w:styleId="Default">
-    <w:name w:val="Default"/>
-    <w:rsid w:val="006A1E03"/>
-    <w:pPr>
-      <w:autoSpaceDE w:val="0"/>
-      <w:autoSpaceDN w:val="0"/>
-      <w:adjustRightInd w:val="0"/>
-    </w:pPr>
-    <w:rPr>
-      <w:rFonts w:ascii="Cambria" w:hAnsi="Cambria" w:cs="Cambria"/>
-      <w:color w:val="000000"/>
-      <w:sz w:val="24"/>
-      <w:szCs w:val="24"/>
-      <w:lang w:val="en-IN" w:eastAsia="en-IN"/>
     </w:rPr>
   </w:style>
 </w:styles>

</xml_diff>

<commit_message>
Improve In-house Recruitment: letters, CTC on convert, and L1-pending requisitions.
Skip ERP requisition approval (Indus One), attach candidate CTC when creating Employee Master, show Indus One L1-pending requisitions, and refresh offer/appointment letter templates.
</commit_message>
<xml_diff>
--- a/public/templates/admin-recruitment/appointment-letter.docx
+++ b/public/templates/admin-recruitment/appointment-letter.docx
@@ -4,132 +4,6 @@
   <w:body>
     <w:p>
       <w:pPr>
-        <w:spacing w:after="0" w:line="240" w:lineRule="auto"/>
-        <w:jc w:val="both"/>
-        <w:rPr>
-          <w:rFonts w:ascii="Times New Roman" w:hAnsi="Times New Roman"/>
-          <w:sz w:val="24"/>
-          <w:szCs w:val="24"/>
-        </w:rPr>
-      </w:pPr>
-      <w:r>
-        <w:rPr>
-          <w:rFonts w:ascii="Times New Roman" w:hAnsi="Times New Roman"/>
-          <w:noProof/>
-          <w:sz w:val="24"/>
-          <w:szCs w:val="24"/>
-          <w:lang w:val="en-IN" w:eastAsia="en-IN"/>
-        </w:rPr>
-        <w:pict w14:anchorId="02AB6C40">
-          <v:shapetype id="_x0000_t202" coordsize="21600,21600" o:spt="202" path="m,l,21600r21600,l21600,xe">
-            <v:stroke joinstyle="miter"/>
-            <v:path gradientshapeok="t" o:connecttype="rect"/>
-          </v:shapetype>
-          <v:shape id="Text Box 2" o:spid="_x0000_s2050" type="#_x0000_t202" style="position:absolute;left:0;text-align:left;margin-left:382.5pt;margin-top:-10.05pt;width:166.4pt;height:117.4pt;z-index:251657728;visibility:visible;mso-wrap-style:none;mso-width-relative:margin;mso-height-relative:margin" filled="f" stroked="f">
-            <v:textbox style="mso-next-textbox:#Text Box 2;mso-fit-shape-to-text:t">
-              <w:txbxContent>
-                <w:p>
-                  <w:r>
-                    <w:rPr>
-                      <w:rFonts w:ascii="Times New Roman" w:hAnsi="Times New Roman"/>
-                      <w:color w:val="000000"/>
-                      <w:sz w:val="24"/>
-                      <w:szCs w:val="24"/>
-                    </w:rPr>
-                    <w:pict w14:anchorId="25036BCC">
-                      <v:shapetype id="_x0000_t75" coordsize="21600,21600" o:spt="75" o:preferrelative="t" path="m@4@5l@4@11@9@11@9@5xe" filled="f" stroked="f">
-                        <v:stroke joinstyle="miter"/>
-                        <v:formulas>
-                          <v:f eqn="if lineDrawn pixelLineWidth 0"/>
-                          <v:f eqn="sum @0 1 0"/>
-                          <v:f eqn="sum 0 0 @1"/>
-                          <v:f eqn="prod @2 1 2"/>
-                          <v:f eqn="prod @3 21600 pixelWidth"/>
-                          <v:f eqn="prod @3 21600 pixelHeight"/>
-                          <v:f eqn="sum @0 0 1"/>
-                          <v:f eqn="prod @6 1 2"/>
-                          <v:f eqn="prod @7 21600 pixelWidth"/>
-                          <v:f eqn="sum @8 21600 0"/>
-                          <v:f eqn="prod @7 21600 pixelHeight"/>
-                          <v:f eqn="sum @10 21600 0"/>
-                        </v:formulas>
-                        <v:path o:extrusionok="f" gradientshapeok="t" o:connecttype="rect"/>
-                        <o:lock v:ext="edit" aspectratio="t"/>
-                      </v:shapetype>
-                      <v:shape id="_x0000_i1026" type="#_x0000_t75" style="width:152.25pt;height:98.25pt">
-                        <v:imagedata r:id="rId7" o:title="121212"/>
-                      </v:shape>
-                    </w:pict>
-                  </w:r>
-                </w:p>
-              </w:txbxContent>
-            </v:textbox>
-          </v:shape>
-        </w:pict>
-      </w:r>
-    </w:p>
-    <w:p>
-      <w:pPr>
-        <w:spacing w:after="0" w:line="240" w:lineRule="auto"/>
-        <w:jc w:val="both"/>
-        <w:rPr>
-          <w:rFonts w:ascii="Times New Roman" w:hAnsi="Times New Roman"/>
-          <w:sz w:val="24"/>
-          <w:szCs w:val="24"/>
-        </w:rPr>
-      </w:pPr>
-    </w:p>
-    <w:p>
-      <w:pPr>
-        <w:spacing w:after="0" w:line="240" w:lineRule="auto"/>
-        <w:jc w:val="both"/>
-        <w:rPr>
-          <w:rFonts w:ascii="Times New Roman" w:hAnsi="Times New Roman"/>
-          <w:sz w:val="24"/>
-          <w:szCs w:val="24"/>
-        </w:rPr>
-      </w:pPr>
-    </w:p>
-    <w:p>
-      <w:pPr>
-        <w:pStyle w:val="ListParagraph"/>
-        <w:spacing w:after="0"/>
-        <w:ind w:left="0"/>
-        <w:jc w:val="both"/>
-        <w:rPr>
-          <w:rFonts w:ascii="Times New Roman" w:hAnsi="Times New Roman"/>
-          <w:color w:val="000000"/>
-          <w:sz w:val="24"/>
-          <w:szCs w:val="24"/>
-        </w:rPr>
-      </w:pPr>
-    </w:p>
-    <w:p>
-      <w:pPr>
-        <w:pStyle w:val="ListParagraph"/>
-        <w:spacing w:after="0"/>
-        <w:ind w:left="0"/>
-        <w:jc w:val="both"/>
-        <w:rPr>
-          <w:rFonts w:ascii="Times New Roman" w:hAnsi="Times New Roman"/>
-          <w:color w:val="000000"/>
-          <w:sz w:val="24"/>
-          <w:szCs w:val="24"/>
-        </w:rPr>
-      </w:pPr>
-    </w:p>
-    <w:p>
-      <w:pPr>
-        <w:spacing w:after="0" w:line="240" w:lineRule="auto"/>
-        <w:jc w:val="both"/>
-        <w:rPr>
-          <w:rFonts w:cs="Calibri"/>
-          <w:color w:val="000000"/>
-        </w:rPr>
-      </w:pPr>
-    </w:p>
-    <w:p>
-      <w:pPr>
         <w:pStyle w:val="NoSpacing"/>
         <w:jc w:val="both"/>
         <w:rPr>
@@ -142,90 +16,119 @@
     <w:p>
       <w:pPr>
         <w:pStyle w:val="NoSpacing"/>
-        <w:jc w:val="both"/>
         <w:rPr>
           <w:rFonts w:ascii="Montserrat" w:hAnsi="Montserrat" w:cs="Arial"/>
           <w:sz w:val="20"/>
           <w:szCs w:val="20"/>
         </w:rPr>
       </w:pPr>
-    </w:p>
-    <w:p>
-      <w:pPr>
-        <w:pStyle w:val="NoSpacing"/>
-        <w:jc w:val="both"/>
+      <w:r>
+        <w:rPr>
+          <w:noProof/>
+        </w:rPr>
+        <w:pict w14:anchorId="71200F56">
+          <v:shapetype id="_x0000_t75" coordsize="21600,21600" o:spt="75" o:preferrelative="t" path="m@4@5l@4@11@9@11@9@5xe" filled="f" stroked="f">
+            <v:stroke joinstyle="miter"/>
+            <v:formulas>
+              <v:f eqn="if lineDrawn pixelLineWidth 0"/>
+              <v:f eqn="sum @0 1 0"/>
+              <v:f eqn="sum 0 0 @1"/>
+              <v:f eqn="prod @2 1 2"/>
+              <v:f eqn="prod @3 21600 pixelWidth"/>
+              <v:f eqn="prod @3 21600 pixelHeight"/>
+              <v:f eqn="sum @0 0 1"/>
+              <v:f eqn="prod @6 1 2"/>
+              <v:f eqn="prod @7 21600 pixelWidth"/>
+              <v:f eqn="sum @8 21600 0"/>
+              <v:f eqn="prod @7 21600 pixelHeight"/>
+              <v:f eqn="sum @10 21600 0"/>
+            </v:formulas>
+            <v:path o:extrusionok="f" gradientshapeok="t" o:connecttype="rect"/>
+            <o:lock v:ext="edit" aspectratio="t"/>
+          </v:shapetype>
+          <v:shape id="Picture 2" o:spid="_x0000_s2052" type="#_x0000_t75" style="position:absolute;margin-left:374.1pt;margin-top:12.9pt;width:119.85pt;height:86.15pt;z-index:251657728;visibility:visible">
+            <v:imagedata r:id="rId7" o:title="" cropright="48124f"/>
+            <w10:wrap type="square"/>
+          </v:shape>
+        </w:pict>
+      </w:r>
+      <w:r>
+        <w:rPr>
+          <w:rFonts w:ascii="Cambria" w:hAnsi="Cambria" w:cs="Arial"/>
+        </w:rPr>
+        <w:t>{{APPOINTMENT_REF}}</w:t>
+      </w:r>
+      <w:r>
         <w:rPr>
           <w:rFonts w:ascii="Montserrat" w:hAnsi="Montserrat" w:cs="Arial"/>
           <w:sz w:val="20"/>
           <w:szCs w:val="20"/>
         </w:rPr>
-      </w:pPr>
-    </w:p>
-    <w:p>
-      <w:pPr>
-        <w:pStyle w:val="NoSpacing"/>
-        <w:jc w:val="both"/>
+        <w:tab/>
+      </w:r>
+      <w:r>
         <w:rPr>
           <w:rFonts w:ascii="Montserrat" w:hAnsi="Montserrat" w:cs="Arial"/>
           <w:sz w:val="20"/>
           <w:szCs w:val="20"/>
         </w:rPr>
-      </w:pPr>
-    </w:p>
-    <w:p>
-      <w:pPr>
-        <w:pStyle w:val="NoSpacing"/>
-        <w:jc w:val="both"/>
+        <w:tab/>
+      </w:r>
+      <w:r>
         <w:rPr>
           <w:rFonts w:ascii="Montserrat" w:hAnsi="Montserrat" w:cs="Arial"/>
           <w:sz w:val="20"/>
           <w:szCs w:val="20"/>
         </w:rPr>
-      </w:pPr>
-    </w:p>
-    <w:p>
-      <w:pPr>
-        <w:pStyle w:val="NoSpacing"/>
-        <w:jc w:val="both"/>
+        <w:tab/>
+      </w:r>
+      <w:r>
         <w:rPr>
           <w:rFonts w:ascii="Montserrat" w:hAnsi="Montserrat" w:cs="Arial"/>
           <w:sz w:val="20"/>
           <w:szCs w:val="20"/>
         </w:rPr>
-      </w:pPr>
-    </w:p>
-    <w:p>
-      <w:pPr>
-        <w:pStyle w:val="NoSpacing"/>
-        <w:jc w:val="both"/>
+        <w:tab/>
+      </w:r>
+      <w:r>
         <w:rPr>
           <w:rFonts w:ascii="Montserrat" w:hAnsi="Montserrat" w:cs="Arial"/>
           <w:sz w:val="20"/>
           <w:szCs w:val="20"/>
         </w:rPr>
-      </w:pPr>
-    </w:p>
-    <w:p>
-      <w:pPr>
-        <w:pStyle w:val="NoSpacing"/>
-        <w:jc w:val="both"/>
+        <w:tab/>
+      </w:r>
+      <w:r>
         <w:rPr>
           <w:rFonts w:ascii="Montserrat" w:hAnsi="Montserrat" w:cs="Arial"/>
           <w:sz w:val="20"/>
           <w:szCs w:val="20"/>
         </w:rPr>
-      </w:pPr>
-    </w:p>
-    <w:p>
-      <w:pPr>
-        <w:pStyle w:val="NoSpacing"/>
-        <w:jc w:val="both"/>
+        <w:tab/>
+      </w:r>
+      <w:r>
         <w:rPr>
           <w:rFonts w:ascii="Montserrat" w:hAnsi="Montserrat" w:cs="Arial"/>
           <w:sz w:val="20"/>
           <w:szCs w:val="20"/>
         </w:rPr>
-      </w:pPr>
+        <w:tab/>
+      </w:r>
+    </w:p>
+    <w:p>
+      <w:pPr>
+        <w:pStyle w:val="NoSpacing"/>
+        <w:jc w:val="both"/>
+        <w:rPr>
+          <w:rFonts w:ascii="Cambria" w:hAnsi="Cambria" w:cs="Arial"/>
+        </w:rPr>
+      </w:pPr>
+      <w:r>
+        <w:rPr>
+          <w:rFonts w:ascii="Cambria" w:hAnsi="Cambria" w:cs="Arial"/>
+        </w:rPr>
+        <w:t>{{LETTER_DATE}}</w:t>
+      </w:r>
     </w:p>
     <w:p>
       <w:pPr>
@@ -248,32 +151,19 @@
           <w:szCs w:val="20"/>
         </w:rPr>
       </w:pPr>
-    </w:p>
-    <w:p>
-      <w:pPr>
-        <w:pStyle w:val="NoSpacing"/>
+      <w:r>
+        <w:rPr>
+          <w:rFonts w:ascii="Cambria" w:hAnsi="Cambria" w:cs="Arial"/>
+        </w:rPr>
+        <w:t>To,</w:t>
+      </w:r>
+      <w:r>
         <w:rPr>
           <w:rFonts w:ascii="Montserrat" w:hAnsi="Montserrat" w:cs="Arial"/>
           <w:sz w:val="20"/>
           <w:szCs w:val="20"/>
         </w:rPr>
-      </w:pPr>
-      <w:r>
-        <w:rPr>
-          <w:noProof/>
-        </w:rPr>
-        <w:pict w14:anchorId="1554052C">
-          <v:shape id="Picture 2" o:spid="_x0000_s2053" type="#_x0000_t75" style="position:absolute;margin-left:374.1pt;margin-top:12.9pt;width:119.85pt;height:86.15pt;z-index:251659776;visibility:visible">
-            <v:imagedata r:id="rId8" o:title="" cropright="48124f"/>
-            <w10:wrap type="square"/>
-          </v:shape>
-        </w:pict>
-      </w:r>
-      <w:r>
-        <w:rPr>
-          <w:rFonts w:ascii="Cambria" w:hAnsi="Cambria" w:cs="Arial"/>
-        </w:rPr>
-        <w:t>{{APPOINTMENT_REF}}</w:t>
+        <w:tab/>
       </w:r>
       <w:r>
         <w:rPr>
@@ -331,199 +221,98 @@
         </w:rPr>
         <w:tab/>
       </w:r>
-    </w:p>
-    <w:p>
-      <w:pPr>
-        <w:pStyle w:val="NoSpacing"/>
-        <w:jc w:val="both"/>
-        <w:rPr>
-          <w:rFonts w:ascii="Cambria" w:hAnsi="Cambria" w:cs="Arial"/>
-        </w:rPr>
-      </w:pPr>
-      <w:r>
-        <w:rPr>
-          <w:rFonts w:ascii="Cambria" w:hAnsi="Cambria" w:cs="Arial"/>
-        </w:rPr>
-        <w:t>{{LETTER_DATE}}</w:t>
-      </w:r>
-    </w:p>
-    <w:p>
-      <w:pPr>
-        <w:pStyle w:val="NoSpacing"/>
-        <w:jc w:val="both"/>
+      <w:r>
         <w:rPr>
           <w:rFonts w:ascii="Montserrat" w:hAnsi="Montserrat" w:cs="Arial"/>
           <w:sz w:val="20"/>
           <w:szCs w:val="20"/>
         </w:rPr>
-      </w:pPr>
-    </w:p>
-    <w:p>
-      <w:pPr>
-        <w:pStyle w:val="NoSpacing"/>
-        <w:jc w:val="both"/>
+        <w:tab/>
+      </w:r>
+      <w:r>
         <w:rPr>
           <w:rFonts w:ascii="Montserrat" w:hAnsi="Montserrat" w:cs="Arial"/>
           <w:sz w:val="20"/>
           <w:szCs w:val="20"/>
         </w:rPr>
-      </w:pPr>
-      <w:r>
-        <w:rPr>
-          <w:rFonts w:ascii="Cambria" w:hAnsi="Cambria" w:cs="Arial"/>
-        </w:rPr>
-        <w:t>To,</w:t>
-      </w:r>
-      <w:r>
+        <w:tab/>
+      </w:r>
+    </w:p>
+    <w:p>
+      <w:pPr>
+        <w:pStyle w:val="NoSpacing"/>
+        <w:jc w:val="both"/>
+        <w:rPr>
+          <w:rFonts w:ascii="Cambria" w:hAnsi="Cambria" w:cs="Arial"/>
+        </w:rPr>
+      </w:pPr>
+      <w:r>
+        <w:rPr>
+          <w:rFonts w:ascii="Cambria" w:hAnsi="Cambria" w:cs="Arial"/>
+        </w:rPr>
+        <w:t>{{CANDIDATE_FULL}}</w:t>
+      </w:r>
+      <w:r>
+        <w:rPr>
+          <w:rFonts w:ascii="Cambria" w:hAnsi="Cambria" w:cs="Arial"/>
+        </w:rPr>
+        <w:t>,</w:t>
+      </w:r>
+    </w:p>
+    <w:p>
+      <w:pPr>
+        <w:pStyle w:val="NoSpacing"/>
+        <w:jc w:val="both"/>
+        <w:rPr>
+          <w:rFonts w:ascii="Cambria" w:hAnsi="Cambria" w:cs="Arial"/>
+        </w:rPr>
+      </w:pPr>
+      <w:r>
+        <w:rPr>
+          <w:rFonts w:ascii="Cambria" w:hAnsi="Cambria" w:cs="Arial"/>
+        </w:rPr>
+        <w:t>{{ADDRESS_LINE1}}</w:t>
+      </w:r>
+    </w:p>
+    <w:p>
+      <w:pPr>
+        <w:pStyle w:val="NoSpacing"/>
+        <w:jc w:val="both"/>
+        <w:rPr>
+          <w:rFonts w:ascii="Cambria" w:hAnsi="Cambria" w:cs="Arial"/>
+        </w:rPr>
+      </w:pPr>
+      <w:r>
+        <w:rPr>
+          <w:rFonts w:ascii="Cambria" w:hAnsi="Cambria" w:cs="Arial"/>
+        </w:rPr>
+        <w:t>{{ADDRESS_LINE2}}</w:t>
+      </w:r>
+    </w:p>
+    <w:p>
+      <w:pPr>
+        <w:pStyle w:val="NoSpacing"/>
+        <w:jc w:val="both"/>
+        <w:rPr>
+          <w:rFonts w:ascii="Cambria" w:hAnsi="Cambria" w:cs="Arial"/>
+        </w:rPr>
+      </w:pPr>
+      <w:r>
+        <w:rPr>
+          <w:rFonts w:ascii="Cambria" w:hAnsi="Cambria" w:cs="Arial"/>
+        </w:rPr>
+        <w:t>{{ADDRESS_LINE3}}</w:t>
+      </w:r>
+    </w:p>
+    <w:p>
+      <w:pPr>
+        <w:pStyle w:val="NoSpacing"/>
+        <w:jc w:val="both"/>
         <w:rPr>
           <w:rFonts w:ascii="Montserrat" w:hAnsi="Montserrat" w:cs="Arial"/>
           <w:sz w:val="20"/>
           <w:szCs w:val="20"/>
         </w:rPr>
-        <w:tab/>
-      </w:r>
-      <w:r>
-        <w:rPr>
-          <w:rFonts w:ascii="Montserrat" w:hAnsi="Montserrat" w:cs="Arial"/>
-          <w:sz w:val="20"/>
-          <w:szCs w:val="20"/>
-        </w:rPr>
-        <w:tab/>
-      </w:r>
-      <w:r>
-        <w:rPr>
-          <w:rFonts w:ascii="Montserrat" w:hAnsi="Montserrat" w:cs="Arial"/>
-          <w:sz w:val="20"/>
-          <w:szCs w:val="20"/>
-        </w:rPr>
-        <w:tab/>
-      </w:r>
-      <w:r>
-        <w:rPr>
-          <w:rFonts w:ascii="Montserrat" w:hAnsi="Montserrat" w:cs="Arial"/>
-          <w:sz w:val="20"/>
-          <w:szCs w:val="20"/>
-        </w:rPr>
-        <w:tab/>
-      </w:r>
-      <w:r>
-        <w:rPr>
-          <w:rFonts w:ascii="Montserrat" w:hAnsi="Montserrat" w:cs="Arial"/>
-          <w:sz w:val="20"/>
-          <w:szCs w:val="20"/>
-        </w:rPr>
-        <w:tab/>
-      </w:r>
-      <w:r>
-        <w:rPr>
-          <w:rFonts w:ascii="Montserrat" w:hAnsi="Montserrat" w:cs="Arial"/>
-          <w:sz w:val="20"/>
-          <w:szCs w:val="20"/>
-        </w:rPr>
-        <w:tab/>
-      </w:r>
-      <w:r>
-        <w:rPr>
-          <w:rFonts w:ascii="Montserrat" w:hAnsi="Montserrat" w:cs="Arial"/>
-          <w:sz w:val="20"/>
-          <w:szCs w:val="20"/>
-        </w:rPr>
-        <w:tab/>
-      </w:r>
-      <w:r>
-        <w:rPr>
-          <w:rFonts w:ascii="Montserrat" w:hAnsi="Montserrat" w:cs="Arial"/>
-          <w:sz w:val="20"/>
-          <w:szCs w:val="20"/>
-        </w:rPr>
-        <w:tab/>
-      </w:r>
-      <w:r>
-        <w:rPr>
-          <w:rFonts w:ascii="Montserrat" w:hAnsi="Montserrat" w:cs="Arial"/>
-          <w:sz w:val="20"/>
-          <w:szCs w:val="20"/>
-        </w:rPr>
-        <w:tab/>
-      </w:r>
-      <w:r>
-        <w:rPr>
-          <w:rFonts w:ascii="Montserrat" w:hAnsi="Montserrat" w:cs="Arial"/>
-          <w:sz w:val="20"/>
-          <w:szCs w:val="20"/>
-        </w:rPr>
-        <w:tab/>
-      </w:r>
-    </w:p>
-    <w:p>
-      <w:pPr>
-        <w:pStyle w:val="NoSpacing"/>
-        <w:jc w:val="both"/>
-        <w:rPr>
-          <w:rFonts w:ascii="Cambria" w:hAnsi="Cambria" w:cs="Arial"/>
-        </w:rPr>
-      </w:pPr>
-      <w:r>
-        <w:rPr>
-          <w:rFonts w:ascii="Cambria" w:hAnsi="Cambria" w:cs="Arial"/>
-        </w:rPr>
-        <w:t>{{CANDIDATE_FULL}},</w:t>
-      </w:r>
-    </w:p>
-    <w:p>
-      <w:pPr>
-        <w:pStyle w:val="NoSpacing"/>
-        <w:jc w:val="both"/>
-        <w:rPr>
-          <w:rFonts w:ascii="Cambria" w:hAnsi="Cambria" w:cs="Arial"/>
-        </w:rPr>
-      </w:pPr>
-      <w:r>
-        <w:rPr>
-          <w:rFonts w:ascii="Cambria" w:hAnsi="Cambria" w:cs="Arial"/>
-        </w:rPr>
-        <w:t>{{ADDRESS_LINE1}}</w:t>
-      </w:r>
-    </w:p>
-    <w:p>
-      <w:pPr>
-        <w:pStyle w:val="NoSpacing"/>
-        <w:jc w:val="both"/>
-        <w:rPr>
-          <w:rFonts w:ascii="Cambria" w:hAnsi="Cambria" w:cs="Arial"/>
-        </w:rPr>
-      </w:pPr>
-      <w:r>
-        <w:rPr>
-          <w:rFonts w:ascii="Cambria" w:hAnsi="Cambria" w:cs="Arial"/>
-        </w:rPr>
-        <w:t>{{ADDRESS_LINE2}}</w:t>
-      </w:r>
-    </w:p>
-    <w:p>
-      <w:pPr>
-        <w:pStyle w:val="NoSpacing"/>
-        <w:jc w:val="both"/>
-        <w:rPr>
-          <w:rFonts w:ascii="Cambria" w:hAnsi="Cambria" w:cs="Arial"/>
-        </w:rPr>
-      </w:pPr>
-      <w:r>
-        <w:rPr>
-          <w:rFonts w:ascii="Cambria" w:hAnsi="Cambria" w:cs="Arial"/>
-        </w:rPr>
-        <w:t>{{ADDRESS_LINE3}}</w:t>
-      </w:r>
-    </w:p>
-    <w:p>
-      <w:pPr>
-        <w:pStyle w:val="NoSpacing"/>
-        <w:jc w:val="both"/>
-        <w:rPr>
-          <w:rFonts w:ascii="Montserrat" w:hAnsi="Montserrat" w:cs="Arial"/>
-          <w:sz w:val="20"/>
-          <w:szCs w:val="20"/>
-        </w:rPr>
       </w:pPr>
     </w:p>
     <w:p>
@@ -651,14 +440,15 @@
           <w:b/>
           <w:bCs/>
         </w:rPr>
-        <w:t>“{{DESIGNATION}}”</w:t>
-      </w:r>
-      <w:r>
-        <w:rPr>
-          <w:rFonts w:ascii="Cambria" w:hAnsi="Cambria" w:cs="Arial"/>
+        <w:t>“</w:t>
+      </w:r>
+      <w:r>
+        <w:rPr>
+          <w:rFonts w:ascii="Cambria" w:hAnsi="Cambria" w:cs="Arial"/>
+          <w:b/>
           <w:bCs/>
         </w:rPr>
-        <w:t xml:space="preserve"> with </w:t>
+        <w:t>{{DESIGNATION}}</w:t>
       </w:r>
       <w:r>
         <w:rPr>
@@ -666,14 +456,28 @@
           <w:b/>
           <w:bCs/>
         </w:rPr>
-        <w:t>{{COMPANY_NAME}}</w:t>
-      </w:r>
-      <w:r>
-        <w:rPr>
-          <w:rFonts w:ascii="Cambria" w:hAnsi="Cambria" w:cs="Arial"/>
-          <w:b/>
+        <w:t>”</w:t>
+      </w:r>
+      <w:r>
+        <w:rPr>
+          <w:rFonts w:ascii="Cambria" w:hAnsi="Cambria" w:cs="Arial"/>
           <w:bCs/>
         </w:rPr>
+        <w:t xml:space="preserve"> </w:t>
+      </w:r>
+      <w:r>
+        <w:rPr>
+          <w:rFonts w:ascii="Cambria" w:hAnsi="Cambria" w:cs="Arial"/>
+          <w:bCs/>
+        </w:rPr>
+        <w:t>with {{COMPANY_NAME}}</w:t>
+      </w:r>
+      <w:r>
+        <w:rPr>
+          <w:rFonts w:ascii="Cambria" w:hAnsi="Cambria" w:cs="Arial"/>
+          <w:b/>
+          <w:bCs/>
+        </w:rPr>
         <w:t xml:space="preserve">, </w:t>
       </w:r>
       <w:r>
@@ -701,7 +505,14 @@
           <w:rFonts w:ascii="Cambria" w:hAnsi="Cambria" w:cs="Arial"/>
           <w:b/>
         </w:rPr>
-        <w:t xml:space="preserve"> {{JOINING_DATE_LONG}}</w:t>
+        <w:t xml:space="preserve"> </w:t>
+      </w:r>
+      <w:r>
+        <w:rPr>
+          <w:rFonts w:ascii="Cambria" w:hAnsi="Cambria" w:cs="Arial"/>
+          <w:b/>
+        </w:rPr>
+        <w:t>{{JOINING_DATE_LONG}}</w:t>
       </w:r>
       <w:r>
         <w:rPr>
@@ -836,21 +647,21 @@
           <w:rFonts w:ascii="Cambria" w:hAnsi="Cambria" w:cs="Arial"/>
           <w:b/>
         </w:rPr>
-        <w:t xml:space="preserve">Cost to Company (CTC) will be </w:t>
-      </w:r>
-      <w:r>
-        <w:rPr>
-          <w:rFonts w:ascii="Cambria" w:hAnsi="Cambria" w:cs="Arial"/>
-          <w:b/>
-        </w:rPr>
-        <w:t>INR {{ANNUAL_CTC}}/-</w:t>
-      </w:r>
-      <w:r>
-        <w:rPr>
-          <w:rFonts w:ascii="Cambria" w:hAnsi="Cambria" w:cs="Arial"/>
-          <w:b/>
-        </w:rPr>
-        <w:t xml:space="preserve"> per annum</w:t>
+        <w:t xml:space="preserve">Cost to Company (CTC) will be INR </w:t>
+      </w:r>
+      <w:r>
+        <w:rPr>
+          <w:rFonts w:ascii="Cambria" w:hAnsi="Cambria" w:cs="Arial"/>
+          <w:b/>
+        </w:rPr>
+        <w:t>{{ANNUAL_CTC}}</w:t>
+      </w:r>
+      <w:r>
+        <w:rPr>
+          <w:rFonts w:ascii="Cambria" w:hAnsi="Cambria" w:cs="Arial"/>
+          <w:b/>
+        </w:rPr>
+        <w:t>/- per annum</w:t>
       </w:r>
       <w:r>
         <w:rPr>
@@ -1746,100 +1557,6 @@
     <w:p>
       <w:pPr>
         <w:pStyle w:val="NoSpacing"/>
-        <w:jc w:val="both"/>
-        <w:rPr>
-          <w:rFonts w:ascii="Cambria" w:hAnsi="Cambria" w:cs="Arial"/>
-          <w:b/>
-          <w:u w:val="single"/>
-        </w:rPr>
-      </w:pPr>
-    </w:p>
-    <w:p>
-      <w:pPr>
-        <w:pStyle w:val="NoSpacing"/>
-        <w:jc w:val="both"/>
-        <w:rPr>
-          <w:rFonts w:ascii="Cambria" w:hAnsi="Cambria" w:cs="Arial"/>
-          <w:b/>
-          <w:u w:val="single"/>
-        </w:rPr>
-      </w:pPr>
-    </w:p>
-    <w:p>
-      <w:pPr>
-        <w:pStyle w:val="NoSpacing"/>
-        <w:jc w:val="both"/>
-        <w:rPr>
-          <w:rFonts w:ascii="Cambria" w:hAnsi="Cambria" w:cs="Arial"/>
-          <w:b/>
-          <w:u w:val="single"/>
-        </w:rPr>
-      </w:pPr>
-    </w:p>
-    <w:p>
-      <w:pPr>
-        <w:pStyle w:val="NoSpacing"/>
-        <w:jc w:val="both"/>
-        <w:rPr>
-          <w:rFonts w:ascii="Cambria" w:hAnsi="Cambria" w:cs="Arial"/>
-          <w:b/>
-          <w:u w:val="single"/>
-        </w:rPr>
-      </w:pPr>
-    </w:p>
-    <w:p>
-      <w:pPr>
-        <w:pStyle w:val="NoSpacing"/>
-        <w:rPr>
-          <w:rFonts w:ascii="Cambria" w:hAnsi="Cambria" w:cs="Arial"/>
-          <w:b/>
-        </w:rPr>
-      </w:pPr>
-    </w:p>
-    <w:p>
-      <w:pPr>
-        <w:pStyle w:val="NoSpacing"/>
-        <w:jc w:val="center"/>
-        <w:rPr>
-          <w:rFonts w:ascii="Cambria" w:hAnsi="Cambria" w:cs="Arial"/>
-          <w:b/>
-        </w:rPr>
-      </w:pPr>
-    </w:p>
-    <w:p>
-      <w:pPr>
-        <w:pStyle w:val="NoSpacing"/>
-        <w:jc w:val="center"/>
-        <w:rPr>
-          <w:rFonts w:ascii="Cambria" w:hAnsi="Cambria" w:cs="Arial"/>
-          <w:b/>
-        </w:rPr>
-      </w:pPr>
-    </w:p>
-    <w:p>
-      <w:pPr>
-        <w:pStyle w:val="NoSpacing"/>
-        <w:jc w:val="center"/>
-        <w:rPr>
-          <w:rFonts w:ascii="Cambria" w:hAnsi="Cambria" w:cs="Arial"/>
-          <w:b/>
-        </w:rPr>
-      </w:pPr>
-    </w:p>
-    <w:p>
-      <w:pPr>
-        <w:pStyle w:val="NoSpacing"/>
-        <w:jc w:val="center"/>
-        <w:rPr>
-          <w:rFonts w:ascii="Cambria" w:hAnsi="Cambria" w:cs="Arial"/>
-          <w:b/>
-        </w:rPr>
-      </w:pPr>
-    </w:p>
-    <w:p>
-      <w:pPr>
-        <w:pStyle w:val="NoSpacing"/>
-        <w:jc w:val="center"/>
         <w:rPr>
           <w:rFonts w:ascii="Cambria" w:hAnsi="Cambria" w:cs="Arial"/>
           <w:b/>
@@ -2398,102 +2115,24 @@
           <w:sz w:val="19"/>
           <w:szCs w:val="19"/>
         </w:rPr>
-        <w:t>We value competence, performance, discipline and integrity above everything else and that constitutes the foundation of your employment.   You must deliver the highest quality of services in your field/department with mutual respect and based on strict merit.  We work in an atmosphere of trust and transparency and go beyond our area of responsibility.  During your employment with us, you will be required to devote the whole of your working time, attention and abilities to the services of the Company.</w:t>
-      </w:r>
-    </w:p>
-    <w:p>
-      <w:pPr>
-        <w:pStyle w:val="NoSpacing"/>
-        <w:jc w:val="both"/>
+        <w:t xml:space="preserve">We value competence, performance, discipline and integrity above everything else and that constitutes the foundation of your employment.   You must deliver the highest quality of services in your field/department with mutual respect and based on strict </w:t>
+      </w:r>
+      <w:r>
         <w:rPr>
           <w:rFonts w:ascii="Cambria" w:hAnsi="Cambria" w:cs="Arial"/>
           <w:sz w:val="19"/>
           <w:szCs w:val="19"/>
         </w:rPr>
-      </w:pPr>
-    </w:p>
-    <w:p>
-      <w:pPr>
-        <w:pStyle w:val="NoSpacing"/>
-        <w:jc w:val="both"/>
-        <w:rPr>
-          <w:rFonts w:ascii="Cambria" w:hAnsi="Cambria" w:cs="Arial"/>
-          <w:sz w:val="19"/>
-          <w:szCs w:val="19"/>
-        </w:rPr>
-      </w:pPr>
-    </w:p>
-    <w:p>
-      <w:pPr>
-        <w:pStyle w:val="NoSpacing"/>
-        <w:jc w:val="both"/>
-        <w:rPr>
-          <w:rFonts w:ascii="Cambria" w:hAnsi="Cambria" w:cs="Arial"/>
-          <w:sz w:val="19"/>
-          <w:szCs w:val="19"/>
-        </w:rPr>
-      </w:pPr>
-    </w:p>
-    <w:p>
-      <w:pPr>
-        <w:pStyle w:val="NoSpacing"/>
-        <w:jc w:val="both"/>
-        <w:rPr>
-          <w:rFonts w:ascii="Cambria" w:hAnsi="Cambria" w:cs="Arial"/>
-          <w:sz w:val="19"/>
-          <w:szCs w:val="19"/>
-        </w:rPr>
-      </w:pPr>
-    </w:p>
-    <w:p>
-      <w:pPr>
-        <w:pStyle w:val="NoSpacing"/>
-        <w:jc w:val="both"/>
-        <w:rPr>
-          <w:rFonts w:ascii="Cambria" w:hAnsi="Cambria" w:cs="Arial"/>
-          <w:sz w:val="19"/>
-          <w:szCs w:val="19"/>
-        </w:rPr>
-      </w:pPr>
-    </w:p>
-    <w:p>
-      <w:pPr>
-        <w:pStyle w:val="NoSpacing"/>
-        <w:jc w:val="both"/>
-        <w:rPr>
-          <w:rFonts w:ascii="Cambria" w:hAnsi="Cambria" w:cs="Arial"/>
-          <w:sz w:val="19"/>
-          <w:szCs w:val="19"/>
-        </w:rPr>
-      </w:pPr>
-    </w:p>
-    <w:p>
-      <w:pPr>
-        <w:pStyle w:val="NoSpacing"/>
-        <w:jc w:val="both"/>
-        <w:rPr>
-          <w:rFonts w:ascii="Cambria" w:hAnsi="Cambria" w:cs="Arial"/>
-          <w:sz w:val="19"/>
-          <w:szCs w:val="19"/>
-        </w:rPr>
-      </w:pPr>
-    </w:p>
-    <w:p>
-      <w:pPr>
-        <w:pStyle w:val="NoSpacing"/>
-        <w:jc w:val="center"/>
-        <w:rPr>
-          <w:rFonts w:ascii="Cambria" w:hAnsi="Cambria" w:cs="Arial"/>
-          <w:b/>
-          <w:bCs/>
-          <w:sz w:val="32"/>
-          <w:szCs w:val="32"/>
-        </w:rPr>
-      </w:pPr>
-    </w:p>
-    <w:p>
-      <w:pPr>
-        <w:pStyle w:val="NoSpacing"/>
+        <w:lastRenderedPageBreak/>
+        <w:t>merit.  We work in an atmosphere of trust and transparency and go beyond our area of responsibility.  During your employment with us, you will be required to devote the whole of your working time, attention and abilities to the services of the Company</w:t>
+      </w:r>
+    </w:p>
+    <w:p>
+      <w:pPr>
+        <w:pStyle w:val="NoSpacing"/>
+        <w:keepNext/>
+        <w:keepLines/>
+        <w:pageBreakBefore/>
         <w:jc w:val="center"/>
         <w:rPr>
           <w:rFonts w:ascii="Cambria" w:hAnsi="Cambria" w:cs="Arial"/>
@@ -2536,7 +2175,7 @@
       <w:tblGrid>
         <w:gridCol w:w="5942"/>
         <w:gridCol w:w="2697"/>
-        <w:gridCol w:w="1501"/>
+        <w:gridCol w:w="2056"/>
       </w:tblGrid>
       <w:tr>
         <w:trPr>
@@ -2582,7 +2221,7 @@
                 <w:szCs w:val="24"/>
                 <w:lang w:val="en-IN" w:eastAsia="en-IN"/>
               </w:rPr>
-              <w:t>Indus Fire Safety Private Limited</w:t>
+              <w:t>{{COMPANY_NAME_FULL}}</w:t>
             </w:r>
           </w:p>
         </w:tc>
@@ -2654,7 +2293,7 @@
                 <w:color w:val="000000"/>
                 <w:lang w:val="en-IN" w:eastAsia="en-IN"/>
               </w:rPr>
-              <w:t>Dashrath,Vadodara</w:t>
+              <w:t>{{AX_LOCATION}}</w:t>
             </w:r>
           </w:p>
         </w:tc>
@@ -2725,7 +2364,7 @@
                 <w:color w:val="000000"/>
                 <w:lang w:val="en-IN" w:eastAsia="en-IN"/>
               </w:rPr>
-              <w:t>11007</w:t>
+              <w:t>{{EMPLOYEE_CODE}}</w:t>
             </w:r>
           </w:p>
         </w:tc>
@@ -2868,7 +2507,88 @@
                 <w:color w:val="000000"/>
                 <w:lang w:val="en-IN" w:eastAsia="en-IN"/>
               </w:rPr>
-              <w:t xml:space="preserve">HR </w:t>
+              <w:t>{{DEPARTMENT}}</w:t>
+            </w:r>
+          </w:p>
+          <w:p>
+            <w:pPr>
+              <w:spacing w:after="0" w:line="240" w:lineRule="auto"/>
+              <w:rPr>
+                <w:rFonts w:ascii="Aptos Narrow" w:hAnsi="Aptos Narrow"/>
+                <w:color w:val="000000"/>
+                <w:lang w:val="en-IN" w:eastAsia="en-IN"/>
+              </w:rPr>
+            </w:pPr>
+          </w:p>
+        </w:tc>
+      </w:tr>
+      <w:tr>
+        <w:trPr>
+          <w:trHeight w:val="290"/>
+          <w:jc w:val="center"/>
+        </w:trPr>
+        <w:tc>
+          <w:tcPr>
+            <w:tcW w:w="5942" w:type="dxa"/>
+            <w:tcBorders>
+              <w:top w:val="nil"/>
+              <w:left w:val="single" w:sz="8" w:space="0" w:color="auto"/>
+              <w:bottom w:val="single" w:sz="4" w:space="0" w:color="auto"/>
+              <w:right w:val="single" w:sz="4" w:space="0" w:color="auto"/>
+            </w:tcBorders>
+            <w:noWrap/>
+            <w:vAlign w:val="bottom"/>
+            <w:hideMark/>
+          </w:tcPr>
+          <w:p>
+            <w:pPr>
+              <w:spacing w:after="0" w:line="240" w:lineRule="auto"/>
+              <w:rPr>
+                <w:rFonts w:ascii="Aptos Narrow" w:hAnsi="Aptos Narrow"/>
+                <w:color w:val="000000"/>
+                <w:lang w:val="en-IN" w:eastAsia="en-IN"/>
+              </w:rPr>
+            </w:pPr>
+            <w:r>
+              <w:rPr>
+                <w:rFonts w:ascii="Aptos Narrow" w:hAnsi="Aptos Narrow"/>
+                <w:color w:val="000000"/>
+                <w:lang w:val="en-IN" w:eastAsia="en-IN"/>
+              </w:rPr>
+              <w:t>Designation</w:t>
+            </w:r>
+          </w:p>
+        </w:tc>
+        <w:tc>
+          <w:tcPr>
+            <w:tcW w:w="4198" w:type="dxa"/>
+            <w:gridSpan w:val="2"/>
+            <w:tcBorders>
+              <w:top w:val="single" w:sz="4" w:space="0" w:color="auto"/>
+              <w:left w:val="nil"/>
+              <w:bottom w:val="single" w:sz="4" w:space="0" w:color="auto"/>
+              <w:right w:val="single" w:sz="8" w:space="0" w:color="000000"/>
+            </w:tcBorders>
+            <w:noWrap/>
+            <w:vAlign w:val="bottom"/>
+            <w:hideMark/>
+          </w:tcPr>
+          <w:p>
+            <w:pPr>
+              <w:spacing w:after="0" w:line="240" w:lineRule="auto"/>
+              <w:rPr>
+                <w:rFonts w:ascii="Aptos Narrow" w:hAnsi="Aptos Narrow"/>
+                <w:color w:val="000000"/>
+                <w:lang w:val="en-IN" w:eastAsia="en-IN"/>
+              </w:rPr>
+            </w:pPr>
+            <w:r>
+              <w:rPr>
+                <w:rFonts w:ascii="Aptos Narrow" w:hAnsi="Aptos Narrow"/>
+                <w:color w:val="000000"/>
+                <w:lang w:val="en-IN" w:eastAsia="en-IN"/>
+              </w:rPr>
+              <w:t>{{DESIGNATION}}</w:t>
             </w:r>
           </w:p>
         </w:tc>
@@ -2906,7 +2626,7 @@
                 <w:color w:val="000000"/>
                 <w:lang w:val="en-IN" w:eastAsia="en-IN"/>
               </w:rPr>
-              <w:t>Designation</w:t>
+              <w:t>Segment</w:t>
             </w:r>
           </w:p>
         </w:tc>
@@ -2921,7 +2641,7 @@
               <w:right w:val="single" w:sz="8" w:space="0" w:color="000000"/>
             </w:tcBorders>
             <w:noWrap/>
-            <w:vAlign w:val="bottom"/>
+            <w:vAlign w:val="center"/>
             <w:hideMark/>
           </w:tcPr>
           <w:p>
@@ -2939,7 +2659,7 @@
                 <w:color w:val="000000"/>
                 <w:lang w:val="en-IN" w:eastAsia="en-IN"/>
               </w:rPr>
-              <w:t>Driver cum Operator</w:t>
+              <w:t>{{SEGMENT}}</w:t>
             </w:r>
           </w:p>
         </w:tc>
@@ -2977,7 +2697,7 @@
                 <w:color w:val="000000"/>
                 <w:lang w:val="en-IN" w:eastAsia="en-IN"/>
               </w:rPr>
-              <w:t>Segment</w:t>
+              <w:t>DOB</w:t>
             </w:r>
           </w:p>
         </w:tc>
@@ -2992,7 +2712,7 @@
               <w:right w:val="single" w:sz="8" w:space="0" w:color="000000"/>
             </w:tcBorders>
             <w:noWrap/>
-            <w:vAlign w:val="center"/>
+            <w:vAlign w:val="bottom"/>
             <w:hideMark/>
           </w:tcPr>
           <w:p>
@@ -3010,7 +2730,7 @@
                 <w:color w:val="000000"/>
                 <w:lang w:val="en-IN" w:eastAsia="en-IN"/>
               </w:rPr>
-              <w:t>IFSPL, HO</w:t>
+              <w:t>{{DOB}}</w:t>
             </w:r>
           </w:p>
         </w:tc>
@@ -3048,77 +2768,6 @@
                 <w:color w:val="000000"/>
                 <w:lang w:val="en-IN" w:eastAsia="en-IN"/>
               </w:rPr>
-              <w:t>DOB</w:t>
-            </w:r>
-          </w:p>
-        </w:tc>
-        <w:tc>
-          <w:tcPr>
-            <w:tcW w:w="4198" w:type="dxa"/>
-            <w:gridSpan w:val="2"/>
-            <w:tcBorders>
-              <w:top w:val="single" w:sz="4" w:space="0" w:color="auto"/>
-              <w:left w:val="nil"/>
-              <w:bottom w:val="single" w:sz="4" w:space="0" w:color="auto"/>
-              <w:right w:val="single" w:sz="8" w:space="0" w:color="000000"/>
-            </w:tcBorders>
-            <w:noWrap/>
-            <w:vAlign w:val="bottom"/>
-            <w:hideMark/>
-          </w:tcPr>
-          <w:p>
-            <w:pPr>
-              <w:spacing w:after="0" w:line="240" w:lineRule="auto"/>
-              <w:rPr>
-                <w:rFonts w:ascii="Aptos Narrow" w:hAnsi="Aptos Narrow"/>
-                <w:color w:val="000000"/>
-                <w:lang w:val="en-IN" w:eastAsia="en-IN"/>
-              </w:rPr>
-            </w:pPr>
-            <w:r>
-              <w:rPr>
-                <w:rFonts w:ascii="Aptos Narrow" w:hAnsi="Aptos Narrow"/>
-                <w:color w:val="000000"/>
-                <w:lang w:val="en-IN" w:eastAsia="en-IN"/>
-              </w:rPr>
-              <w:t>06-Dec-05</w:t>
-            </w:r>
-          </w:p>
-        </w:tc>
-      </w:tr>
-      <w:tr>
-        <w:trPr>
-          <w:trHeight w:val="290"/>
-          <w:jc w:val="center"/>
-        </w:trPr>
-        <w:tc>
-          <w:tcPr>
-            <w:tcW w:w="5942" w:type="dxa"/>
-            <w:tcBorders>
-              <w:top w:val="nil"/>
-              <w:left w:val="single" w:sz="8" w:space="0" w:color="auto"/>
-              <w:bottom w:val="single" w:sz="4" w:space="0" w:color="auto"/>
-              <w:right w:val="single" w:sz="4" w:space="0" w:color="auto"/>
-            </w:tcBorders>
-            <w:noWrap/>
-            <w:vAlign w:val="bottom"/>
-            <w:hideMark/>
-          </w:tcPr>
-          <w:p>
-            <w:pPr>
-              <w:spacing w:after="0" w:line="240" w:lineRule="auto"/>
-              <w:rPr>
-                <w:rFonts w:ascii="Aptos Narrow" w:hAnsi="Aptos Narrow"/>
-                <w:color w:val="000000"/>
-                <w:lang w:val="en-IN" w:eastAsia="en-IN"/>
-              </w:rPr>
-            </w:pPr>
-            <w:r>
-              <w:rPr>
-                <w:rFonts w:ascii="Aptos Narrow" w:hAnsi="Aptos Narrow"/>
-                <w:color w:val="000000"/>
-                <w:lang w:val="en-IN" w:eastAsia="en-IN"/>
-              </w:rPr>
               <w:t>DOJ</w:t>
             </w:r>
           </w:p>
@@ -3152,7 +2801,7 @@
                 <w:color w:val="000000"/>
                 <w:lang w:val="en-IN" w:eastAsia="en-IN"/>
               </w:rPr>
-              <w:t>05-Oct-26</w:t>
+              <w:t>{{DOJ_SHORT}}</w:t>
             </w:r>
           </w:p>
         </w:tc>
@@ -3223,7 +2872,7 @@
                 <w:color w:val="000000"/>
                 <w:lang w:val="en-IN" w:eastAsia="en-IN"/>
               </w:rPr>
-              <w:t>05-Oct-26</w:t>
+              <w:t>{{DOJ_SHORT}}</w:t>
             </w:r>
           </w:p>
         </w:tc>
@@ -3268,7 +2917,17 @@
                 <w:color w:val="000000"/>
                 <w:lang w:val="en-IN" w:eastAsia="en-IN"/>
               </w:rPr>
-              <w:t xml:space="preserve"> COMPENSATION SCHEME-Year 2026-27</w:t>
+              <w:t xml:space="preserve"> </w:t>
+            </w:r>
+            <w:r>
+              <w:rPr>
+                <w:rFonts w:ascii="Aptos Narrow" w:hAnsi="Aptos Narrow"/>
+                <w:b/>
+                <w:bCs/>
+                <w:color w:val="000000"/>
+                <w:lang w:val="en-IN" w:eastAsia="en-IN"/>
+              </w:rPr>
+              <w:t>COMPENSATION SCHEME-Year {{SCHEME_YEAR}}</w:t>
             </w:r>
           </w:p>
         </w:tc>
@@ -3350,7 +3009,7 @@
                 <w:color w:val="000000"/>
                 <w:lang w:val="en-IN" w:eastAsia="en-IN"/>
               </w:rPr>
-              <w:t>w.e.f. 05.10.26</w:t>
+              <w:t>w.e.f. {{WEF_SHORT}}</w:t>
             </w:r>
           </w:p>
         </w:tc>
@@ -3459,7 +3118,7 @@
                 <w:color w:val="000000"/>
                 <w:lang w:val="en-IN" w:eastAsia="en-IN"/>
               </w:rPr>
-              <w:t>13585</w:t>
+              <w:t>{{BASIC_M}}</w:t>
             </w:r>
           </w:p>
         </w:tc>
@@ -3492,7 +3151,7 @@
                 <w:color w:val="000000"/>
                 <w:lang w:val="en-IN" w:eastAsia="en-IN"/>
               </w:rPr>
-              <w:t>163020</w:t>
+              <w:t>{{BASIC_PA}}</w:t>
             </w:r>
           </w:p>
         </w:tc>
@@ -3563,7 +3222,7 @@
                 <w:color w:val="000000"/>
                 <w:lang w:val="en-IN" w:eastAsia="en-IN"/>
               </w:rPr>
-              <w:t>5434</w:t>
+              <w:t>{{HRA_M}}</w:t>
             </w:r>
           </w:p>
         </w:tc>
@@ -3596,7 +3255,7 @@
                 <w:color w:val="000000"/>
                 <w:lang w:val="en-IN" w:eastAsia="en-IN"/>
               </w:rPr>
-              <w:t>65208</w:t>
+              <w:t>{{HRA_PA}}</w:t>
             </w:r>
           </w:p>
         </w:tc>
@@ -3667,8 +3326,19 @@
                 <w:color w:val="000000"/>
                 <w:lang w:val="en-IN" w:eastAsia="en-IN"/>
               </w:rPr>
-              <w:t>0</w:t>
+              <w:t>{{CONVEYANCE_M}}</w:t>
             </w:r>
+          </w:p>
+          <w:p>
+            <w:pPr>
+              <w:spacing w:after="0" w:line="240" w:lineRule="auto"/>
+              <w:jc w:val="right"/>
+              <w:rPr>
+                <w:rFonts w:ascii="Aptos Narrow" w:hAnsi="Aptos Narrow"/>
+                <w:color w:val="000000"/>
+                <w:lang w:val="en-IN" w:eastAsia="en-IN"/>
+              </w:rPr>
+            </w:pPr>
           </w:p>
         </w:tc>
         <w:tc>
@@ -3700,8 +3370,19 @@
                 <w:color w:val="000000"/>
                 <w:lang w:val="en-IN" w:eastAsia="en-IN"/>
               </w:rPr>
-              <w:t>0</w:t>
+              <w:t>{{CONVEYANCE_PA}}</w:t>
             </w:r>
+          </w:p>
+          <w:p>
+            <w:pPr>
+              <w:spacing w:after="0" w:line="240" w:lineRule="auto"/>
+              <w:jc w:val="right"/>
+              <w:rPr>
+                <w:rFonts w:ascii="Aptos Narrow" w:hAnsi="Aptos Narrow"/>
+                <w:color w:val="000000"/>
+                <w:lang w:val="en-IN" w:eastAsia="en-IN"/>
+              </w:rPr>
+            </w:pPr>
           </w:p>
         </w:tc>
       </w:tr>
@@ -3771,7 +3452,7 @@
                 <w:color w:val="000000"/>
                 <w:lang w:val="en-IN" w:eastAsia="en-IN"/>
               </w:rPr>
-              <w:t>1132</w:t>
+              <w:t>{{BONUS_M}}</w:t>
             </w:r>
           </w:p>
         </w:tc>
@@ -3804,7 +3485,7 @@
                 <w:color w:val="000000"/>
                 <w:lang w:val="en-IN" w:eastAsia="en-IN"/>
               </w:rPr>
-              <w:t>13580</w:t>
+              <w:t>{{BONUS_PA}}</w:t>
             </w:r>
           </w:p>
         </w:tc>
@@ -3875,7 +3556,7 @@
                 <w:color w:val="000000"/>
                 <w:lang w:val="en-IN" w:eastAsia="en-IN"/>
               </w:rPr>
-              <w:t>1781</w:t>
+              <w:t>{{MEDICAL_M}}</w:t>
             </w:r>
           </w:p>
         </w:tc>
@@ -3908,7 +3589,7 @@
                 <w:color w:val="000000"/>
                 <w:lang w:val="en-IN" w:eastAsia="en-IN"/>
               </w:rPr>
-              <w:t>21372</w:t>
+              <w:t>{{MEDICAL_PA}}</w:t>
             </w:r>
           </w:p>
         </w:tc>
@@ -3988,7 +3669,7 @@
                 <w:color w:val="000000"/>
                 <w:lang w:val="en-IN" w:eastAsia="en-IN"/>
               </w:rPr>
-              <w:t>21932</w:t>
+              <w:t>{{GROSS_M}}</w:t>
             </w:r>
           </w:p>
         </w:tc>
@@ -4025,7 +3706,7 @@
                 <w:color w:val="000000"/>
                 <w:lang w:val="en-IN" w:eastAsia="en-IN"/>
               </w:rPr>
-              <w:t>263184</w:t>
+              <w:t>{{GROSS_PA}}</w:t>
             </w:r>
           </w:p>
         </w:tc>
@@ -4096,7 +3777,7 @@
                 <w:color w:val="000000"/>
                 <w:lang w:val="en-IN" w:eastAsia="en-IN"/>
               </w:rPr>
-              <w:t>1630</w:t>
+              <w:t>{{EE_PF_M}}</w:t>
             </w:r>
           </w:p>
         </w:tc>
@@ -4129,7 +3810,7 @@
                 <w:color w:val="000000"/>
                 <w:lang w:val="en-IN" w:eastAsia="en-IN"/>
               </w:rPr>
-              <w:t>19562</w:t>
+              <w:t>{{EE_PF_PA}}</w:t>
             </w:r>
           </w:p>
         </w:tc>
@@ -4200,7 +3881,7 @@
                 <w:color w:val="000000"/>
                 <w:lang w:val="en-IN" w:eastAsia="en-IN"/>
               </w:rPr>
-              <w:t>200</w:t>
+              <w:t>{{PT_M}}</w:t>
             </w:r>
           </w:p>
         </w:tc>
@@ -4233,7 +3914,7 @@
                 <w:color w:val="000000"/>
                 <w:lang w:val="en-IN" w:eastAsia="en-IN"/>
               </w:rPr>
-              <w:t>2400</w:t>
+              <w:t>{{PT_PA}}</w:t>
             </w:r>
           </w:p>
         </w:tc>
@@ -4304,7 +3985,7 @@
                 <w:color w:val="000000"/>
                 <w:lang w:val="en-IN" w:eastAsia="en-IN"/>
               </w:rPr>
-              <w:t>102</w:t>
+              <w:t>{{EE_ESIC_M}}</w:t>
             </w:r>
           </w:p>
         </w:tc>
@@ -4337,7 +4018,7 @@
                 <w:color w:val="000000"/>
                 <w:lang w:val="en-IN" w:eastAsia="en-IN"/>
               </w:rPr>
-              <w:t>1222.65</w:t>
+              <w:t>{{EE_ESIC_PA}}</w:t>
             </w:r>
           </w:p>
         </w:tc>
@@ -4417,7 +4098,7 @@
                 <w:color w:val="000000"/>
                 <w:lang w:val="en-IN" w:eastAsia="en-IN"/>
               </w:rPr>
-              <w:t>20000</w:t>
+              <w:t>{{TAKE_HOME_M}}</w:t>
             </w:r>
           </w:p>
         </w:tc>
@@ -4454,7 +4135,7 @@
                 <w:color w:val="000000"/>
                 <w:lang w:val="en-IN" w:eastAsia="en-IN"/>
               </w:rPr>
-              <w:t>239999</w:t>
+              <w:t>{{TAKE_HOME_PA}}</w:t>
             </w:r>
           </w:p>
         </w:tc>
@@ -4602,7 +4283,7 @@
                 <w:color w:val="000000"/>
                 <w:lang w:val="en-IN" w:eastAsia="en-IN"/>
               </w:rPr>
-              <w:t>1766</w:t>
+              <w:t>{{ER_PF_M}}</w:t>
             </w:r>
           </w:p>
         </w:tc>
@@ -4635,7 +4316,7 @@
                 <w:color w:val="000000"/>
                 <w:lang w:val="en-IN" w:eastAsia="en-IN"/>
               </w:rPr>
-              <w:t>21193</w:t>
+              <w:t>{{ER_PF_PA}}</w:t>
             </w:r>
           </w:p>
         </w:tc>
@@ -4704,7 +4385,7 @@
                 <w:rFonts w:ascii="Aptos Narrow" w:hAnsi="Aptos Narrow"/>
                 <w:lang w:val="en-IN" w:eastAsia="en-IN"/>
               </w:rPr>
-              <w:t>509</w:t>
+              <w:t>{{ER_ESIC_M}}</w:t>
             </w:r>
           </w:p>
         </w:tc>
@@ -4737,7 +4418,7 @@
                 <w:color w:val="000000"/>
                 <w:lang w:val="en-IN" w:eastAsia="en-IN"/>
               </w:rPr>
-              <w:t>6113</w:t>
+              <w:t>{{ER_ESIC_PA}}</w:t>
             </w:r>
           </w:p>
         </w:tc>
@@ -4816,7 +4497,7 @@
                 <w:rFonts w:ascii="Aptos Narrow" w:hAnsi="Aptos Narrow"/>
                 <w:lang w:val="en-IN" w:eastAsia="en-IN"/>
               </w:rPr>
-              <w:t>653</w:t>
+              <w:t>{{GRATUITY_M}}</w:t>
             </w:r>
           </w:p>
         </w:tc>
@@ -4849,7 +4530,7 @@
                 <w:color w:val="000000"/>
                 <w:lang w:val="en-IN" w:eastAsia="en-IN"/>
               </w:rPr>
-              <w:t>7841</w:t>
+              <w:t>{{GRATUITY_PA}}</w:t>
             </w:r>
           </w:p>
         </w:tc>
@@ -4918,7 +4599,7 @@
                 <w:rFonts w:ascii="Aptos Narrow" w:hAnsi="Aptos Narrow"/>
                 <w:lang w:val="en-IN" w:eastAsia="en-IN"/>
               </w:rPr>
-              <w:t>1132</w:t>
+              <w:t>{{EX_GRATIA_M}}</w:t>
             </w:r>
           </w:p>
         </w:tc>
@@ -4951,7 +4632,7 @@
                 <w:color w:val="000000"/>
                 <w:lang w:val="en-IN" w:eastAsia="en-IN"/>
               </w:rPr>
-              <w:t>13585</w:t>
+              <w:t>{{EX_GRATIA_PA}}</w:t>
             </w:r>
           </w:p>
         </w:tc>
@@ -5031,7 +4712,7 @@
                 <w:color w:val="000000"/>
                 <w:lang w:val="en-IN" w:eastAsia="en-IN"/>
               </w:rPr>
-              <w:t>4061</w:t>
+              <w:t>{{TOTAL_B_M}}</w:t>
             </w:r>
           </w:p>
         </w:tc>
@@ -5064,7 +4745,7 @@
                 <w:color w:val="000000"/>
                 <w:lang w:val="en-IN" w:eastAsia="en-IN"/>
               </w:rPr>
-              <w:t>48732</w:t>
+              <w:t>{{TOTAL_B_PA}}</w:t>
             </w:r>
           </w:p>
         </w:tc>
@@ -5146,7 +4827,7 @@
                 <w:color w:val="000000"/>
                 <w:lang w:val="en-IN" w:eastAsia="en-IN"/>
               </w:rPr>
-              <w:t>25993</w:t>
+              <w:t>{{CTC_M}}</w:t>
             </w:r>
           </w:p>
         </w:tc>
@@ -5184,7 +4865,7 @@
                 <w:color w:val="000000"/>
                 <w:lang w:val="en-IN" w:eastAsia="en-IN"/>
               </w:rPr>
-              <w:t>311916</w:t>
+              <w:t>{{CTC_PA}}</w:t>
             </w:r>
           </w:p>
         </w:tc>
@@ -5293,21 +4974,9 @@
           <w:color w:val="000000"/>
           <w:lang w:eastAsia="en-IN"/>
         </w:rPr>
+        <w:lastRenderedPageBreak/>
         <w:t>The salary structure mentioned in the above remuneration package (CTC) may undergo a change in light of any new law or any change in existing law, keeping your CTC intact.</w:t>
       </w:r>
-    </w:p>
-    <w:p>
-      <w:pPr>
-        <w:pStyle w:val="NoSpacing"/>
-        <w:jc w:val="center"/>
-        <w:rPr>
-          <w:rFonts w:ascii="Cambria" w:hAnsi="Cambria" w:cs="Arial"/>
-          <w:b/>
-          <w:bCs/>
-          <w:sz w:val="32"/>
-          <w:szCs w:val="32"/>
-        </w:rPr>
-      </w:pPr>
     </w:p>
     <w:p>
       <w:pPr>
@@ -5320,14 +4989,10 @@
       </w:pPr>
     </w:p>
     <w:sectPr>
-      <w:headerReference w:type="even" r:id="rId9"/>
-      <w:headerReference w:type="default" r:id="rId10"/>
-      <w:footerReference w:type="even" r:id="rId11"/>
-      <w:footerReference w:type="default" r:id="rId12"/>
-      <w:headerReference w:type="first" r:id="rId13"/>
-      <w:footerReference w:type="first" r:id="rId14"/>
+      <w:headerReference w:type="default" r:id="rId8"/>
+      <w:footerReference w:type="default" r:id="rId9"/>
       <w:pgSz w:w="12240" w:h="15840"/>
-      <w:pgMar w:top="426" w:right="758" w:bottom="284" w:left="993" w:header="510" w:footer="0" w:gutter="0"/>
+      <w:pgMar w:top="426" w:right="758" w:bottom="284" w:left="993" w:header="288" w:footer="0" w:gutter="0"/>
       <w:cols w:space="720"/>
       <w:docGrid w:linePitch="360"/>
     </w:sectPr>
@@ -5364,16 +5029,6 @@
 <w:ftr xmlns:wpc="http://schemas.microsoft.com/office/word/2010/wordprocessingCanvas" xmlns:cx="http://schemas.microsoft.com/office/drawing/2014/chartex" xmlns:cx1="http://schemas.microsoft.com/office/drawing/2015/9/8/chartex" xmlns:cx2="http://schemas.microsoft.com/office/drawing/2015/10/21/chartex" xmlns:cx3="http://schemas.microsoft.com/office/drawing/2016/5/9/chartex" xmlns:cx4="http://schemas.microsoft.com/office/drawing/2016/5/10/chartex" xmlns:cx5="http://schemas.microsoft.com/office/drawing/2016/5/11/chartex" xmlns:cx6="http://schemas.microsoft.com/office/drawing/2016/5/12/chartex" xmlns:cx7="http://schemas.microsoft.com/office/drawing/2016/5/13/chartex" xmlns:cx8="http://schemas.microsoft.com/office/drawing/2016/5/14/chartex" xmlns:mc="http://schemas.openxmlformats.org/markup-compatibility/2006" xmlns:aink="http://schemas.microsoft.com/office/drawing/2016/ink" xmlns:am3d="http://schemas.microsoft.com/office/drawing/2017/model3d" xmlns:o="urn:schemas-microsoft-com:office:office" xmlns:oel="http://schemas.microsoft.com/office/2019/extlst" xmlns:r="http://schemas.openxmlformats.org/officeDocument/2006/relationships" xmlns:m="http://schemas.openxmlformats.org/officeDocument/2006/math" xmlns:v="urn:schemas-microsoft-com:vml" xmlns:wp14="http://schemas.microsoft.com/office/word/2010/wordprocessingDrawing" xmlns:wp="http://schemas.openxmlformats.org/drawingml/2006/wordprocessingDrawing" xmlns:w10="urn:schemas-microsoft-com:office:word" xmlns:w="http://schemas.openxmlformats.org/wordprocessingml/2006/main" xmlns:w14="http://schemas.microsoft.com/office/word/2010/wordml" xmlns:w15="http://schemas.microsoft.com/office/word/2012/wordml" xmlns:w16cex="http://schemas.microsoft.com/office/word/2018/wordml/cex" xmlns:w16cid="http://schemas.microsoft.com/office/word/2016/wordml/cid" xmlns:w16="http://schemas.microsoft.com/office/word/2018/wordml" xmlns:w16du="http://schemas.microsoft.com/office/word/2023/wordml/word16du" xmlns:w16sdtdh="http://schemas.microsoft.com/office/word/2020/wordml/sdtdatahash" xmlns:w16sdtfl="http://schemas.microsoft.com/office/word/2024/wordml/sdtformatlock" xmlns:w16se="http://schemas.microsoft.com/office/word/2015/wordml/symex" xmlns:wpg="http://schemas.microsoft.com/office/word/2010/wordprocessingGroup" xmlns:wpi="http://schemas.microsoft.com/office/word/2010/wordprocessingInk" xmlns:wne="http://schemas.microsoft.com/office/word/2006/wordml" xmlns:wps="http://schemas.microsoft.com/office/word/2010/wordprocessingShape" mc:Ignorable="w14 w15 w16se w16cid w16 w16cex w16sdtdh w16sdtfl w16du wp14">
   <w:p>
     <w:pPr>
-      <w:pStyle w:val="Footer"/>
-    </w:pPr>
-  </w:p>
-</w:ftr>
-</file>
-
-<file path=word/footer2.xml><?xml version="1.0" encoding="utf-8"?>
-<w:ftr xmlns:wpc="http://schemas.microsoft.com/office/word/2010/wordprocessingCanvas" xmlns:cx="http://schemas.microsoft.com/office/drawing/2014/chartex" xmlns:cx1="http://schemas.microsoft.com/office/drawing/2015/9/8/chartex" xmlns:cx2="http://schemas.microsoft.com/office/drawing/2015/10/21/chartex" xmlns:cx3="http://schemas.microsoft.com/office/drawing/2016/5/9/chartex" xmlns:cx4="http://schemas.microsoft.com/office/drawing/2016/5/10/chartex" xmlns:cx5="http://schemas.microsoft.com/office/drawing/2016/5/11/chartex" xmlns:cx6="http://schemas.microsoft.com/office/drawing/2016/5/12/chartex" xmlns:cx7="http://schemas.microsoft.com/office/drawing/2016/5/13/chartex" xmlns:cx8="http://schemas.microsoft.com/office/drawing/2016/5/14/chartex" xmlns:mc="http://schemas.openxmlformats.org/markup-compatibility/2006" xmlns:aink="http://schemas.microsoft.com/office/drawing/2016/ink" xmlns:am3d="http://schemas.microsoft.com/office/drawing/2017/model3d" xmlns:o="urn:schemas-microsoft-com:office:office" xmlns:oel="http://schemas.microsoft.com/office/2019/extlst" xmlns:r="http://schemas.openxmlformats.org/officeDocument/2006/relationships" xmlns:m="http://schemas.openxmlformats.org/officeDocument/2006/math" xmlns:v="urn:schemas-microsoft-com:vml" xmlns:wp14="http://schemas.microsoft.com/office/word/2010/wordprocessingDrawing" xmlns:wp="http://schemas.openxmlformats.org/drawingml/2006/wordprocessingDrawing" xmlns:w10="urn:schemas-microsoft-com:office:word" xmlns:w="http://schemas.openxmlformats.org/wordprocessingml/2006/main" xmlns:w14="http://schemas.microsoft.com/office/word/2010/wordml" xmlns:w15="http://schemas.microsoft.com/office/word/2012/wordml" xmlns:w16cex="http://schemas.microsoft.com/office/word/2018/wordml/cex" xmlns:w16cid="http://schemas.microsoft.com/office/word/2016/wordml/cid" xmlns:w16="http://schemas.microsoft.com/office/word/2018/wordml" xmlns:w16du="http://schemas.microsoft.com/office/word/2023/wordml/word16du" xmlns:w16sdtdh="http://schemas.microsoft.com/office/word/2020/wordml/sdtdatahash" xmlns:w16sdtfl="http://schemas.microsoft.com/office/word/2024/wordml/sdtformatlock" xmlns:w16se="http://schemas.microsoft.com/office/word/2015/wordml/symex" xmlns:wpg="http://schemas.microsoft.com/office/word/2010/wordprocessingGroup" xmlns:wpi="http://schemas.microsoft.com/office/word/2010/wordprocessingInk" xmlns:wne="http://schemas.microsoft.com/office/word/2006/wordml" xmlns:wps="http://schemas.microsoft.com/office/word/2010/wordprocessingShape" mc:Ignorable="w14 w15 w16se w16cid w16 w16cex w16sdtdh w16sdtfl w16du wp14">
-  <w:p>
-    <w:pPr>
       <w:rPr>
         <w:color w:val="1F497D"/>
       </w:rPr>
@@ -5384,7 +5039,7 @@
         <w:color w:val="1F497D"/>
         <w:lang w:val="en-IN" w:eastAsia="en-IN"/>
       </w:rPr>
-      <w:pict w14:anchorId="55304D26">
+      <w:pict w14:anchorId="7C947C92">
         <v:rect id="_x0000_s1032" style="position:absolute;margin-left:-49.2pt;margin-top:38.9pt;width:611.55pt;height:10.4pt;z-index:251658240" fillcolor="#c00000" strokecolor="#c00000"/>
       </w:pict>
     </w:r>
@@ -5394,7 +5049,7 @@
         <w:color w:val="1F497D"/>
         <w:lang w:val="en-IN" w:eastAsia="en-IN"/>
       </w:rPr>
-      <w:pict w14:anchorId="390C9F18">
+      <w:pict w14:anchorId="677BDB68">
         <v:shapetype id="_x0000_t32" coordsize="21600,21600" o:spt="32" o:oned="t" path="m,l21600,21600e" filled="f">
           <v:path arrowok="t" fillok="f" o:connecttype="none"/>
           <o:lock v:ext="edit" shapetype="t"/>
@@ -5403,7 +5058,7 @@
       </w:pict>
     </w:r>
     <w:r>
-      <w:pict w14:anchorId="344031F6">
+      <w:pict w14:anchorId="159D140D">
         <v:shapetype id="_x0000_t75" coordsize="21600,21600" o:spt="75" o:preferrelative="t" path="m@4@5l@4@11@9@11@9@5xe" filled="f" stroked="f">
           <v:stroke joinstyle="miter"/>
           <v:formulas>
@@ -5423,21 +5078,11 @@
           <v:path o:extrusionok="f" gradientshapeok="t" o:connecttype="rect"/>
           <o:lock v:ext="edit" aspectratio="t"/>
         </v:shapetype>
-        <v:shape id="_x0000_i1027" type="#_x0000_t75" style="width:525pt;height:38.25pt">
+        <v:shape id="_x0000_i1026" type="#_x0000_t75" style="width:525pt;height:37.5pt">
           <v:imagedata r:id="rId1" o:title="11111"/>
         </v:shape>
       </w:pict>
     </w:r>
-  </w:p>
-</w:ftr>
-</file>
-
-<file path=word/footer3.xml><?xml version="1.0" encoding="utf-8"?>
-<w:ftr xmlns:wpc="http://schemas.microsoft.com/office/word/2010/wordprocessingCanvas" xmlns:cx="http://schemas.microsoft.com/office/drawing/2014/chartex" xmlns:cx1="http://schemas.microsoft.com/office/drawing/2015/9/8/chartex" xmlns:cx2="http://schemas.microsoft.com/office/drawing/2015/10/21/chartex" xmlns:cx3="http://schemas.microsoft.com/office/drawing/2016/5/9/chartex" xmlns:cx4="http://schemas.microsoft.com/office/drawing/2016/5/10/chartex" xmlns:cx5="http://schemas.microsoft.com/office/drawing/2016/5/11/chartex" xmlns:cx6="http://schemas.microsoft.com/office/drawing/2016/5/12/chartex" xmlns:cx7="http://schemas.microsoft.com/office/drawing/2016/5/13/chartex" xmlns:cx8="http://schemas.microsoft.com/office/drawing/2016/5/14/chartex" xmlns:mc="http://schemas.openxmlformats.org/markup-compatibility/2006" xmlns:aink="http://schemas.microsoft.com/office/drawing/2016/ink" xmlns:am3d="http://schemas.microsoft.com/office/drawing/2017/model3d" xmlns:o="urn:schemas-microsoft-com:office:office" xmlns:oel="http://schemas.microsoft.com/office/2019/extlst" xmlns:r="http://schemas.openxmlformats.org/officeDocument/2006/relationships" xmlns:m="http://schemas.openxmlformats.org/officeDocument/2006/math" xmlns:v="urn:schemas-microsoft-com:vml" xmlns:wp14="http://schemas.microsoft.com/office/word/2010/wordprocessingDrawing" xmlns:wp="http://schemas.openxmlformats.org/drawingml/2006/wordprocessingDrawing" xmlns:w10="urn:schemas-microsoft-com:office:word" xmlns:w="http://schemas.openxmlformats.org/wordprocessingml/2006/main" xmlns:w14="http://schemas.microsoft.com/office/word/2010/wordml" xmlns:w15="http://schemas.microsoft.com/office/word/2012/wordml" xmlns:w16cex="http://schemas.microsoft.com/office/word/2018/wordml/cex" xmlns:w16cid="http://schemas.microsoft.com/office/word/2016/wordml/cid" xmlns:w16="http://schemas.microsoft.com/office/word/2018/wordml" xmlns:w16du="http://schemas.microsoft.com/office/word/2023/wordml/word16du" xmlns:w16sdtdh="http://schemas.microsoft.com/office/word/2020/wordml/sdtdatahash" xmlns:w16sdtfl="http://schemas.microsoft.com/office/word/2024/wordml/sdtformatlock" xmlns:w16se="http://schemas.microsoft.com/office/word/2015/wordml/symex" xmlns:wpg="http://schemas.microsoft.com/office/word/2010/wordprocessingGroup" xmlns:wpi="http://schemas.microsoft.com/office/word/2010/wordprocessingInk" xmlns:wne="http://schemas.microsoft.com/office/word/2006/wordml" xmlns:wps="http://schemas.microsoft.com/office/word/2010/wordprocessingShape" mc:Ignorable="w14 w15 w16se w16cid w16 w16cex w16sdtdh w16sdtfl w16du wp14">
-  <w:p>
-    <w:pPr>
-      <w:pStyle w:val="Footer"/>
-    </w:pPr>
   </w:p>
 </w:ftr>
 </file>
@@ -5472,27 +5117,40 @@
   <w:p>
     <w:pPr>
       <w:pStyle w:val="Header"/>
+      <w:jc w:val="right"/>
     </w:pPr>
-  </w:p>
-</w:hdr>
-</file>
-
-<file path=word/header2.xml><?xml version="1.0" encoding="utf-8"?>
-<w:hdr xmlns:wpc="http://schemas.microsoft.com/office/word/2010/wordprocessingCanvas" xmlns:cx="http://schemas.microsoft.com/office/drawing/2014/chartex" xmlns:cx1="http://schemas.microsoft.com/office/drawing/2015/9/8/chartex" xmlns:cx2="http://schemas.microsoft.com/office/drawing/2015/10/21/chartex" xmlns:cx3="http://schemas.microsoft.com/office/drawing/2016/5/9/chartex" xmlns:cx4="http://schemas.microsoft.com/office/drawing/2016/5/10/chartex" xmlns:cx5="http://schemas.microsoft.com/office/drawing/2016/5/11/chartex" xmlns:cx6="http://schemas.microsoft.com/office/drawing/2016/5/12/chartex" xmlns:cx7="http://schemas.microsoft.com/office/drawing/2016/5/13/chartex" xmlns:cx8="http://schemas.microsoft.com/office/drawing/2016/5/14/chartex" xmlns:mc="http://schemas.openxmlformats.org/markup-compatibility/2006" xmlns:aink="http://schemas.microsoft.com/office/drawing/2016/ink" xmlns:am3d="http://schemas.microsoft.com/office/drawing/2017/model3d" xmlns:o="urn:schemas-microsoft-com:office:office" xmlns:oel="http://schemas.microsoft.com/office/2019/extlst" xmlns:r="http://schemas.openxmlformats.org/officeDocument/2006/relationships" xmlns:m="http://schemas.openxmlformats.org/officeDocument/2006/math" xmlns:v="urn:schemas-microsoft-com:vml" xmlns:wp14="http://schemas.microsoft.com/office/word/2010/wordprocessingDrawing" xmlns:wp="http://schemas.openxmlformats.org/drawingml/2006/wordprocessingDrawing" xmlns:w10="urn:schemas-microsoft-com:office:word" xmlns:w="http://schemas.openxmlformats.org/wordprocessingml/2006/main" xmlns:w14="http://schemas.microsoft.com/office/word/2010/wordml" xmlns:w15="http://schemas.microsoft.com/office/word/2012/wordml" xmlns:w16cex="http://schemas.microsoft.com/office/word/2018/wordml/cex" xmlns:w16cid="http://schemas.microsoft.com/office/word/2016/wordml/cid" xmlns:w16="http://schemas.microsoft.com/office/word/2018/wordml" xmlns:w16du="http://schemas.microsoft.com/office/word/2023/wordml/word16du" xmlns:w16sdtdh="http://schemas.microsoft.com/office/word/2020/wordml/sdtdatahash" xmlns:w16sdtfl="http://schemas.microsoft.com/office/word/2024/wordml/sdtformatlock" xmlns:w16se="http://schemas.microsoft.com/office/word/2015/wordml/symex" xmlns:wpg="http://schemas.microsoft.com/office/word/2010/wordprocessingGroup" xmlns:wpi="http://schemas.microsoft.com/office/word/2010/wordprocessingInk" xmlns:wne="http://schemas.microsoft.com/office/word/2006/wordml" xmlns:wps="http://schemas.microsoft.com/office/word/2010/wordprocessingShape" mc:Ignorable="w14 w15 w16se w16cid w16 w16cex w16sdtdh w16sdtfl w16du wp14">
-  <w:p>
-    <w:pPr>
-      <w:pStyle w:val="Header"/>
-    </w:pPr>
-  </w:p>
-</w:hdr>
-</file>
-
-<file path=word/header3.xml><?xml version="1.0" encoding="utf-8"?>
-<w:hdr xmlns:wpc="http://schemas.microsoft.com/office/word/2010/wordprocessingCanvas" xmlns:cx="http://schemas.microsoft.com/office/drawing/2014/chartex" xmlns:cx1="http://schemas.microsoft.com/office/drawing/2015/9/8/chartex" xmlns:cx2="http://schemas.microsoft.com/office/drawing/2015/10/21/chartex" xmlns:cx3="http://schemas.microsoft.com/office/drawing/2016/5/9/chartex" xmlns:cx4="http://schemas.microsoft.com/office/drawing/2016/5/10/chartex" xmlns:cx5="http://schemas.microsoft.com/office/drawing/2016/5/11/chartex" xmlns:cx6="http://schemas.microsoft.com/office/drawing/2016/5/12/chartex" xmlns:cx7="http://schemas.microsoft.com/office/drawing/2016/5/13/chartex" xmlns:cx8="http://schemas.microsoft.com/office/drawing/2016/5/14/chartex" xmlns:mc="http://schemas.openxmlformats.org/markup-compatibility/2006" xmlns:aink="http://schemas.microsoft.com/office/drawing/2016/ink" xmlns:am3d="http://schemas.microsoft.com/office/drawing/2017/model3d" xmlns:o="urn:schemas-microsoft-com:office:office" xmlns:oel="http://schemas.microsoft.com/office/2019/extlst" xmlns:r="http://schemas.openxmlformats.org/officeDocument/2006/relationships" xmlns:m="http://schemas.openxmlformats.org/officeDocument/2006/math" xmlns:v="urn:schemas-microsoft-com:vml" xmlns:wp14="http://schemas.microsoft.com/office/word/2010/wordprocessingDrawing" xmlns:wp="http://schemas.openxmlformats.org/drawingml/2006/wordprocessingDrawing" xmlns:w10="urn:schemas-microsoft-com:office:word" xmlns:w="http://schemas.openxmlformats.org/wordprocessingml/2006/main" xmlns:w14="http://schemas.microsoft.com/office/word/2010/wordml" xmlns:w15="http://schemas.microsoft.com/office/word/2012/wordml" xmlns:w16cex="http://schemas.microsoft.com/office/word/2018/wordml/cex" xmlns:w16cid="http://schemas.microsoft.com/office/word/2016/wordml/cid" xmlns:w16="http://schemas.microsoft.com/office/word/2018/wordml" xmlns:w16du="http://schemas.microsoft.com/office/word/2023/wordml/word16du" xmlns:w16sdtdh="http://schemas.microsoft.com/office/word/2020/wordml/sdtdatahash" xmlns:w16sdtfl="http://schemas.microsoft.com/office/word/2024/wordml/sdtformatlock" xmlns:w16se="http://schemas.microsoft.com/office/word/2015/wordml/symex" xmlns:wpg="http://schemas.microsoft.com/office/word/2010/wordprocessingGroup" xmlns:wpi="http://schemas.microsoft.com/office/word/2010/wordprocessingInk" xmlns:wne="http://schemas.microsoft.com/office/word/2006/wordml" xmlns:wps="http://schemas.microsoft.com/office/word/2010/wordprocessingShape" mc:Ignorable="w14 w15 w16se w16cid w16 w16cex w16sdtdh w16sdtfl w16du wp14">
-  <w:p>
-    <w:pPr>
-      <w:pStyle w:val="Header"/>
-    </w:pPr>
+    <w:r>
+      <w:rPr>
+        <w:rFonts w:ascii="Times New Roman" w:hAnsi="Times New Roman"/>
+        <w:color w:val="000000"/>
+        <w:sz w:val="24"/>
+        <w:szCs w:val="24"/>
+      </w:rPr>
+      <w:pict w14:anchorId="3164A180">
+        <v:shapetype id="_x0000_t75" coordsize="21600,21600" o:spt="75" o:preferrelative="t" path="m@4@5l@4@11@9@11@9@5xe" filled="f" stroked="f">
+          <v:stroke joinstyle="miter"/>
+          <v:formulas>
+            <v:f eqn="if lineDrawn pixelLineWidth 0"/>
+            <v:f eqn="sum @0 1 0"/>
+            <v:f eqn="sum 0 0 @1"/>
+            <v:f eqn="prod @2 1 2"/>
+            <v:f eqn="prod @3 21600 pixelWidth"/>
+            <v:f eqn="prod @3 21600 pixelHeight"/>
+            <v:f eqn="sum @0 0 1"/>
+            <v:f eqn="prod @6 1 2"/>
+            <v:f eqn="prod @7 21600 pixelWidth"/>
+            <v:f eqn="sum @8 21600 0"/>
+            <v:f eqn="prod @7 21600 pixelHeight"/>
+            <v:f eqn="sum @10 21600 0"/>
+          </v:formulas>
+          <v:path o:extrusionok="f" gradientshapeok="t" o:connecttype="rect"/>
+          <o:lock v:ext="edit" aspectratio="t"/>
+        </v:shapetype>
+        <v:shape id="_x0000_i1025" type="#_x0000_t75" style="width:152.25pt;height:98.25pt">
+          <v:imagedata r:id="rId1" o:title="121212"/>
+        </v:shape>
+      </w:pict>
+    </w:r>
   </w:p>
 </w:hdr>
 </file>
@@ -7415,61 +7073,61 @@
       </w:rPr>
     </w:lvl>
   </w:abstractNum>
-  <w:num w:numId="1" w16cid:durableId="89550362">
+  <w:num w:numId="1" w16cid:durableId="1681734486">
     <w:abstractNumId w:val="2"/>
   </w:num>
-  <w:num w:numId="2" w16cid:durableId="926689277">
+  <w:num w:numId="2" w16cid:durableId="445467675">
     <w:abstractNumId w:val="15"/>
   </w:num>
-  <w:num w:numId="3" w16cid:durableId="1551990156">
+  <w:num w:numId="3" w16cid:durableId="1532842445">
     <w:abstractNumId w:val="10"/>
   </w:num>
-  <w:num w:numId="4" w16cid:durableId="1075709057">
+  <w:num w:numId="4" w16cid:durableId="2000376218">
     <w:abstractNumId w:val="6"/>
   </w:num>
-  <w:num w:numId="5" w16cid:durableId="2019504319">
+  <w:num w:numId="5" w16cid:durableId="903102134">
     <w:abstractNumId w:val="14"/>
   </w:num>
-  <w:num w:numId="6" w16cid:durableId="1527718584">
+  <w:num w:numId="6" w16cid:durableId="402023736">
     <w:abstractNumId w:val="12"/>
   </w:num>
-  <w:num w:numId="7" w16cid:durableId="663241148">
+  <w:num w:numId="7" w16cid:durableId="1554779201">
     <w:abstractNumId w:val="4"/>
   </w:num>
-  <w:num w:numId="8" w16cid:durableId="2066101029">
+  <w:num w:numId="8" w16cid:durableId="969898176">
     <w:abstractNumId w:val="13"/>
   </w:num>
-  <w:num w:numId="9" w16cid:durableId="1561595357">
+  <w:num w:numId="9" w16cid:durableId="606275670">
     <w:abstractNumId w:val="0"/>
   </w:num>
-  <w:num w:numId="10" w16cid:durableId="1997830921">
+  <w:num w:numId="10" w16cid:durableId="1861357217">
     <w:abstractNumId w:val="7"/>
   </w:num>
-  <w:num w:numId="11" w16cid:durableId="1755738052">
+  <w:num w:numId="11" w16cid:durableId="2052538097">
     <w:abstractNumId w:val="1"/>
   </w:num>
-  <w:num w:numId="12" w16cid:durableId="210577548">
+  <w:num w:numId="12" w16cid:durableId="1751391074">
     <w:abstractNumId w:val="3"/>
   </w:num>
-  <w:num w:numId="13" w16cid:durableId="1131249264">
+  <w:num w:numId="13" w16cid:durableId="890724652">
     <w:abstractNumId w:val="18"/>
   </w:num>
-  <w:num w:numId="14" w16cid:durableId="1545677400">
+  <w:num w:numId="14" w16cid:durableId="779452372">
     <w:abstractNumId w:val="9"/>
   </w:num>
-  <w:num w:numId="15" w16cid:durableId="495150732">
+  <w:num w:numId="15" w16cid:durableId="1007488614">
     <w:abstractNumId w:val="8"/>
   </w:num>
-  <w:num w:numId="16" w16cid:durableId="1313603990">
+  <w:num w:numId="16" w16cid:durableId="14238808">
     <w:abstractNumId w:val="16"/>
   </w:num>
-  <w:num w:numId="17" w16cid:durableId="219174537">
+  <w:num w:numId="17" w16cid:durableId="485170728">
     <w:abstractNumId w:val="11"/>
   </w:num>
-  <w:num w:numId="18" w16cid:durableId="1572539782">
+  <w:num w:numId="18" w16cid:durableId="692338482">
     <w:abstractNumId w:val="5"/>
   </w:num>
-  <w:num w:numId="19" w16cid:durableId="314646331">
+  <w:num w:numId="19" w16cid:durableId="333579104">
     <w:abstractNumId w:val="17"/>
   </w:num>
 </w:numbering>

</xml_diff>

<commit_message>
changes in offer letter format and apppointment letter format fixed
</commit_message>
<xml_diff>
--- a/public/templates/admin-recruitment/appointment-letter.docx
+++ b/public/templates/admin-recruitment/appointment-letter.docx
@@ -26,7 +26,7 @@
         <w:rPr>
           <w:noProof/>
         </w:rPr>
-        <w:pict w14:anchorId="71200F56">
+        <w:pict w14:anchorId="4DCCAD74">
           <v:shapetype id="_x0000_t75" coordsize="21600,21600" o:spt="75" o:preferrelative="t" path="m@4@5l@4@11@9@11@9@5xe" filled="f" stroked="f">
             <v:stroke joinstyle="miter"/>
             <v:formulas>
@@ -2132,7 +2132,6 @@
         <w:pStyle w:val="NoSpacing"/>
         <w:keepNext/>
         <w:keepLines/>
-        <w:pageBreakBefore/>
         <w:jc w:val="center"/>
         <w:rPr>
           <w:rFonts w:ascii="Cambria" w:hAnsi="Cambria" w:cs="Arial"/>
@@ -5039,7 +5038,7 @@
         <w:color w:val="1F497D"/>
         <w:lang w:val="en-IN" w:eastAsia="en-IN"/>
       </w:rPr>
-      <w:pict w14:anchorId="7C947C92">
+      <w:pict w14:anchorId="3D19590A">
         <v:rect id="_x0000_s1032" style="position:absolute;margin-left:-49.2pt;margin-top:38.9pt;width:611.55pt;height:10.4pt;z-index:251658240" fillcolor="#c00000" strokecolor="#c00000"/>
       </w:pict>
     </w:r>
@@ -5049,7 +5048,7 @@
         <w:color w:val="1F497D"/>
         <w:lang w:val="en-IN" w:eastAsia="en-IN"/>
       </w:rPr>
-      <w:pict w14:anchorId="677BDB68">
+      <w:pict w14:anchorId="1079B4C5">
         <v:shapetype id="_x0000_t32" coordsize="21600,21600" o:spt="32" o:oned="t" path="m,l21600,21600e" filled="f">
           <v:path arrowok="t" fillok="f" o:connecttype="none"/>
           <o:lock v:ext="edit" shapetype="t"/>
@@ -5058,7 +5057,7 @@
       </w:pict>
     </w:r>
     <w:r>
-      <w:pict w14:anchorId="159D140D">
+      <w:pict w14:anchorId="28189EC4">
         <v:shapetype id="_x0000_t75" coordsize="21600,21600" o:spt="75" o:preferrelative="t" path="m@4@5l@4@11@9@11@9@5xe" filled="f" stroked="f">
           <v:stroke joinstyle="miter"/>
           <v:formulas>
@@ -5078,7 +5077,7 @@
           <v:path o:extrusionok="f" gradientshapeok="t" o:connecttype="rect"/>
           <o:lock v:ext="edit" aspectratio="t"/>
         </v:shapetype>
-        <v:shape id="_x0000_i1026" type="#_x0000_t75" style="width:525pt;height:37.5pt">
+        <v:shape id="_x0000_i1026" type="#_x0000_t75" style="width:525pt;height:38.25pt">
           <v:imagedata r:id="rId1" o:title="11111"/>
         </v:shape>
       </w:pict>
@@ -5126,7 +5125,7 @@
         <w:sz w:val="24"/>
         <w:szCs w:val="24"/>
       </w:rPr>
-      <w:pict w14:anchorId="3164A180">
+      <w:pict w14:anchorId="373666FA">
         <v:shapetype id="_x0000_t75" coordsize="21600,21600" o:spt="75" o:preferrelative="t" path="m@4@5l@4@11@9@11@9@5xe" filled="f" stroked="f">
           <v:stroke joinstyle="miter"/>
           <v:formulas>
@@ -7073,61 +7072,61 @@
       </w:rPr>
     </w:lvl>
   </w:abstractNum>
-  <w:num w:numId="1" w16cid:durableId="1681734486">
+  <w:num w:numId="1" w16cid:durableId="1614633309">
     <w:abstractNumId w:val="2"/>
   </w:num>
-  <w:num w:numId="2" w16cid:durableId="445467675">
+  <w:num w:numId="2" w16cid:durableId="26301052">
     <w:abstractNumId w:val="15"/>
   </w:num>
-  <w:num w:numId="3" w16cid:durableId="1532842445">
+  <w:num w:numId="3" w16cid:durableId="521631246">
     <w:abstractNumId w:val="10"/>
   </w:num>
-  <w:num w:numId="4" w16cid:durableId="2000376218">
+  <w:num w:numId="4" w16cid:durableId="1133213281">
     <w:abstractNumId w:val="6"/>
   </w:num>
-  <w:num w:numId="5" w16cid:durableId="903102134">
+  <w:num w:numId="5" w16cid:durableId="1130829323">
     <w:abstractNumId w:val="14"/>
   </w:num>
-  <w:num w:numId="6" w16cid:durableId="402023736">
+  <w:num w:numId="6" w16cid:durableId="1544978071">
     <w:abstractNumId w:val="12"/>
   </w:num>
-  <w:num w:numId="7" w16cid:durableId="1554779201">
+  <w:num w:numId="7" w16cid:durableId="823160394">
     <w:abstractNumId w:val="4"/>
   </w:num>
-  <w:num w:numId="8" w16cid:durableId="969898176">
+  <w:num w:numId="8" w16cid:durableId="1515224638">
     <w:abstractNumId w:val="13"/>
   </w:num>
-  <w:num w:numId="9" w16cid:durableId="606275670">
+  <w:num w:numId="9" w16cid:durableId="1523547054">
     <w:abstractNumId w:val="0"/>
   </w:num>
-  <w:num w:numId="10" w16cid:durableId="1861357217">
+  <w:num w:numId="10" w16cid:durableId="472018405">
     <w:abstractNumId w:val="7"/>
   </w:num>
-  <w:num w:numId="11" w16cid:durableId="2052538097">
+  <w:num w:numId="11" w16cid:durableId="854851688">
     <w:abstractNumId w:val="1"/>
   </w:num>
-  <w:num w:numId="12" w16cid:durableId="1751391074">
+  <w:num w:numId="12" w16cid:durableId="1282226002">
     <w:abstractNumId w:val="3"/>
   </w:num>
-  <w:num w:numId="13" w16cid:durableId="890724652">
+  <w:num w:numId="13" w16cid:durableId="353074921">
     <w:abstractNumId w:val="18"/>
   </w:num>
-  <w:num w:numId="14" w16cid:durableId="779452372">
+  <w:num w:numId="14" w16cid:durableId="1999068991">
     <w:abstractNumId w:val="9"/>
   </w:num>
-  <w:num w:numId="15" w16cid:durableId="1007488614">
+  <w:num w:numId="15" w16cid:durableId="1109544376">
     <w:abstractNumId w:val="8"/>
   </w:num>
-  <w:num w:numId="16" w16cid:durableId="14238808">
+  <w:num w:numId="16" w16cid:durableId="1466117738">
     <w:abstractNumId w:val="16"/>
   </w:num>
-  <w:num w:numId="17" w16cid:durableId="485170728">
+  <w:num w:numId="17" w16cid:durableId="1707564093">
     <w:abstractNumId w:val="11"/>
   </w:num>
-  <w:num w:numId="18" w16cid:durableId="692338482">
+  <w:num w:numId="18" w16cid:durableId="1324965280">
     <w:abstractNumId w:val="5"/>
   </w:num>
-  <w:num w:numId="19" w16cid:durableId="333579104">
+  <w:num w:numId="19" w16cid:durableId="147289653">
     <w:abstractNumId w:val="17"/>
   </w:num>
 </w:numbering>

</xml_diff>

<commit_message>
changes in appointment letter  and fixed mail bug
</commit_message>
<xml_diff>
--- a/public/templates/admin-recruitment/appointment-letter.docx
+++ b/public/templates/admin-recruitment/appointment-letter.docx
@@ -26,7 +26,7 @@
         <w:rPr>
           <w:noProof/>
         </w:rPr>
-        <w:pict w14:anchorId="4DCCAD74">
+        <w:pict w14:anchorId="084FFFD8">
           <v:shapetype id="_x0000_t75" coordsize="21600,21600" o:spt="75" o:preferrelative="t" path="m@4@5l@4@11@9@11@9@5xe" filled="f" stroked="f">
             <v:stroke joinstyle="miter"/>
             <v:formulas>
@@ -1464,60 +1464,218 @@
           <w:b/>
         </w:rPr>
       </w:pPr>
-    </w:p>
-    <w:p>
-      <w:pPr>
+      <w:r>
+        <w:rPr>
+          <w:rFonts w:ascii="Cambria" w:hAnsi="Cambria" w:cs="Arial"/>
+          <w:b/>
+        </w:rPr>
+        <w:tab/>
+      </w:r>
+      <w:r>
+        <w:rPr>
+          <w:rFonts w:ascii="Cambria" w:hAnsi="Cambria" w:cs="Arial"/>
+          <w:b/>
+        </w:rPr>
+        <w:tab/>
+      </w:r>
+      <w:r>
+        <w:rPr>
+          <w:rFonts w:ascii="Cambria" w:hAnsi="Cambria" w:cs="Arial"/>
+          <w:b/>
+        </w:rPr>
+        <w:tab/>
+      </w:r>
+      <w:r>
+        <w:rPr>
+          <w:rFonts w:ascii="Cambria" w:hAnsi="Cambria" w:cs="Arial"/>
+          <w:b/>
+        </w:rPr>
+        <w:tab/>
+      </w:r>
+      <w:r>
+        <w:rPr>
+          <w:rFonts w:ascii="Cambria" w:hAnsi="Cambria" w:cs="Arial"/>
+          <w:b/>
+        </w:rPr>
+        <w:tab/>
+      </w:r>
+      <w:r>
+        <w:rPr>
+          <w:rFonts w:ascii="Cambria" w:hAnsi="Cambria" w:cs="Arial"/>
+          <w:b/>
+        </w:rPr>
+        <w:tab/>
+      </w:r>
+      <w:r>
+        <w:rPr>
+          <w:rFonts w:ascii="Cambria" w:hAnsi="Cambria" w:cs="Arial"/>
+          <w:b/>
+        </w:rPr>
+        <w:tab/>
+      </w:r>
+      <w:r>
+        <w:rPr>
+          <w:rFonts w:ascii="Cambria" w:hAnsi="Cambria" w:cs="Arial"/>
+          <w:b/>
+        </w:rPr>
+        <w:tab/>
+      </w:r>
+      <w:r>
+        <w:rPr>
+          <w:rFonts w:ascii="Cambria" w:hAnsi="Cambria" w:cs="Arial"/>
+          <w:b/>
+        </w:rPr>
+        <w:tab/>
+      </w:r>
+      <w:r>
+        <w:rPr>
+          <w:rFonts w:ascii="Cambria" w:hAnsi="Cambria" w:cs="Arial"/>
+          <w:b/>
+        </w:rPr>
+        <w:tab/>
+      </w:r>
+    </w:p>
+    <w:p>
+      <w:pPr>
+        <w:pStyle w:val="NoSpacing"/>
+        <w:jc w:val="both"/>
+        <w:rPr>
+          <w:rFonts w:ascii="Cambria" w:hAnsi="Cambria" w:cs="Arial"/>
+          <w:b/>
+          <w:bCs/>
+        </w:rPr>
+      </w:pPr>
+      <w:r>
+        <w:rPr>
+          <w:rFonts w:ascii="Cambria" w:hAnsi="Cambria" w:cs="Arial"/>
+          <w:b/>
+        </w:rPr>
+        <w:tab/>
+      </w:r>
+      <w:r>
+        <w:rPr>
+          <w:rFonts w:ascii="Cambria" w:hAnsi="Cambria" w:cs="Arial"/>
+          <w:b/>
+        </w:rPr>
+        <w:tab/>
+      </w:r>
+      <w:r>
+        <w:rPr>
+          <w:rFonts w:ascii="Cambria" w:hAnsi="Cambria" w:cs="Arial"/>
+          <w:b/>
+          <w:bCs/>
+        </w:rPr>
+        <w:tab/>
+      </w:r>
+      <w:r>
+        <w:rPr>
+          <w:rFonts w:ascii="Cambria" w:hAnsi="Cambria" w:cs="Arial"/>
+          <w:b/>
+          <w:bCs/>
+        </w:rPr>
+        <w:tab/>
+      </w:r>
+      <w:r>
+        <w:rPr>
+          <w:rFonts w:ascii="Cambria" w:hAnsi="Cambria" w:cs="Arial"/>
+          <w:b/>
+          <w:bCs/>
+        </w:rPr>
+        <w:tab/>
+      </w:r>
+      <w:r>
+        <w:rPr>
+          <w:rFonts w:ascii="Cambria" w:hAnsi="Cambria" w:cs="Arial"/>
+          <w:b/>
+          <w:bCs/>
+        </w:rPr>
+        <w:tab/>
+      </w:r>
+      <w:r>
+        <w:rPr>
+          <w:rFonts w:ascii="Cambria" w:hAnsi="Cambria" w:cs="Arial"/>
+          <w:b/>
+          <w:bCs/>
+        </w:rPr>
+        <w:tab/>
+      </w:r>
+      <w:r>
+        <w:rPr>
+          <w:rFonts w:ascii="Cambria" w:hAnsi="Cambria" w:cs="Arial"/>
+          <w:b/>
+          <w:bCs/>
+        </w:rPr>
+        <w:tab/>
+      </w:r>
+      <w:r>
+        <w:rPr>
+          <w:rFonts w:ascii="Cambria" w:hAnsi="Cambria" w:cs="Arial"/>
+          <w:b/>
+          <w:bCs/>
+        </w:rPr>
+        <w:tab/>
+      </w:r>
+      <w:r>
+        <w:rPr>
+          <w:rFonts w:ascii="Cambria" w:hAnsi="Cambria" w:cs="Arial"/>
+          <w:b/>
+          <w:bCs/>
+        </w:rPr>
+        <w:tab/>
+      </w:r>
+      <w:r>
+        <w:rPr>
+          <w:rFonts w:ascii="Cambria" w:hAnsi="Cambria" w:cs="Arial"/>
+          <w:b/>
+          <w:bCs/>
+        </w:rPr>
+        <w:tab/>
+      </w:r>
+      <w:r>
+        <w:rPr>
+          <w:rFonts w:ascii="Cambria" w:hAnsi="Cambria" w:cs="Arial"/>
+          <w:b/>
+          <w:bCs/>
+        </w:rPr>
+        <w:t>{{CANDIDATE_NAME}}</w:t>
+      </w:r>
+    </w:p>
+    <w:p>
+      <w:pPr>
+        <w:pStyle w:val="NoSpacing"/>
+        <w:rPr>
+          <w:rFonts w:ascii="Cambria" w:hAnsi="Cambria" w:cs="Arial"/>
+          <w:b/>
+        </w:rPr>
+      </w:pPr>
+    </w:p>
+    <w:p>
+      <w:pPr>
+        <w:pStyle w:val="NoSpacing"/>
+        <w:jc w:val="center"/>
+        <w:rPr>
+          <w:rFonts w:ascii="Cambria" w:hAnsi="Cambria" w:cs="Arial"/>
+          <w:b/>
+        </w:rPr>
+      </w:pPr>
+    </w:p>
+    <w:p>
+      <w:pPr>
+        <w:pStyle w:val="NoSpacing"/>
+        <w:keepNext/>
         <w:pageBreakBefore/>
-        <w:pStyle w:val="NoSpacing"/>
         <w:jc w:val="center"/>
         <w:rPr>
           <w:rFonts w:ascii="Cambria" w:hAnsi="Cambria" w:cs="Arial"/>
           <w:b/>
-          <w:bCs/>
-        </w:rPr>
-      </w:pPr>
-      <w:r>
-        <w:rPr>
-          <w:rFonts w:ascii="Cambria" w:hAnsi="Cambria" w:cs="Arial"/>
-          <w:b/>
-          <w:bCs/>
-        </w:rPr>
-        <w:t>{{CANDIDATE_NAME}}</w:t>
-      </w:r>
-    </w:p>
-    <w:p>
-      <w:pPr>
-        <w:pStyle w:val="NoSpacing"/>
-        <w:rPr>
-          <w:rFonts w:ascii="Cambria" w:hAnsi="Cambria" w:cs="Arial"/>
-          <w:b/>
-        </w:rPr>
-      </w:pPr>
-    </w:p>
-    <w:p>
-      <w:pPr>
-        <w:pStyle w:val="NoSpacing"/>
-        <w:jc w:val="center"/>
-        <w:rPr>
-          <w:rFonts w:ascii="Cambria" w:hAnsi="Cambria" w:cs="Arial"/>
-          <w:b/>
-        </w:rPr>
-      </w:pPr>
-    </w:p>
-    <w:p>
-      <w:pPr>
-        <w:pStyle w:val="NoSpacing"/>
-        <w:jc w:val="center"/>
-        <w:rPr>
-          <w:rFonts w:ascii="Cambria" w:hAnsi="Cambria" w:cs="Arial"/>
-          <w:b/>
-        </w:rPr>
-      </w:pPr>
-      <w:r>
-        <w:rPr>
-          <w:rFonts w:ascii="Cambria" w:hAnsi="Cambria" w:cs="Arial"/>
-          <w:b/>
-        </w:rPr>
+        </w:rPr>
+      </w:pPr>
+      <w:r>
+        <w:rPr>
+          <w:rFonts w:ascii="Cambria" w:hAnsi="Cambria" w:cs="Arial"/>
+          <w:b/>
+        </w:rPr>
+        <w:lastRenderedPageBreak/>
         <w:t>Annexure - I</w:t>
       </w:r>
     </w:p>
@@ -2046,16 +2204,7 @@
           <w:sz w:val="19"/>
           <w:szCs w:val="19"/>
         </w:rPr>
-        <w:t xml:space="preserve">We value competence, performance, discipline and integrity above everything else and that constitutes the foundation of your employment.   You must deliver the highest quality of services in your field/department with mutual respect and based on strict </w:t>
-      </w:r>
-      <w:r>
-        <w:rPr>
-          <w:rFonts w:ascii="Cambria" w:hAnsi="Cambria" w:cs="Arial"/>
-          <w:sz w:val="19"/>
-          <w:szCs w:val="19"/>
-        </w:rPr>
-        <w:lastRenderedPageBreak/>
-        <w:t>merit.  We work in an atmosphere of trust and transparency and go beyond our area of responsibility.  During your employment with us, you will be required to devote the whole of your working time, attention and abilities to the services of the Company</w:t>
+        <w:t>We value competence, performance, discipline and integrity above everything else and that constitutes the foundation of your employment.   You must deliver the highest quality of services in your field/department with mutual respect and based on strict merit.  We work in an atmosphere of trust and transparency and go beyond our area of responsibility.  During your employment with us, you will be required to devote the whole of your working time, attention and abilities to the services of the Company</w:t>
       </w:r>
     </w:p>
     <w:p>
@@ -4882,7 +5031,6 @@
           <w:color w:val="000000"/>
           <w:lang w:eastAsia="en-IN"/>
         </w:rPr>
-        <w:lastRenderedPageBreak/>
         <w:t>The salary structure mentioned in the above remuneration package (CTC) may undergo a change in light of any new law or any change in existing law, keeping your CTC intact.</w:t>
       </w:r>
     </w:p>
@@ -4947,7 +5095,7 @@
         <w:color w:val="1F497D"/>
         <w:lang w:val="en-IN" w:eastAsia="en-IN"/>
       </w:rPr>
-      <w:pict w14:anchorId="3D19590A">
+      <w:pict w14:anchorId="4E244BFC">
         <v:rect id="_x0000_s1032" style="position:absolute;margin-left:-49.2pt;margin-top:38.9pt;width:611.55pt;height:10.4pt;z-index:251658240" fillcolor="#c00000" strokecolor="#c00000"/>
       </w:pict>
     </w:r>
@@ -4957,7 +5105,7 @@
         <w:color w:val="1F497D"/>
         <w:lang w:val="en-IN" w:eastAsia="en-IN"/>
       </w:rPr>
-      <w:pict w14:anchorId="1079B4C5">
+      <w:pict w14:anchorId="6183D963">
         <v:shapetype id="_x0000_t32" coordsize="21600,21600" o:spt="32" o:oned="t" path="m,l21600,21600e" filled="f">
           <v:path arrowok="t" fillok="f" o:connecttype="none"/>
           <o:lock v:ext="edit" shapetype="t"/>
@@ -4966,7 +5114,7 @@
       </w:pict>
     </w:r>
     <w:r>
-      <w:pict w14:anchorId="28189EC4">
+      <w:pict w14:anchorId="1A3798D0">
         <v:shapetype id="_x0000_t75" coordsize="21600,21600" o:spt="75" o:preferrelative="t" path="m@4@5l@4@11@9@11@9@5xe" filled="f" stroked="f">
           <v:stroke joinstyle="miter"/>
           <v:formulas>
@@ -5034,7 +5182,7 @@
         <w:sz w:val="24"/>
         <w:szCs w:val="24"/>
       </w:rPr>
-      <w:pict w14:anchorId="373666FA">
+      <w:pict w14:anchorId="6ECD1ED2">
         <v:shapetype id="_x0000_t75" coordsize="21600,21600" o:spt="75" o:preferrelative="t" path="m@4@5l@4@11@9@11@9@5xe" filled="f" stroked="f">
           <v:stroke joinstyle="miter"/>
           <v:formulas>
@@ -6981,61 +7129,61 @@
       </w:rPr>
     </w:lvl>
   </w:abstractNum>
-  <w:num w:numId="1" w16cid:durableId="1614633309">
+  <w:num w:numId="1" w16cid:durableId="1066494273">
     <w:abstractNumId w:val="2"/>
   </w:num>
-  <w:num w:numId="2" w16cid:durableId="26301052">
+  <w:num w:numId="2" w16cid:durableId="889802862">
     <w:abstractNumId w:val="15"/>
   </w:num>
-  <w:num w:numId="3" w16cid:durableId="521631246">
+  <w:num w:numId="3" w16cid:durableId="1400640430">
     <w:abstractNumId w:val="10"/>
   </w:num>
-  <w:num w:numId="4" w16cid:durableId="1133213281">
+  <w:num w:numId="4" w16cid:durableId="955522411">
     <w:abstractNumId w:val="6"/>
   </w:num>
-  <w:num w:numId="5" w16cid:durableId="1130829323">
+  <w:num w:numId="5" w16cid:durableId="937829425">
     <w:abstractNumId w:val="14"/>
   </w:num>
-  <w:num w:numId="6" w16cid:durableId="1544978071">
+  <w:num w:numId="6" w16cid:durableId="468786689">
     <w:abstractNumId w:val="12"/>
   </w:num>
-  <w:num w:numId="7" w16cid:durableId="823160394">
+  <w:num w:numId="7" w16cid:durableId="1115713803">
     <w:abstractNumId w:val="4"/>
   </w:num>
-  <w:num w:numId="8" w16cid:durableId="1515224638">
+  <w:num w:numId="8" w16cid:durableId="1962296454">
     <w:abstractNumId w:val="13"/>
   </w:num>
-  <w:num w:numId="9" w16cid:durableId="1523547054">
+  <w:num w:numId="9" w16cid:durableId="2119370203">
     <w:abstractNumId w:val="0"/>
   </w:num>
-  <w:num w:numId="10" w16cid:durableId="472018405">
+  <w:num w:numId="10" w16cid:durableId="1624266021">
     <w:abstractNumId w:val="7"/>
   </w:num>
-  <w:num w:numId="11" w16cid:durableId="854851688">
+  <w:num w:numId="11" w16cid:durableId="672415171">
     <w:abstractNumId w:val="1"/>
   </w:num>
-  <w:num w:numId="12" w16cid:durableId="1282226002">
+  <w:num w:numId="12" w16cid:durableId="510992869">
     <w:abstractNumId w:val="3"/>
   </w:num>
-  <w:num w:numId="13" w16cid:durableId="353074921">
+  <w:num w:numId="13" w16cid:durableId="2113159169">
     <w:abstractNumId w:val="18"/>
   </w:num>
-  <w:num w:numId="14" w16cid:durableId="1999068991">
+  <w:num w:numId="14" w16cid:durableId="465853218">
     <w:abstractNumId w:val="9"/>
   </w:num>
-  <w:num w:numId="15" w16cid:durableId="1109544376">
+  <w:num w:numId="15" w16cid:durableId="1914581601">
     <w:abstractNumId w:val="8"/>
   </w:num>
-  <w:num w:numId="16" w16cid:durableId="1466117738">
+  <w:num w:numId="16" w16cid:durableId="2112122566">
     <w:abstractNumId w:val="16"/>
   </w:num>
-  <w:num w:numId="17" w16cid:durableId="1707564093">
+  <w:num w:numId="17" w16cid:durableId="1833373657">
     <w:abstractNumId w:val="11"/>
   </w:num>
-  <w:num w:numId="18" w16cid:durableId="1324965280">
+  <w:num w:numId="18" w16cid:durableId="887839815">
     <w:abstractNumId w:val="5"/>
   </w:num>
-  <w:num w:numId="19" w16cid:durableId="147289653">
+  <w:num w:numId="19" w16cid:durableId="1563370239">
     <w:abstractNumId w:val="17"/>
   </w:num>
 </w:numbering>
@@ -7537,9 +7685,6 @@
     </w:rPr>
   </w:style>
   <w:style w:type="paragraph" w:styleId="NoSpacing">
-    <w:pPr>
-      <w:spacing w:before="0" w:after="0" w:line="240" w:lineRule="auto"/>
-    </w:pPr>
     <w:name w:val="No Spacing"/>
     <w:uiPriority w:val="1"/>
     <w:qFormat/>

</xml_diff>